<commit_message>
work on collaborator adding
</commit_message>
<xml_diff>
--- a/CAHIER DE CHARGE DE DOCSIRA.docx
+++ b/CAHIER DE CHARGE DE DOCSIRA.docx
@@ -917,10 +917,7 @@
         <w:t>Comment se fait l’ajout des collaborateurs ?</w:t>
       </w:r>
     </w:p>
-    <w:p>
-      <w:bookmarkStart w:id="1" w:name="_GoBack"/>
-      <w:bookmarkEnd w:id="1"/>
-    </w:p>
+    <w:p/>
     <w:tbl>
       <w:tblPr>
         <w:tblStyle w:val="TableauListe2-Accentuation3"/>
@@ -1198,6 +1195,48 @@
       </w:tr>
     </w:tbl>
     <w:p/>
+    <w:p>
+      <w:r>
+        <w:t>Notes de développement :</w:t>
+      </w:r>
+    </w:p>
+    <w:p>
+      <w:pPr>
+        <w:pStyle w:val="Paragraphedeliste"/>
+        <w:numPr>
+          <w:ilvl w:val="0"/>
+          <w:numId w:val="5"/>
+        </w:numPr>
+      </w:pPr>
+      <w:r>
+        <w:t xml:space="preserve">Maintenant il y a trois états quand on essaie de </w:t>
+      </w:r>
+      <w:proofErr w:type="spellStart"/>
+      <w:r>
+        <w:t>fetch</w:t>
+      </w:r>
+      <w:proofErr w:type="spellEnd"/>
+      <w:r>
+        <w:t xml:space="preserve"> des données, </w:t>
+      </w:r>
+      <w:r>
+        <w:rPr>
+          <w:b/>
+        </w:rPr>
+        <w:t>le statut vide, le statut en cours de chargement, et le</w:t>
+      </w:r>
+      <w:r>
+        <w:rPr>
+          <w:b/>
+        </w:rPr>
+        <w:t xml:space="preserve"> statut de manque de connexion.</w:t>
+      </w:r>
+      <w:bookmarkStart w:id="1" w:name="_GoBack"/>
+      <w:bookmarkEnd w:id="1"/>
+      <w:r>
+        <w:t xml:space="preserve"> </w:t>
+      </w:r>
+    </w:p>
     <w:p>
       <w:pPr>
         <w:pStyle w:val="Titre3"/>
@@ -1393,6 +1432,119 @@
     </w:lvl>
   </w:abstractNum>
   <w:abstractNum w:abstractNumId="1" w15:restartNumberingAfterBreak="0">
+    <w:nsid w:val="203B3A87"/>
+    <w:multiLevelType w:val="hybridMultilevel"/>
+    <w:tmpl w:val="04B2A3C2"/>
+    <w:lvl w:ilvl="0" w:tplc="5C3CF308">
+      <w:start w:val="1"/>
+      <w:numFmt w:val="bullet"/>
+      <w:lvlText w:val=""/>
+      <w:lvlJc w:val="left"/>
+      <w:pPr>
+        <w:ind w:left="720" w:hanging="360"/>
+      </w:pPr>
+      <w:rPr>
+        <w:rFonts w:ascii="Symbol" w:hAnsi="Symbol" w:hint="default"/>
+      </w:rPr>
+    </w:lvl>
+    <w:lvl w:ilvl="1" w:tplc="040C0003" w:tentative="1">
+      <w:start w:val="1"/>
+      <w:numFmt w:val="bullet"/>
+      <w:lvlText w:val="o"/>
+      <w:lvlJc w:val="left"/>
+      <w:pPr>
+        <w:ind w:left="1440" w:hanging="360"/>
+      </w:pPr>
+      <w:rPr>
+        <w:rFonts w:ascii="Courier New" w:hAnsi="Courier New" w:cs="Courier New" w:hint="default"/>
+      </w:rPr>
+    </w:lvl>
+    <w:lvl w:ilvl="2" w:tplc="040C0005" w:tentative="1">
+      <w:start w:val="1"/>
+      <w:numFmt w:val="bullet"/>
+      <w:lvlText w:val=""/>
+      <w:lvlJc w:val="left"/>
+      <w:pPr>
+        <w:ind w:left="2160" w:hanging="360"/>
+      </w:pPr>
+      <w:rPr>
+        <w:rFonts w:ascii="Wingdings" w:hAnsi="Wingdings" w:hint="default"/>
+      </w:rPr>
+    </w:lvl>
+    <w:lvl w:ilvl="3" w:tplc="040C0001" w:tentative="1">
+      <w:start w:val="1"/>
+      <w:numFmt w:val="bullet"/>
+      <w:lvlText w:val=""/>
+      <w:lvlJc w:val="left"/>
+      <w:pPr>
+        <w:ind w:left="2880" w:hanging="360"/>
+      </w:pPr>
+      <w:rPr>
+        <w:rFonts w:ascii="Symbol" w:hAnsi="Symbol" w:hint="default"/>
+      </w:rPr>
+    </w:lvl>
+    <w:lvl w:ilvl="4" w:tplc="040C0003" w:tentative="1">
+      <w:start w:val="1"/>
+      <w:numFmt w:val="bullet"/>
+      <w:lvlText w:val="o"/>
+      <w:lvlJc w:val="left"/>
+      <w:pPr>
+        <w:ind w:left="3600" w:hanging="360"/>
+      </w:pPr>
+      <w:rPr>
+        <w:rFonts w:ascii="Courier New" w:hAnsi="Courier New" w:cs="Courier New" w:hint="default"/>
+      </w:rPr>
+    </w:lvl>
+    <w:lvl w:ilvl="5" w:tplc="040C0005" w:tentative="1">
+      <w:start w:val="1"/>
+      <w:numFmt w:val="bullet"/>
+      <w:lvlText w:val=""/>
+      <w:lvlJc w:val="left"/>
+      <w:pPr>
+        <w:ind w:left="4320" w:hanging="360"/>
+      </w:pPr>
+      <w:rPr>
+        <w:rFonts w:ascii="Wingdings" w:hAnsi="Wingdings" w:hint="default"/>
+      </w:rPr>
+    </w:lvl>
+    <w:lvl w:ilvl="6" w:tplc="040C0001" w:tentative="1">
+      <w:start w:val="1"/>
+      <w:numFmt w:val="bullet"/>
+      <w:lvlText w:val=""/>
+      <w:lvlJc w:val="left"/>
+      <w:pPr>
+        <w:ind w:left="5040" w:hanging="360"/>
+      </w:pPr>
+      <w:rPr>
+        <w:rFonts w:ascii="Symbol" w:hAnsi="Symbol" w:hint="default"/>
+      </w:rPr>
+    </w:lvl>
+    <w:lvl w:ilvl="7" w:tplc="040C0003" w:tentative="1">
+      <w:start w:val="1"/>
+      <w:numFmt w:val="bullet"/>
+      <w:lvlText w:val="o"/>
+      <w:lvlJc w:val="left"/>
+      <w:pPr>
+        <w:ind w:left="5760" w:hanging="360"/>
+      </w:pPr>
+      <w:rPr>
+        <w:rFonts w:ascii="Courier New" w:hAnsi="Courier New" w:cs="Courier New" w:hint="default"/>
+      </w:rPr>
+    </w:lvl>
+    <w:lvl w:ilvl="8" w:tplc="040C0005" w:tentative="1">
+      <w:start w:val="1"/>
+      <w:numFmt w:val="bullet"/>
+      <w:lvlText w:val=""/>
+      <w:lvlJc w:val="left"/>
+      <w:pPr>
+        <w:ind w:left="6480" w:hanging="360"/>
+      </w:pPr>
+      <w:rPr>
+        <w:rFonts w:ascii="Wingdings" w:hAnsi="Wingdings" w:hint="default"/>
+      </w:rPr>
+    </w:lvl>
+  </w:abstractNum>
+  <w:abstractNum w:abstractNumId="2" w15:restartNumberingAfterBreak="0">
     <w:nsid w:val="3C3D21EC"/>
     <w:multiLevelType w:val="hybridMultilevel"/>
     <w:tmpl w:val="C25CD22C"/>
@@ -1478,7 +1630,7 @@
       </w:pPr>
     </w:lvl>
   </w:abstractNum>
-  <w:abstractNum w:abstractNumId="2" w15:restartNumberingAfterBreak="0">
+  <w:abstractNum w:abstractNumId="3" w15:restartNumberingAfterBreak="0">
     <w:nsid w:val="3DF801BE"/>
     <w:multiLevelType w:val="hybridMultilevel"/>
     <w:tmpl w:val="24902566"/>
@@ -1591,7 +1743,7 @@
       </w:rPr>
     </w:lvl>
   </w:abstractNum>
-  <w:abstractNum w:abstractNumId="3" w15:restartNumberingAfterBreak="0">
+  <w:abstractNum w:abstractNumId="4" w15:restartNumberingAfterBreak="0">
     <w:nsid w:val="53B51238"/>
     <w:multiLevelType w:val="hybridMultilevel"/>
     <w:tmpl w:val="C08EB444"/>
@@ -1681,13 +1833,16 @@
     <w:abstractNumId w:val="0"/>
   </w:num>
   <w:num w:numId="2">
-    <w:abstractNumId w:val="1"/>
+    <w:abstractNumId w:val="2"/>
   </w:num>
   <w:num w:numId="3">
+    <w:abstractNumId w:val="4"/>
+  </w:num>
+  <w:num w:numId="4">
     <w:abstractNumId w:val="3"/>
   </w:num>
-  <w:num w:numId="4">
-    <w:abstractNumId w:val="2"/>
+  <w:num w:numId="5">
+    <w:abstractNumId w:val="1"/>
   </w:num>
 </w:numbering>
 </file>
@@ -3713,7 +3868,7 @@
 </file>
 
 <file path=customXml/itemProps1.xml><?xml version="1.0" encoding="utf-8"?>
-<ds:datastoreItem xmlns:ds="http://schemas.openxmlformats.org/officeDocument/2006/customXml" ds:itemID="{45AFC4F0-3E4E-4FB7-B834-003C7D9B1117}">
+<ds:datastoreItem xmlns:ds="http://schemas.openxmlformats.org/officeDocument/2006/customXml" ds:itemID="{8FCA9DAD-CBAE-4BB5-AE8D-B00996EF2FE6}">
   <ds:schemaRefs>
     <ds:schemaRef ds:uri="http://schemas.openxmlformats.org/officeDocument/2006/bibliography"/>
   </ds:schemaRefs>

</xml_diff>

<commit_message>
work on code auth
</commit_message>
<xml_diff>
--- a/CAHIER DE CHARGE DE DOCSIRA.docx
+++ b/CAHIER DE CHARGE DE DOCSIRA.docx
@@ -917,6 +917,123 @@
         <w:t>Comment se fait l’ajout des collaborateurs ?</w:t>
       </w:r>
     </w:p>
+    <w:p>
+      <w:r>
+        <w:t>L’ajout des collaborateurs se fait par l’envoi des codes OTP via l’email du collaborateur. Ils recevront un code d’activation qu’ils vont vérifier et ensuite se connecter via le code.</w:t>
+      </w:r>
+      <w:bookmarkStart w:id="1" w:name="_GoBack"/>
+      <w:bookmarkEnd w:id="1"/>
+    </w:p>
+    <w:tbl>
+      <w:tblPr>
+        <w:tblStyle w:val="TableauListe2-Accentuation3"/>
+        <w:tblW w:w="9170" w:type="dxa"/>
+        <w:tblLook w:val="04A0" w:firstRow="1" w:lastRow="0" w:firstColumn="1" w:lastColumn="0" w:noHBand="0" w:noVBand="1"/>
+      </w:tblPr>
+      <w:tblGrid>
+        <w:gridCol w:w="6307"/>
+        <w:gridCol w:w="1578"/>
+        <w:gridCol w:w="1285"/>
+      </w:tblGrid>
+      <w:tr>
+        <w:trPr>
+          <w:cnfStyle w:val="100000000000" w:firstRow="1" w:lastRow="0" w:firstColumn="0" w:lastColumn="0" w:oddVBand="0" w:evenVBand="0" w:oddHBand="0" w:evenHBand="0" w:firstRowFirstColumn="0" w:firstRowLastColumn="0" w:lastRowFirstColumn="0" w:lastRowLastColumn="0"/>
+          <w:trHeight w:val="505"/>
+        </w:trPr>
+        <w:tc>
+          <w:tcPr>
+            <w:cnfStyle w:val="001000000000" w:firstRow="0" w:lastRow="0" w:firstColumn="1" w:lastColumn="0" w:oddVBand="0" w:evenVBand="0" w:oddHBand="0" w:evenHBand="0" w:firstRowFirstColumn="0" w:firstRowLastColumn="0" w:lastRowFirstColumn="0" w:lastRowLastColumn="0"/>
+            <w:tcW w:w="6307" w:type="dxa"/>
+          </w:tcPr>
+          <w:p>
+            <w:r>
+              <w:t>Fonctionnalité</w:t>
+            </w:r>
+          </w:p>
+        </w:tc>
+        <w:tc>
+          <w:tcPr>
+            <w:tcW w:w="1578" w:type="dxa"/>
+          </w:tcPr>
+          <w:p>
+            <w:pPr>
+              <w:cnfStyle w:val="100000000000" w:firstRow="1" w:lastRow="0" w:firstColumn="0" w:lastColumn="0" w:oddVBand="0" w:evenVBand="0" w:oddHBand="0" w:evenHBand="0" w:firstRowFirstColumn="0" w:firstRowLastColumn="0" w:lastRowFirstColumn="0" w:lastRowLastColumn="0"/>
+            </w:pPr>
+            <w:r>
+              <w:t>Statuts</w:t>
+            </w:r>
+          </w:p>
+        </w:tc>
+        <w:tc>
+          <w:tcPr>
+            <w:tcW w:w="1285" w:type="dxa"/>
+          </w:tcPr>
+          <w:p>
+            <w:pPr>
+              <w:cnfStyle w:val="100000000000" w:firstRow="1" w:lastRow="0" w:firstColumn="0" w:lastColumn="0" w:oddVBand="0" w:evenVBand="0" w:oddHBand="0" w:evenHBand="0" w:firstRowFirstColumn="0" w:firstRowLastColumn="0" w:lastRowFirstColumn="0" w:lastRowLastColumn="0"/>
+            </w:pPr>
+            <w:r>
+              <w:t>Notes</w:t>
+            </w:r>
+          </w:p>
+        </w:tc>
+      </w:tr>
+      <w:tr>
+        <w:trPr>
+          <w:cnfStyle w:val="000000100000" w:firstRow="0" w:lastRow="0" w:firstColumn="0" w:lastColumn="0" w:oddVBand="0" w:evenVBand="0" w:oddHBand="1" w:evenHBand="0" w:firstRowFirstColumn="0" w:firstRowLastColumn="0" w:lastRowFirstColumn="0" w:lastRowLastColumn="0"/>
+          <w:trHeight w:val="505"/>
+        </w:trPr>
+        <w:tc>
+          <w:tcPr>
+            <w:cnfStyle w:val="001000000000" w:firstRow="0" w:lastRow="0" w:firstColumn="1" w:lastColumn="0" w:oddVBand="0" w:evenVBand="0" w:oddHBand="0" w:evenHBand="0" w:firstRowFirstColumn="0" w:firstRowLastColumn="0" w:lastRowFirstColumn="0" w:lastRowLastColumn="0"/>
+            <w:tcW w:w="6307" w:type="dxa"/>
+          </w:tcPr>
+          <w:p>
+            <w:pPr>
+              <w:rPr>
+                <w:b w:val="0"/>
+              </w:rPr>
+            </w:pPr>
+            <w:r>
+              <w:rPr>
+                <w:b w:val="0"/>
+              </w:rPr>
+              <w:t xml:space="preserve">Ouverture de compte </w:t>
+            </w:r>
+            <w:r>
+              <w:rPr>
+                <w:b w:val="0"/>
+              </w:rPr>
+              <w:t>de collaborateur par l’administrateur</w:t>
+            </w:r>
+          </w:p>
+        </w:tc>
+        <w:tc>
+          <w:tcPr>
+            <w:tcW w:w="1578" w:type="dxa"/>
+          </w:tcPr>
+          <w:p>
+            <w:pPr>
+              <w:cnfStyle w:val="000000100000" w:firstRow="0" w:lastRow="0" w:firstColumn="0" w:lastColumn="0" w:oddVBand="0" w:evenVBand="0" w:oddHBand="1" w:evenHBand="0" w:firstRowFirstColumn="0" w:firstRowLastColumn="0" w:lastRowFirstColumn="0" w:lastRowLastColumn="0"/>
+            </w:pPr>
+            <w:r>
+              <w:t>En cours</w:t>
+            </w:r>
+          </w:p>
+        </w:tc>
+        <w:tc>
+          <w:tcPr>
+            <w:tcW w:w="1285" w:type="dxa"/>
+          </w:tcPr>
+          <w:p>
+            <w:pPr>
+              <w:cnfStyle w:val="000000100000" w:firstRow="0" w:lastRow="0" w:firstColumn="0" w:lastColumn="0" w:oddVBand="0" w:evenVBand="0" w:oddHBand="1" w:evenHBand="0" w:firstRowFirstColumn="0" w:firstRowLastColumn="0" w:lastRowFirstColumn="0" w:lastRowLastColumn="0"/>
+            </w:pPr>
+          </w:p>
+        </w:tc>
+      </w:tr>
+    </w:tbl>
+    <w:p/>
     <w:p/>
     <w:tbl>
       <w:tblPr>
@@ -1158,7 +1275,6 @@
               <w:rPr>
                 <w:b w:val="0"/>
               </w:rPr>
-              <w:lastRenderedPageBreak/>
               <w:t xml:space="preserve">Suppression du compte </w:t>
             </w:r>
             <w:r>
@@ -1231,8 +1347,6 @@
         </w:rPr>
         <w:t xml:space="preserve"> statut de manque de connexion.</w:t>
       </w:r>
-      <w:bookmarkStart w:id="1" w:name="_GoBack"/>
-      <w:bookmarkEnd w:id="1"/>
       <w:r>
         <w:t xml:space="preserve"> </w:t>
       </w:r>
@@ -2248,7 +2362,7 @@
   <w:style w:type="paragraph" w:default="1" w:styleId="Normal">
     <w:name w:val="Normal"/>
     <w:qFormat/>
-    <w:rsid w:val="002D5FB7"/>
+    <w:rsid w:val="006816E9"/>
     <w:pPr>
       <w:spacing w:line="360" w:lineRule="auto"/>
       <w:jc w:val="both"/>
@@ -3868,7 +3982,7 @@
 </file>
 
 <file path=customXml/itemProps1.xml><?xml version="1.0" encoding="utf-8"?>
-<ds:datastoreItem xmlns:ds="http://schemas.openxmlformats.org/officeDocument/2006/customXml" ds:itemID="{8FCA9DAD-CBAE-4BB5-AE8D-B00996EF2FE6}">
+<ds:datastoreItem xmlns:ds="http://schemas.openxmlformats.org/officeDocument/2006/customXml" ds:itemID="{37E78047-52A8-452F-9711-BA5201D57FF6}">
   <ds:schemaRefs>
     <ds:schemaRef ds:uri="http://schemas.openxmlformats.org/officeDocument/2006/bibliography"/>
   </ds:schemaRefs>

</xml_diff>

<commit_message>
work on charge book
</commit_message>
<xml_diff>
--- a/CAHIER DE CHARGE DE DOCSIRA.docx
+++ b/CAHIER DE CHARGE DE DOCSIRA.docx
@@ -696,7 +696,7 @@
               <w:cnfStyle w:val="000000100000" w:firstRow="0" w:lastRow="0" w:firstColumn="0" w:lastColumn="0" w:oddVBand="0" w:evenVBand="0" w:oddHBand="1" w:evenHBand="0" w:firstRowFirstColumn="0" w:firstRowLastColumn="0" w:lastRowFirstColumn="0" w:lastRowLastColumn="0"/>
             </w:pPr>
             <w:r>
-              <w:t>Terminé</w:t>
+              <w:t>En cours</w:t>
             </w:r>
           </w:p>
         </w:tc>
@@ -745,7 +745,7 @@
               <w:cnfStyle w:val="000000000000" w:firstRow="0" w:lastRow="0" w:firstColumn="0" w:lastColumn="0" w:oddVBand="0" w:evenVBand="0" w:oddHBand="0" w:evenHBand="0" w:firstRowFirstColumn="0" w:firstRowLastColumn="0" w:lastRowFirstColumn="0" w:lastRowLastColumn="0"/>
             </w:pPr>
             <w:r>
-              <w:t>Terminé</w:t>
+              <w:t>En cours</w:t>
             </w:r>
           </w:p>
         </w:tc>
@@ -919,10 +919,22 @@
     </w:p>
     <w:p>
       <w:r>
-        <w:t>L’ajout des collaborateurs se fait par l’envoi des codes OTP via l’email du collaborateur. Ils recevront un code d’activation qu’ils vont vérifier et ensuite se connecter via le code.</w:t>
-      </w:r>
-      <w:bookmarkStart w:id="1" w:name="_GoBack"/>
-      <w:bookmarkEnd w:id="1"/>
+        <w:t xml:space="preserve">L’ajout des collaborateurs se fait par l’envoi </w:t>
+      </w:r>
+      <w:r>
+        <w:t>des identifiants du collaborateur</w:t>
+      </w:r>
+      <w:r>
+        <w:t xml:space="preserve"> via l’email du collaborateur. </w:t>
+      </w:r>
+      <w:r>
+        <w:t>Une fois les coordonnées reçues, ils pourront se connecter et avoir accès à l’application ou au logiciel.</w:t>
+      </w:r>
+    </w:p>
+    <w:p>
+      <w:r>
+        <w:t>Dans les paramètres du compte collaborateur, il y a la section du compte administrateur qui n’est pas modifiable. Le collaborateur doit pouvoir changer son mot de passe et certaines de ces informations.</w:t>
+      </w:r>
     </w:p>
     <w:tbl>
       <w:tblPr>
@@ -947,6 +959,7 @@
           </w:tcPr>
           <w:p>
             <w:r>
+              <w:lastRenderedPageBreak/>
               <w:t>Fonctionnalité</w:t>
             </w:r>
           </w:p>
@@ -1017,7 +1030,7 @@
               <w:cnfStyle w:val="000000100000" w:firstRow="0" w:lastRow="0" w:firstColumn="0" w:lastColumn="0" w:oddVBand="0" w:evenVBand="0" w:oddHBand="1" w:evenHBand="0" w:firstRowFirstColumn="0" w:firstRowLastColumn="0" w:lastRowFirstColumn="0" w:lastRowLastColumn="0"/>
             </w:pPr>
             <w:r>
-              <w:t>En cours</w:t>
+              <w:t>Terminé</w:t>
             </w:r>
           </w:p>
         </w:tc>
@@ -1109,19 +1122,13 @@
               <w:rPr>
                 <w:b w:val="0"/>
               </w:rPr>
-              <w:t xml:space="preserve">Ouverture de compte </w:t>
+              <w:t xml:space="preserve">Lecture des informations du compte </w:t>
             </w:r>
             <w:r>
               <w:rPr>
                 <w:b w:val="0"/>
               </w:rPr>
-              <w:t>de collaborateur</w:t>
-            </w:r>
-            <w:r>
-              <w:rPr>
-                <w:b w:val="0"/>
-              </w:rPr>
-              <w:t xml:space="preserve"> par l’administrateur</w:t>
+              <w:t>de collaborateurs</w:t>
             </w:r>
           </w:p>
         </w:tc>
@@ -1168,7 +1175,110 @@
               <w:rPr>
                 <w:b w:val="0"/>
               </w:rPr>
-              <w:t xml:space="preserve">Lecture des informations du compte </w:t>
+              <w:t>Voir tous mes collaborateurs</w:t>
+            </w:r>
+          </w:p>
+        </w:tc>
+        <w:tc>
+          <w:tcPr>
+            <w:tcW w:w="1578" w:type="dxa"/>
+          </w:tcPr>
+          <w:p>
+            <w:pPr>
+              <w:cnfStyle w:val="000000000000" w:firstRow="0" w:lastRow="0" w:firstColumn="0" w:lastColumn="0" w:oddVBand="0" w:evenVBand="0" w:oddHBand="0" w:evenHBand="0" w:firstRowFirstColumn="0" w:firstRowLastColumn="0" w:lastRowFirstColumn="0" w:lastRowLastColumn="0"/>
+            </w:pPr>
+            <w:r>
+              <w:t>En cours</w:t>
+            </w:r>
+            <w:bookmarkStart w:id="1" w:name="_GoBack"/>
+            <w:bookmarkEnd w:id="1"/>
+          </w:p>
+        </w:tc>
+        <w:tc>
+          <w:tcPr>
+            <w:tcW w:w="1285" w:type="dxa"/>
+          </w:tcPr>
+          <w:p>
+            <w:pPr>
+              <w:cnfStyle w:val="000000000000" w:firstRow="0" w:lastRow="0" w:firstColumn="0" w:lastColumn="0" w:oddVBand="0" w:evenVBand="0" w:oddHBand="0" w:evenHBand="0" w:firstRowFirstColumn="0" w:firstRowLastColumn="0" w:lastRowFirstColumn="0" w:lastRowLastColumn="0"/>
+            </w:pPr>
+          </w:p>
+        </w:tc>
+      </w:tr>
+      <w:tr>
+        <w:trPr>
+          <w:cnfStyle w:val="000000100000" w:firstRow="0" w:lastRow="0" w:firstColumn="0" w:lastColumn="0" w:oddVBand="0" w:evenVBand="0" w:oddHBand="1" w:evenHBand="0" w:firstRowFirstColumn="0" w:firstRowLastColumn="0" w:lastRowFirstColumn="0" w:lastRowLastColumn="0"/>
+          <w:trHeight w:val="505"/>
+        </w:trPr>
+        <w:tc>
+          <w:tcPr>
+            <w:cnfStyle w:val="001000000000" w:firstRow="0" w:lastRow="0" w:firstColumn="1" w:lastColumn="0" w:oddVBand="0" w:evenVBand="0" w:oddHBand="0" w:evenHBand="0" w:firstRowFirstColumn="0" w:firstRowLastColumn="0" w:lastRowFirstColumn="0" w:lastRowLastColumn="0"/>
+            <w:tcW w:w="6307" w:type="dxa"/>
+          </w:tcPr>
+          <w:p>
+            <w:pPr>
+              <w:rPr>
+                <w:b w:val="0"/>
+              </w:rPr>
+            </w:pPr>
+            <w:r>
+              <w:rPr>
+                <w:b w:val="0"/>
+              </w:rPr>
+              <w:t>Renvoyer l’invitation</w:t>
+            </w:r>
+            <w:r>
+              <w:rPr>
+                <w:b w:val="0"/>
+              </w:rPr>
+              <w:t xml:space="preserve"> au collaborateur en cas de bug</w:t>
+            </w:r>
+          </w:p>
+        </w:tc>
+        <w:tc>
+          <w:tcPr>
+            <w:tcW w:w="1578" w:type="dxa"/>
+          </w:tcPr>
+          <w:p>
+            <w:pPr>
+              <w:cnfStyle w:val="000000100000" w:firstRow="0" w:lastRow="0" w:firstColumn="0" w:lastColumn="0" w:oddVBand="0" w:evenVBand="0" w:oddHBand="1" w:evenHBand="0" w:firstRowFirstColumn="0" w:firstRowLastColumn="0" w:lastRowFirstColumn="0" w:lastRowLastColumn="0"/>
+            </w:pPr>
+            <w:r>
+              <w:t>En cours</w:t>
+            </w:r>
+          </w:p>
+        </w:tc>
+        <w:tc>
+          <w:tcPr>
+            <w:tcW w:w="1285" w:type="dxa"/>
+          </w:tcPr>
+          <w:p>
+            <w:pPr>
+              <w:cnfStyle w:val="000000100000" w:firstRow="0" w:lastRow="0" w:firstColumn="0" w:lastColumn="0" w:oddVBand="0" w:evenVBand="0" w:oddHBand="1" w:evenHBand="0" w:firstRowFirstColumn="0" w:firstRowLastColumn="0" w:lastRowFirstColumn="0" w:lastRowLastColumn="0"/>
+            </w:pPr>
+          </w:p>
+        </w:tc>
+      </w:tr>
+      <w:tr>
+        <w:trPr>
+          <w:trHeight w:val="488"/>
+        </w:trPr>
+        <w:tc>
+          <w:tcPr>
+            <w:cnfStyle w:val="001000000000" w:firstRow="0" w:lastRow="0" w:firstColumn="1" w:lastColumn="0" w:oddVBand="0" w:evenVBand="0" w:oddHBand="0" w:evenHBand="0" w:firstRowFirstColumn="0" w:firstRowLastColumn="0" w:lastRowFirstColumn="0" w:lastRowLastColumn="0"/>
+            <w:tcW w:w="6307" w:type="dxa"/>
+          </w:tcPr>
+          <w:p>
+            <w:pPr>
+              <w:rPr>
+                <w:b w:val="0"/>
+              </w:rPr>
+            </w:pPr>
+            <w:r>
+              <w:rPr>
+                <w:b w:val="0"/>
+              </w:rPr>
+              <w:t xml:space="preserve">Modification des informations du compte </w:t>
             </w:r>
             <w:r>
               <w:rPr>
@@ -1205,7 +1315,7 @@
       <w:tr>
         <w:trPr>
           <w:cnfStyle w:val="000000100000" w:firstRow="0" w:lastRow="0" w:firstColumn="0" w:lastColumn="0" w:oddVBand="0" w:evenVBand="0" w:oddHBand="1" w:evenHBand="0" w:firstRowFirstColumn="0" w:firstRowLastColumn="0" w:lastRowFirstColumn="0" w:lastRowLastColumn="0"/>
-          <w:trHeight w:val="488"/>
+          <w:trHeight w:val="505"/>
         </w:trPr>
         <w:tc>
           <w:tcPr>
@@ -1222,7 +1332,7 @@
               <w:rPr>
                 <w:b w:val="0"/>
               </w:rPr>
-              <w:t xml:space="preserve">Modification des informations du compte </w:t>
+              <w:t xml:space="preserve">Suppression du compte </w:t>
             </w:r>
             <w:r>
               <w:rPr>
@@ -1230,58 +1340,11 @@
               </w:rPr>
               <w:t>de collaborateurs</w:t>
             </w:r>
-          </w:p>
-        </w:tc>
-        <w:tc>
-          <w:tcPr>
-            <w:tcW w:w="1578" w:type="dxa"/>
-          </w:tcPr>
-          <w:p>
-            <w:pPr>
-              <w:cnfStyle w:val="000000100000" w:firstRow="0" w:lastRow="0" w:firstColumn="0" w:lastColumn="0" w:oddVBand="0" w:evenVBand="0" w:oddHBand="1" w:evenHBand="0" w:firstRowFirstColumn="0" w:firstRowLastColumn="0" w:lastRowFirstColumn="0" w:lastRowLastColumn="0"/>
-            </w:pPr>
-            <w:r>
-              <w:t>En cours</w:t>
-            </w:r>
-          </w:p>
-        </w:tc>
-        <w:tc>
-          <w:tcPr>
-            <w:tcW w:w="1285" w:type="dxa"/>
-          </w:tcPr>
-          <w:p>
-            <w:pPr>
-              <w:cnfStyle w:val="000000100000" w:firstRow="0" w:lastRow="0" w:firstColumn="0" w:lastColumn="0" w:oddVBand="0" w:evenVBand="0" w:oddHBand="1" w:evenHBand="0" w:firstRowFirstColumn="0" w:firstRowLastColumn="0" w:lastRowFirstColumn="0" w:lastRowLastColumn="0"/>
-            </w:pPr>
-          </w:p>
-        </w:tc>
-      </w:tr>
-      <w:tr>
-        <w:trPr>
-          <w:trHeight w:val="505"/>
-        </w:trPr>
-        <w:tc>
-          <w:tcPr>
-            <w:cnfStyle w:val="001000000000" w:firstRow="0" w:lastRow="0" w:firstColumn="1" w:lastColumn="0" w:oddVBand="0" w:evenVBand="0" w:oddHBand="0" w:evenHBand="0" w:firstRowFirstColumn="0" w:firstRowLastColumn="0" w:lastRowFirstColumn="0" w:lastRowLastColumn="0"/>
-            <w:tcW w:w="6307" w:type="dxa"/>
-          </w:tcPr>
-          <w:p>
-            <w:pPr>
+            <w:r>
               <w:rPr>
                 <w:b w:val="0"/>
               </w:rPr>
-            </w:pPr>
-            <w:r>
-              <w:rPr>
-                <w:b w:val="0"/>
-              </w:rPr>
-              <w:t xml:space="preserve">Suppression du compte </w:t>
-            </w:r>
-            <w:r>
-              <w:rPr>
-                <w:b w:val="0"/>
-              </w:rPr>
-              <w:t>de collaborateurs</w:t>
+              <w:t xml:space="preserve"> par l’administrateur</w:t>
             </w:r>
           </w:p>
         </w:tc>
@@ -1291,7 +1354,7 @@
           </w:tcPr>
           <w:p>
             <w:pPr>
-              <w:cnfStyle w:val="000000000000" w:firstRow="0" w:lastRow="0" w:firstColumn="0" w:lastColumn="0" w:oddVBand="0" w:evenVBand="0" w:oddHBand="0" w:evenHBand="0" w:firstRowFirstColumn="0" w:firstRowLastColumn="0" w:lastRowFirstColumn="0" w:lastRowLastColumn="0"/>
+              <w:cnfStyle w:val="000000100000" w:firstRow="0" w:lastRow="0" w:firstColumn="0" w:lastColumn="0" w:oddVBand="0" w:evenVBand="0" w:oddHBand="1" w:evenHBand="0" w:firstRowFirstColumn="0" w:firstRowLastColumn="0" w:lastRowFirstColumn="0" w:lastRowLastColumn="0"/>
             </w:pPr>
             <w:r>
               <w:t>En cours</w:t>
@@ -1304,7 +1367,7 @@
           </w:tcPr>
           <w:p>
             <w:pPr>
-              <w:cnfStyle w:val="000000000000" w:firstRow="0" w:lastRow="0" w:firstColumn="0" w:lastColumn="0" w:oddVBand="0" w:evenVBand="0" w:oddHBand="0" w:evenHBand="0" w:firstRowFirstColumn="0" w:firstRowLastColumn="0" w:lastRowFirstColumn="0" w:lastRowLastColumn="0"/>
+              <w:cnfStyle w:val="000000100000" w:firstRow="0" w:lastRow="0" w:firstColumn="0" w:lastColumn="0" w:oddVBand="0" w:evenVBand="0" w:oddHBand="1" w:evenHBand="0" w:firstRowFirstColumn="0" w:firstRowLastColumn="0" w:lastRowFirstColumn="0" w:lastRowLastColumn="0"/>
             </w:pPr>
           </w:p>
         </w:tc>
@@ -1385,6 +1448,68 @@
     <w:p>
       <w:r>
         <w:t>Dans cette partie, nous allons nous focaliser sur les fonctionnalités de base en commençant par une visite guidée de notre application de bureau.</w:t>
+      </w:r>
+      <w:r>
+        <w:t xml:space="preserve"> On deux principales features :</w:t>
+      </w:r>
+    </w:p>
+    <w:p>
+      <w:pPr>
+        <w:pStyle w:val="Paragraphedeliste"/>
+        <w:numPr>
+          <w:ilvl w:val="0"/>
+          <w:numId w:val="5"/>
+        </w:numPr>
+      </w:pPr>
+      <w:r>
+        <w:t xml:space="preserve">Stocker des données en ligne un peu comme drive ou </w:t>
+      </w:r>
+      <w:proofErr w:type="spellStart"/>
+      <w:r>
+        <w:t>DropBox</w:t>
+      </w:r>
+      <w:proofErr w:type="spellEnd"/>
+      <w:r>
+        <w:t>.</w:t>
+      </w:r>
+    </w:p>
+    <w:p>
+      <w:pPr>
+        <w:pStyle w:val="Paragraphedeliste"/>
+        <w:numPr>
+          <w:ilvl w:val="0"/>
+          <w:numId w:val="5"/>
+        </w:numPr>
+      </w:pPr>
+      <w:r>
+        <w:t>Concevoir un système de gestion de projets pour un suivi effectif des travaux au sein du cabinet.</w:t>
+      </w:r>
+    </w:p>
+    <w:p>
+      <w:pPr>
+        <w:pStyle w:val="Paragraphedeliste"/>
+        <w:numPr>
+          <w:ilvl w:val="0"/>
+          <w:numId w:val="5"/>
+        </w:numPr>
+      </w:pPr>
+      <w:r>
+        <w:t xml:space="preserve">Concevoir un système de </w:t>
+      </w:r>
+      <w:r>
+        <w:rPr>
+          <w:i/>
+        </w:rPr>
+        <w:t>versioning</w:t>
+      </w:r>
+      <w:r>
+        <w:rPr>
+          <w:i/>
+        </w:rPr>
+        <w:t xml:space="preserve"> </w:t>
+      </w:r>
+      <w:r>
+        <w:t xml:space="preserve">un peu comme git mais pour les juristes.  </w:t>
       </w:r>
     </w:p>
     <w:sectPr>
@@ -1548,7 +1673,7 @@
   <w:abstractNum w:abstractNumId="1" w15:restartNumberingAfterBreak="0">
     <w:nsid w:val="203B3A87"/>
     <w:multiLevelType w:val="hybridMultilevel"/>
-    <w:tmpl w:val="04B2A3C2"/>
+    <w:tmpl w:val="6BF03216"/>
     <w:lvl w:ilvl="0" w:tplc="5C3CF308">
       <w:start w:val="1"/>
       <w:numFmt w:val="bullet"/>
@@ -3982,7 +4107,7 @@
 </file>
 
 <file path=customXml/itemProps1.xml><?xml version="1.0" encoding="utf-8"?>
-<ds:datastoreItem xmlns:ds="http://schemas.openxmlformats.org/officeDocument/2006/customXml" ds:itemID="{37E78047-52A8-452F-9711-BA5201D57FF6}">
+<ds:datastoreItem xmlns:ds="http://schemas.openxmlformats.org/officeDocument/2006/customXml" ds:itemID="{D8A67DA9-87E2-4C0D-AC62-37998273756E}">
   <ds:schemaRefs>
     <ds:schemaRef ds:uri="http://schemas.openxmlformats.org/officeDocument/2006/bibliography"/>
   </ds:schemaRefs>

</xml_diff>

<commit_message>
work on charge copy book
</commit_message>
<xml_diff>
--- a/CAHIER DE CHARGE DE DOCSIRA.docx
+++ b/CAHIER DE CHARGE DE DOCSIRA.docx
@@ -1188,10 +1188,8 @@
               <w:cnfStyle w:val="000000000000" w:firstRow="0" w:lastRow="0" w:firstColumn="0" w:lastColumn="0" w:oddVBand="0" w:evenVBand="0" w:oddHBand="0" w:evenHBand="0" w:firstRowFirstColumn="0" w:firstRowLastColumn="0" w:lastRowFirstColumn="0" w:lastRowLastColumn="0"/>
             </w:pPr>
             <w:r>
-              <w:t>En cours</w:t>
-            </w:r>
-            <w:bookmarkStart w:id="1" w:name="_GoBack"/>
-            <w:bookmarkEnd w:id="1"/>
+              <w:t>Terminé</w:t>
+            </w:r>
           </w:p>
         </w:tc>
         <w:tc>
@@ -1244,8 +1242,10 @@
               <w:cnfStyle w:val="000000100000" w:firstRow="0" w:lastRow="0" w:firstColumn="0" w:lastColumn="0" w:oddVBand="0" w:evenVBand="0" w:oddHBand="1" w:evenHBand="0" w:firstRowFirstColumn="0" w:firstRowLastColumn="0" w:lastRowFirstColumn="0" w:lastRowLastColumn="0"/>
             </w:pPr>
             <w:r>
-              <w:t>En cours</w:t>
-            </w:r>
+              <w:t>Terminé</w:t>
+            </w:r>
+            <w:bookmarkStart w:id="1" w:name="_GoBack"/>
+            <w:bookmarkEnd w:id="1"/>
           </w:p>
         </w:tc>
         <w:tc>
@@ -4107,7 +4107,7 @@
 </file>
 
 <file path=customXml/itemProps1.xml><?xml version="1.0" encoding="utf-8"?>
-<ds:datastoreItem xmlns:ds="http://schemas.openxmlformats.org/officeDocument/2006/customXml" ds:itemID="{D8A67DA9-87E2-4C0D-AC62-37998273756E}">
+<ds:datastoreItem xmlns:ds="http://schemas.openxmlformats.org/officeDocument/2006/customXml" ds:itemID="{7802E885-E487-4DB5-BE27-84CD99F05AA5}">
   <ds:schemaRefs>
     <ds:schemaRef ds:uri="http://schemas.openxmlformats.org/officeDocument/2006/bibliography"/>
   </ds:schemaRefs>

</xml_diff>

<commit_message>
WORK on password changing
</commit_message>
<xml_diff>
--- a/CAHIER DE CHARGE DE DOCSIRA.docx
+++ b/CAHIER DE CHARGE DE DOCSIRA.docx
@@ -745,7 +745,7 @@
               <w:cnfStyle w:val="000000000000" w:firstRow="0" w:lastRow="0" w:firstColumn="0" w:lastColumn="0" w:oddVBand="0" w:evenVBand="0" w:oddHBand="0" w:evenHBand="0" w:firstRowFirstColumn="0" w:firstRowLastColumn="0" w:lastRowFirstColumn="0" w:lastRowLastColumn="0"/>
             </w:pPr>
             <w:r>
-              <w:t>En cours</w:t>
+              <w:t>Terminé</w:t>
             </w:r>
           </w:p>
         </w:tc>
@@ -757,6 +757,11 @@
             <w:pPr>
               <w:cnfStyle w:val="000000000000" w:firstRow="0" w:lastRow="0" w:firstColumn="0" w:lastColumn="0" w:oddVBand="0" w:evenVBand="0" w:oddHBand="0" w:evenHBand="0" w:firstRowFirstColumn="0" w:firstRowLastColumn="0" w:lastRowFirstColumn="0" w:lastRowLastColumn="0"/>
             </w:pPr>
+            <w:r>
+              <w:t>10</w:t>
+            </w:r>
+            <w:bookmarkStart w:id="0" w:name="_GoBack"/>
+            <w:bookmarkEnd w:id="0"/>
           </w:p>
         </w:tc>
       </w:tr>
@@ -774,15 +779,13 @@
             <w:pPr>
               <w:rPr>
                 <w:b w:val="0"/>
-                <w:bCs w:val="0"/>
               </w:rPr>
             </w:pPr>
             <w:r>
               <w:rPr>
                 <w:b w:val="0"/>
-                <w:bCs w:val="0"/>
-              </w:rPr>
-              <w:t>Déconnexion de l’espace administrateur</w:t>
+              </w:rPr>
+              <w:t>Modification du mot de passe</w:t>
             </w:r>
           </w:p>
         </w:tc>
@@ -795,7 +798,7 @@
               <w:cnfStyle w:val="000000100000" w:firstRow="0" w:lastRow="0" w:firstColumn="0" w:lastColumn="0" w:oddVBand="0" w:evenVBand="0" w:oddHBand="1" w:evenHBand="0" w:firstRowFirstColumn="0" w:firstRowLastColumn="0" w:lastRowFirstColumn="0" w:lastRowLastColumn="0"/>
             </w:pPr>
             <w:r>
-              <w:t>Terminé</w:t>
+              <w:t>En cours</w:t>
             </w:r>
           </w:p>
         </w:tc>
@@ -812,6 +815,56 @@
       </w:tr>
       <w:tr>
         <w:trPr>
+          <w:trHeight w:val="488"/>
+        </w:trPr>
+        <w:tc>
+          <w:tcPr>
+            <w:cnfStyle w:val="001000000000" w:firstRow="0" w:lastRow="0" w:firstColumn="1" w:lastColumn="0" w:oddVBand="0" w:evenVBand="0" w:oddHBand="0" w:evenHBand="0" w:firstRowFirstColumn="0" w:firstRowLastColumn="0" w:lastRowFirstColumn="0" w:lastRowLastColumn="0"/>
+            <w:tcW w:w="6307" w:type="dxa"/>
+          </w:tcPr>
+          <w:p>
+            <w:pPr>
+              <w:rPr>
+                <w:b w:val="0"/>
+                <w:bCs w:val="0"/>
+              </w:rPr>
+            </w:pPr>
+            <w:r>
+              <w:rPr>
+                <w:b w:val="0"/>
+                <w:bCs w:val="0"/>
+              </w:rPr>
+              <w:t>Déconnexion de l’espace administrateur</w:t>
+            </w:r>
+          </w:p>
+        </w:tc>
+        <w:tc>
+          <w:tcPr>
+            <w:tcW w:w="1578" w:type="dxa"/>
+          </w:tcPr>
+          <w:p>
+            <w:pPr>
+              <w:cnfStyle w:val="000000000000" w:firstRow="0" w:lastRow="0" w:firstColumn="0" w:lastColumn="0" w:oddVBand="0" w:evenVBand="0" w:oddHBand="0" w:evenHBand="0" w:firstRowFirstColumn="0" w:firstRowLastColumn="0" w:lastRowFirstColumn="0" w:lastRowLastColumn="0"/>
+            </w:pPr>
+            <w:r>
+              <w:t>Terminé</w:t>
+            </w:r>
+          </w:p>
+        </w:tc>
+        <w:tc>
+          <w:tcPr>
+            <w:tcW w:w="1285" w:type="dxa"/>
+          </w:tcPr>
+          <w:p>
+            <w:pPr>
+              <w:cnfStyle w:val="000000000000" w:firstRow="0" w:lastRow="0" w:firstColumn="0" w:lastColumn="0" w:oddVBand="0" w:evenVBand="0" w:oddHBand="0" w:evenHBand="0" w:firstRowFirstColumn="0" w:firstRowLastColumn="0" w:lastRowFirstColumn="0" w:lastRowLastColumn="0"/>
+            </w:pPr>
+          </w:p>
+        </w:tc>
+      </w:tr>
+      <w:tr>
+        <w:trPr>
+          <w:cnfStyle w:val="000000100000" w:firstRow="0" w:lastRow="0" w:firstColumn="0" w:lastColumn="0" w:oddVBand="0" w:evenVBand="0" w:oddHBand="1" w:evenHBand="0" w:firstRowFirstColumn="0" w:firstRowLastColumn="0" w:lastRowFirstColumn="0" w:lastRowLastColumn="0"/>
           <w:trHeight w:val="505"/>
         </w:trPr>
         <w:tc>
@@ -841,7 +894,7 @@
           </w:tcPr>
           <w:p>
             <w:pPr>
-              <w:cnfStyle w:val="000000000000" w:firstRow="0" w:lastRow="0" w:firstColumn="0" w:lastColumn="0" w:oddVBand="0" w:evenVBand="0" w:oddHBand="0" w:evenHBand="0" w:firstRowFirstColumn="0" w:firstRowLastColumn="0" w:lastRowFirstColumn="0" w:lastRowLastColumn="0"/>
+              <w:cnfStyle w:val="000000100000" w:firstRow="0" w:lastRow="0" w:firstColumn="0" w:lastColumn="0" w:oddVBand="0" w:evenVBand="0" w:oddHBand="1" w:evenHBand="0" w:firstRowFirstColumn="0" w:firstRowLastColumn="0" w:lastRowFirstColumn="0" w:lastRowLastColumn="0"/>
             </w:pPr>
             <w:r>
               <w:t>En cours</w:t>
@@ -854,7 +907,7 @@
           </w:tcPr>
           <w:p>
             <w:pPr>
-              <w:cnfStyle w:val="000000000000" w:firstRow="0" w:lastRow="0" w:firstColumn="0" w:lastColumn="0" w:oddVBand="0" w:evenVBand="0" w:oddHBand="0" w:evenHBand="0" w:firstRowFirstColumn="0" w:firstRowLastColumn="0" w:lastRowFirstColumn="0" w:lastRowLastColumn="0"/>
+              <w:cnfStyle w:val="000000100000" w:firstRow="0" w:lastRow="0" w:firstColumn="0" w:lastColumn="0" w:oddVBand="0" w:evenVBand="0" w:oddHBand="1" w:evenHBand="0" w:firstRowFirstColumn="0" w:firstRowLastColumn="0" w:lastRowFirstColumn="0" w:lastRowLastColumn="0"/>
             </w:pPr>
           </w:p>
         </w:tc>
@@ -888,7 +941,7 @@
       </w:r>
     </w:p>
     <w:p>
-      <w:commentRangeStart w:id="0"/>
+      <w:commentRangeStart w:id="1"/>
       <w:r>
         <w:t>Par ailleurs, l</w:t>
       </w:r>
@@ -904,12 +957,12 @@
       <w:r>
         <w:t>à la plateforme.</w:t>
       </w:r>
-      <w:commentRangeEnd w:id="0"/>
+      <w:commentRangeEnd w:id="1"/>
       <w:r>
         <w:rPr>
           <w:rStyle w:val="Marquedecommentaire"/>
         </w:rPr>
-        <w:commentReference w:id="0"/>
+        <w:commentReference w:id="1"/>
       </w:r>
     </w:p>
     <w:p>
@@ -1244,8 +1297,6 @@
             <w:r>
               <w:t>Terminé</w:t>
             </w:r>
-            <w:bookmarkStart w:id="1" w:name="_GoBack"/>
-            <w:bookmarkEnd w:id="1"/>
           </w:p>
         </w:tc>
         <w:tc>
@@ -1464,11 +1515,9 @@
       <w:r>
         <w:t xml:space="preserve">Stocker des données en ligne un peu comme drive ou </w:t>
       </w:r>
-      <w:proofErr w:type="spellStart"/>
-      <w:r>
-        <w:t>DropBox</w:t>
-      </w:r>
-      <w:proofErr w:type="spellEnd"/>
+      <w:r>
+        <w:t>Dropbox</w:t>
+      </w:r>
       <w:r>
         <w:t>.</w:t>
       </w:r>
@@ -1524,7 +1573,7 @@
 
 <file path=word/comments.xml><?xml version="1.0" encoding="utf-8"?>
 <w:comments xmlns:wpc="http://schemas.microsoft.com/office/word/2010/wordprocessingCanvas" xmlns:cx="http://schemas.microsoft.com/office/drawing/2014/chartex" xmlns:cx1="http://schemas.microsoft.com/office/drawing/2015/9/8/chartex" xmlns:mc="http://schemas.openxmlformats.org/markup-compatibility/2006" xmlns:o="urn:schemas-microsoft-com:office:office" xmlns:r="http://schemas.openxmlformats.org/officeDocument/2006/relationships" xmlns:m="http://schemas.openxmlformats.org/officeDocument/2006/math" xmlns:v="urn:schemas-microsoft-com:vml" xmlns:wp14="http://schemas.microsoft.com/office/word/2010/wordprocessingDrawing" xmlns:wp="http://schemas.openxmlformats.org/drawingml/2006/wordprocessingDrawing" xmlns:w10="urn:schemas-microsoft-com:office:word" xmlns:w="http://schemas.openxmlformats.org/wordprocessingml/2006/main" xmlns:w14="http://schemas.microsoft.com/office/word/2010/wordml" xmlns:w15="http://schemas.microsoft.com/office/word/2012/wordml" xmlns:w16se="http://schemas.microsoft.com/office/word/2015/wordml/symex" xmlns:wpg="http://schemas.microsoft.com/office/word/2010/wordprocessingGroup" xmlns:wpi="http://schemas.microsoft.com/office/word/2010/wordprocessingInk" xmlns:wne="http://schemas.microsoft.com/office/word/2006/wordml" xmlns:wps="http://schemas.microsoft.com/office/word/2010/wordprocessingShape" mc:Ignorable="w14 w15 w16se wp14">
-  <w:comment w:id="0" w:author="ADN COM" w:date="2026-09-10T10:08:00Z" w:initials="AC">
+  <w:comment w:id="1" w:author="ADN COM" w:date="2026-09-10T10:08:00Z" w:initials="AC">
     <w:p>
       <w:pPr>
         <w:pStyle w:val="Commentaire"/>
@@ -4107,7 +4156,7 @@
 </file>
 
 <file path=customXml/itemProps1.xml><?xml version="1.0" encoding="utf-8"?>
-<ds:datastoreItem xmlns:ds="http://schemas.openxmlformats.org/officeDocument/2006/customXml" ds:itemID="{7802E885-E487-4DB5-BE27-84CD99F05AA5}">
+<ds:datastoreItem xmlns:ds="http://schemas.openxmlformats.org/officeDocument/2006/customXml" ds:itemID="{AB9346BC-0014-4DBF-8D77-DD0C7F3F914B}">
   <ds:schemaRefs>
     <ds:schemaRef ds:uri="http://schemas.openxmlformats.org/officeDocument/2006/bibliography"/>
   </ds:schemaRefs>

</xml_diff>

<commit_message>
work on a folder start management starting
</commit_message>
<xml_diff>
--- a/CAHIER DE CHARGE DE DOCSIRA.docx
+++ b/CAHIER DE CHARGE DE DOCSIRA.docx
@@ -360,11 +360,9 @@
       <w:r>
         <w:t xml:space="preserve"> pas pour l’instant si la méthode est </w:t>
       </w:r>
-      <w:proofErr w:type="spellStart"/>
-      <w:r>
-        <w:t>safe</w:t>
-      </w:r>
-      <w:proofErr w:type="spellEnd"/>
+      <w:r>
+        <w:t>saine</w:t>
+      </w:r>
       <w:r>
         <w:t xml:space="preserve"> mais </w:t>
       </w:r>
@@ -597,8 +595,6 @@
             </w:r>
           </w:p>
         </w:tc>
-        <w:bookmarkStart w:id="0" w:name="_GoBack"/>
-        <w:bookmarkEnd w:id="0"/>
       </w:tr>
       <w:tr>
         <w:trPr>
@@ -947,21 +943,56 @@
       </w:r>
     </w:p>
     <w:p>
+      <w:commentRangeStart w:id="0"/>
+      <w:r>
+        <w:t>Par ailleurs, l</w:t>
+      </w:r>
+      <w:r>
+        <w:t xml:space="preserve">e souci étant que l’application est en local, donc l’accès à l’application devra se faire depuis la source, le code d’activation </w:t>
+      </w:r>
+      <w:r>
+        <w:t>doit donner</w:t>
+      </w:r>
+      <w:r>
+        <w:t xml:space="preserve"> l’accès </w:t>
+      </w:r>
+      <w:r>
+        <w:t>à la plateforme.</w:t>
+      </w:r>
+      <w:commentRangeEnd w:id="0"/>
+      <w:r>
+        <w:rPr>
+          <w:rStyle w:val="Marquedecommentaire"/>
+        </w:rPr>
+        <w:commentReference w:id="0"/>
+      </w:r>
+    </w:p>
+    <w:p>
+      <w:r>
+        <w:t>Comment se fait l’ajout des collaborateurs ?</w:t>
+      </w:r>
+    </w:p>
+    <w:p>
+      <w:r>
+        <w:t xml:space="preserve">L’ajout des collaborateurs se fait par l’envoi </w:t>
+      </w:r>
+      <w:r>
+        <w:t>des identifiants du collaborateur</w:t>
+      </w:r>
+      <w:r>
+        <w:t xml:space="preserve"> via l’email du collaborateur. </w:t>
+      </w:r>
+      <w:r>
+        <w:t>Une fois les coordonnées reçues, ils pourront se connecter et avoir accès à l’application ou au logiciel.</w:t>
+      </w:r>
+      <w:r>
+        <w:t xml:space="preserve"> Pour des raisons de sécurité le collaborateur devra changer son mot de passe une fois connecté !</w:t>
+      </w:r>
+    </w:p>
+    <w:p>
       <w:commentRangeStart w:id="1"/>
       <w:r>
-        <w:t>Par ailleurs, l</w:t>
-      </w:r>
-      <w:r>
-        <w:t xml:space="preserve">e souci étant que l’application est en local, donc l’accès à l’application devra se faire depuis la source, le code d’activation </w:t>
-      </w:r>
-      <w:r>
-        <w:t>doit donner</w:t>
-      </w:r>
-      <w:r>
-        <w:t xml:space="preserve"> l’accès </w:t>
-      </w:r>
-      <w:r>
-        <w:t>à la plateforme.</w:t>
+        <w:t>NB : Créer une bannière lui permettant de le lui rappeler !</w:t>
       </w:r>
       <w:commentRangeEnd w:id="1"/>
       <w:r>
@@ -973,25 +1004,7 @@
     </w:p>
     <w:p>
       <w:r>
-        <w:t>Comment se fait l’ajout des collaborateurs ?</w:t>
-      </w:r>
-    </w:p>
-    <w:p>
-      <w:r>
-        <w:t xml:space="preserve">L’ajout des collaborateurs se fait par l’envoi </w:t>
-      </w:r>
-      <w:r>
-        <w:t>des identifiants du collaborateur</w:t>
-      </w:r>
-      <w:r>
-        <w:t xml:space="preserve"> via l’email du collaborateur. </w:t>
-      </w:r>
-      <w:r>
-        <w:t>Une fois les coordonnées reçues, ils pourront se connecter et avoir accès à l’application ou au logiciel.</w:t>
-      </w:r>
-    </w:p>
-    <w:p>
-      <w:r>
+        <w:lastRenderedPageBreak/>
         <w:t>Dans les paramètres du compte collaborateur, il y a la section du compte administrateur qui n’est pas modifiable. Le collaborateur doit pouvoir changer son mot de passe et certaines de ces informations.</w:t>
       </w:r>
     </w:p>
@@ -1018,7 +1031,6 @@
           </w:tcPr>
           <w:p>
             <w:r>
-              <w:lastRenderedPageBreak/>
               <w:t>Fonctionnalité</w:t>
             </w:r>
           </w:p>
@@ -1354,7 +1366,7 @@
               <w:cnfStyle w:val="000000000000" w:firstRow="0" w:lastRow="0" w:firstColumn="0" w:lastColumn="0" w:oddVBand="0" w:evenVBand="0" w:oddHBand="0" w:evenHBand="0" w:firstRowFirstColumn="0" w:firstRowLastColumn="0" w:lastRowFirstColumn="0" w:lastRowLastColumn="0"/>
             </w:pPr>
             <w:r>
-              <w:t>En cours</w:t>
+              <w:t>Terminé</w:t>
             </w:r>
           </w:p>
         </w:tc>
@@ -1414,7 +1426,7 @@
               <w:cnfStyle w:val="000000100000" w:firstRow="0" w:lastRow="0" w:firstColumn="0" w:lastColumn="0" w:oddVBand="0" w:evenVBand="0" w:oddHBand="1" w:evenHBand="0" w:firstRowFirstColumn="0" w:firstRowLastColumn="0" w:lastRowFirstColumn="0" w:lastRowLastColumn="0"/>
             </w:pPr>
             <w:r>
-              <w:t>En cours</w:t>
+              <w:t>Terminé</w:t>
             </w:r>
           </w:p>
         </w:tc>
@@ -1447,11 +1459,9 @@
       <w:r>
         <w:t xml:space="preserve">Maintenant il y a trois états quand on essaie de </w:t>
       </w:r>
-      <w:proofErr w:type="spellStart"/>
-      <w:r>
-        <w:t>fetch</w:t>
-      </w:r>
-      <w:proofErr w:type="spellEnd"/>
+      <w:r>
+        <w:t>récupérer</w:t>
+      </w:r>
       <w:r>
         <w:t xml:space="preserve"> des données, </w:t>
       </w:r>
@@ -1480,13 +1490,17 @@
         </w:numPr>
       </w:pPr>
       <w:r>
-        <w:t xml:space="preserve">Gestion de l’abonnement de </w:t>
-      </w:r>
-      <w:proofErr w:type="spellStart"/>
-      <w:r>
-        <w:t>DocSira</w:t>
-      </w:r>
-      <w:proofErr w:type="spellEnd"/>
+        <w:t>Gestion de l’abonnement de Docs</w:t>
+      </w:r>
+      <w:r>
+        <w:t>ira</w:t>
+      </w:r>
+    </w:p>
+    <w:p/>
+    <w:p>
+      <w:r>
+        <w:t>Cette section sera vu après une réunion avec le directeur des innovations.</w:t>
+      </w:r>
     </w:p>
     <w:p/>
     <w:p>
@@ -1504,6 +1518,7 @@
     <w:p/>
     <w:p>
       <w:r>
+        <w:lastRenderedPageBreak/>
         <w:t>Dans cette partie, nous allons nous focaliser sur les fonctionnalités de base en commençant par une visite guidée de notre application de bureau.</w:t>
       </w:r>
       <w:r>
@@ -1567,6 +1582,1038 @@
         <w:t xml:space="preserve">un peu comme git mais pour les juristes.  </w:t>
       </w:r>
     </w:p>
+    <w:p/>
+    <w:p>
+      <w:pPr>
+        <w:pStyle w:val="Titre3"/>
+        <w:numPr>
+          <w:ilvl w:val="0"/>
+          <w:numId w:val="6"/>
+        </w:numPr>
+      </w:pPr>
+      <w:r>
+        <w:t>Stocker des données en ligne un peu comme Dropbox</w:t>
+      </w:r>
+    </w:p>
+    <w:p/>
+    <w:p>
+      <w:r>
+        <w:t>Dans une feature, le but est d’établir le crud des objets ! On va donner 500 Mb pour chaque collaborateur avec une limite de collaborateur qui est de 4 pour les stockages en lignes. Les collaborateurs devraient pourvoir créer un dossier qui est désigné comme un pr</w:t>
+      </w:r>
+      <w:r>
+        <w:t>ojet dans notre logiciel. Dans l</w:t>
+      </w:r>
+      <w:r>
+        <w:t>e projet il doit pouvoir ajouter les pièces</w:t>
+      </w:r>
+      <w:r>
+        <w:t xml:space="preserve"> qui sont des documents. Ici on ne mettra pas d’indicateurs spécifiques pour évaluer la progression des tâches c’est juste du stockage de type Dropbox</w:t>
+      </w:r>
+    </w:p>
+    <w:p/>
+    <w:p>
+      <w:r>
+        <w:t>Cette fonction se fait sur deux volets :</w:t>
+      </w:r>
+    </w:p>
+    <w:p>
+      <w:pPr>
+        <w:pStyle w:val="Paragraphedeliste"/>
+        <w:numPr>
+          <w:ilvl w:val="0"/>
+          <w:numId w:val="7"/>
+        </w:numPr>
+      </w:pPr>
+      <w:r>
+        <w:t>En local</w:t>
+      </w:r>
+    </w:p>
+    <w:p>
+      <w:pPr>
+        <w:pStyle w:val="Paragraphedeliste"/>
+        <w:numPr>
+          <w:ilvl w:val="0"/>
+          <w:numId w:val="7"/>
+        </w:numPr>
+      </w:pPr>
+      <w:r>
+        <w:t>En ligne</w:t>
+      </w:r>
+      <w:r>
+        <w:t xml:space="preserve">, simplement le </w:t>
+      </w:r>
+      <w:r>
+        <w:t>Backend</w:t>
+      </w:r>
+      <w:r>
+        <w:t xml:space="preserve"> python !</w:t>
+      </w:r>
+    </w:p>
+    <w:p/>
+    <w:p>
+      <w:pPr>
+        <w:pStyle w:val="Titre3"/>
+        <w:numPr>
+          <w:ilvl w:val="0"/>
+          <w:numId w:val="9"/>
+        </w:numPr>
+      </w:pPr>
+      <w:r>
+        <w:t>Stockage en local</w:t>
+      </w:r>
+    </w:p>
+    <w:p/>
+    <w:tbl>
+      <w:tblPr>
+        <w:tblStyle w:val="TableauListe2-Accentuation3"/>
+        <w:tblW w:w="9170" w:type="dxa"/>
+        <w:tblLook w:val="04A0" w:firstRow="1" w:lastRow="0" w:firstColumn="1" w:lastColumn="0" w:noHBand="0" w:noVBand="1"/>
+      </w:tblPr>
+      <w:tblGrid>
+        <w:gridCol w:w="6307"/>
+        <w:gridCol w:w="1578"/>
+        <w:gridCol w:w="1285"/>
+      </w:tblGrid>
+      <w:tr>
+        <w:trPr>
+          <w:cnfStyle w:val="100000000000" w:firstRow="1" w:lastRow="0" w:firstColumn="0" w:lastColumn="0" w:oddVBand="0" w:evenVBand="0" w:oddHBand="0" w:evenHBand="0" w:firstRowFirstColumn="0" w:firstRowLastColumn="0" w:lastRowFirstColumn="0" w:lastRowLastColumn="0"/>
+          <w:trHeight w:val="505"/>
+        </w:trPr>
+        <w:tc>
+          <w:tcPr>
+            <w:cnfStyle w:val="001000000000" w:firstRow="0" w:lastRow="0" w:firstColumn="1" w:lastColumn="0" w:oddVBand="0" w:evenVBand="0" w:oddHBand="0" w:evenHBand="0" w:firstRowFirstColumn="0" w:firstRowLastColumn="0" w:lastRowFirstColumn="0" w:lastRowLastColumn="0"/>
+            <w:tcW w:w="6307" w:type="dxa"/>
+          </w:tcPr>
+          <w:p>
+            <w:r>
+              <w:t>Fonctionnalité</w:t>
+            </w:r>
+          </w:p>
+        </w:tc>
+        <w:tc>
+          <w:tcPr>
+            <w:tcW w:w="1578" w:type="dxa"/>
+          </w:tcPr>
+          <w:p>
+            <w:pPr>
+              <w:cnfStyle w:val="100000000000" w:firstRow="1" w:lastRow="0" w:firstColumn="0" w:lastColumn="0" w:oddVBand="0" w:evenVBand="0" w:oddHBand="0" w:evenHBand="0" w:firstRowFirstColumn="0" w:firstRowLastColumn="0" w:lastRowFirstColumn="0" w:lastRowLastColumn="0"/>
+            </w:pPr>
+            <w:r>
+              <w:t>Statuts</w:t>
+            </w:r>
+          </w:p>
+        </w:tc>
+        <w:tc>
+          <w:tcPr>
+            <w:tcW w:w="1285" w:type="dxa"/>
+          </w:tcPr>
+          <w:p>
+            <w:pPr>
+              <w:cnfStyle w:val="100000000000" w:firstRow="1" w:lastRow="0" w:firstColumn="0" w:lastColumn="0" w:oddVBand="0" w:evenVBand="0" w:oddHBand="0" w:evenHBand="0" w:firstRowFirstColumn="0" w:firstRowLastColumn="0" w:lastRowFirstColumn="0" w:lastRowLastColumn="0"/>
+            </w:pPr>
+            <w:r>
+              <w:t>Notes</w:t>
+            </w:r>
+          </w:p>
+        </w:tc>
+      </w:tr>
+      <w:tr>
+        <w:trPr>
+          <w:cnfStyle w:val="000000100000" w:firstRow="0" w:lastRow="0" w:firstColumn="0" w:lastColumn="0" w:oddVBand="0" w:evenVBand="0" w:oddHBand="1" w:evenHBand="0" w:firstRowFirstColumn="0" w:firstRowLastColumn="0" w:lastRowFirstColumn="0" w:lastRowLastColumn="0"/>
+          <w:trHeight w:val="505"/>
+        </w:trPr>
+        <w:tc>
+          <w:tcPr>
+            <w:cnfStyle w:val="001000000000" w:firstRow="0" w:lastRow="0" w:firstColumn="1" w:lastColumn="0" w:oddVBand="0" w:evenVBand="0" w:oddHBand="0" w:evenHBand="0" w:firstRowFirstColumn="0" w:firstRowLastColumn="0" w:lastRowFirstColumn="0" w:lastRowLastColumn="0"/>
+            <w:tcW w:w="6307" w:type="dxa"/>
+          </w:tcPr>
+          <w:p>
+            <w:pPr>
+              <w:rPr>
+                <w:b w:val="0"/>
+              </w:rPr>
+            </w:pPr>
+            <w:r>
+              <w:rPr>
+                <w:b w:val="0"/>
+              </w:rPr>
+              <w:t>Création de dossier sur le disque local</w:t>
+            </w:r>
+          </w:p>
+        </w:tc>
+        <w:tc>
+          <w:tcPr>
+            <w:tcW w:w="1578" w:type="dxa"/>
+          </w:tcPr>
+          <w:p>
+            <w:pPr>
+              <w:cnfStyle w:val="000000100000" w:firstRow="0" w:lastRow="0" w:firstColumn="0" w:lastColumn="0" w:oddVBand="0" w:evenVBand="0" w:oddHBand="1" w:evenHBand="0" w:firstRowFirstColumn="0" w:firstRowLastColumn="0" w:lastRowFirstColumn="0" w:lastRowLastColumn="0"/>
+            </w:pPr>
+            <w:r>
+              <w:t>En cours</w:t>
+            </w:r>
+          </w:p>
+        </w:tc>
+        <w:tc>
+          <w:tcPr>
+            <w:tcW w:w="1285" w:type="dxa"/>
+          </w:tcPr>
+          <w:p>
+            <w:pPr>
+              <w:cnfStyle w:val="000000100000" w:firstRow="0" w:lastRow="0" w:firstColumn="0" w:lastColumn="0" w:oddVBand="0" w:evenVBand="0" w:oddHBand="1" w:evenHBand="0" w:firstRowFirstColumn="0" w:firstRowLastColumn="0" w:lastRowFirstColumn="0" w:lastRowLastColumn="0"/>
+            </w:pPr>
+          </w:p>
+        </w:tc>
+      </w:tr>
+      <w:tr>
+        <w:trPr>
+          <w:trHeight w:val="505"/>
+        </w:trPr>
+        <w:tc>
+          <w:tcPr>
+            <w:cnfStyle w:val="001000000000" w:firstRow="0" w:lastRow="0" w:firstColumn="1" w:lastColumn="0" w:oddVBand="0" w:evenVBand="0" w:oddHBand="0" w:evenHBand="0" w:firstRowFirstColumn="0" w:firstRowLastColumn="0" w:lastRowFirstColumn="0" w:lastRowLastColumn="0"/>
+            <w:tcW w:w="6307" w:type="dxa"/>
+          </w:tcPr>
+          <w:p>
+            <w:pPr>
+              <w:rPr>
+                <w:b w:val="0"/>
+              </w:rPr>
+            </w:pPr>
+            <w:r>
+              <w:rPr>
+                <w:b w:val="0"/>
+              </w:rPr>
+              <w:t>Voir tous les détails du dossiers créé</w:t>
+            </w:r>
+          </w:p>
+        </w:tc>
+        <w:tc>
+          <w:tcPr>
+            <w:tcW w:w="1578" w:type="dxa"/>
+          </w:tcPr>
+          <w:p>
+            <w:pPr>
+              <w:cnfStyle w:val="000000000000" w:firstRow="0" w:lastRow="0" w:firstColumn="0" w:lastColumn="0" w:oddVBand="0" w:evenVBand="0" w:oddHBand="0" w:evenHBand="0" w:firstRowFirstColumn="0" w:firstRowLastColumn="0" w:lastRowFirstColumn="0" w:lastRowLastColumn="0"/>
+            </w:pPr>
+            <w:r>
+              <w:t>En cours</w:t>
+            </w:r>
+          </w:p>
+        </w:tc>
+        <w:tc>
+          <w:tcPr>
+            <w:tcW w:w="1285" w:type="dxa"/>
+          </w:tcPr>
+          <w:p>
+            <w:pPr>
+              <w:cnfStyle w:val="000000000000" w:firstRow="0" w:lastRow="0" w:firstColumn="0" w:lastColumn="0" w:oddVBand="0" w:evenVBand="0" w:oddHBand="0" w:evenHBand="0" w:firstRowFirstColumn="0" w:firstRowLastColumn="0" w:lastRowFirstColumn="0" w:lastRowLastColumn="0"/>
+            </w:pPr>
+          </w:p>
+        </w:tc>
+      </w:tr>
+      <w:tr>
+        <w:trPr>
+          <w:cnfStyle w:val="000000100000" w:firstRow="0" w:lastRow="0" w:firstColumn="0" w:lastColumn="0" w:oddVBand="0" w:evenVBand="0" w:oddHBand="1" w:evenHBand="0" w:firstRowFirstColumn="0" w:firstRowLastColumn="0" w:lastRowFirstColumn="0" w:lastRowLastColumn="0"/>
+          <w:trHeight w:val="505"/>
+        </w:trPr>
+        <w:tc>
+          <w:tcPr>
+            <w:cnfStyle w:val="001000000000" w:firstRow="0" w:lastRow="0" w:firstColumn="1" w:lastColumn="0" w:oddVBand="0" w:evenVBand="0" w:oddHBand="0" w:evenHBand="0" w:firstRowFirstColumn="0" w:firstRowLastColumn="0" w:lastRowFirstColumn="0" w:lastRowLastColumn="0"/>
+            <w:tcW w:w="6307" w:type="dxa"/>
+          </w:tcPr>
+          <w:p>
+            <w:pPr>
+              <w:rPr>
+                <w:b w:val="0"/>
+              </w:rPr>
+            </w:pPr>
+            <w:r>
+              <w:rPr>
+                <w:b w:val="0"/>
+              </w:rPr>
+              <w:t>Modifier le nom du dossier</w:t>
+            </w:r>
+          </w:p>
+        </w:tc>
+        <w:tc>
+          <w:tcPr>
+            <w:tcW w:w="1578" w:type="dxa"/>
+          </w:tcPr>
+          <w:p>
+            <w:pPr>
+              <w:cnfStyle w:val="000000100000" w:firstRow="0" w:lastRow="0" w:firstColumn="0" w:lastColumn="0" w:oddVBand="0" w:evenVBand="0" w:oddHBand="1" w:evenHBand="0" w:firstRowFirstColumn="0" w:firstRowLastColumn="0" w:lastRowFirstColumn="0" w:lastRowLastColumn="0"/>
+            </w:pPr>
+            <w:r>
+              <w:t>En cours</w:t>
+            </w:r>
+          </w:p>
+        </w:tc>
+        <w:tc>
+          <w:tcPr>
+            <w:tcW w:w="1285" w:type="dxa"/>
+          </w:tcPr>
+          <w:p>
+            <w:pPr>
+              <w:cnfStyle w:val="000000100000" w:firstRow="0" w:lastRow="0" w:firstColumn="0" w:lastColumn="0" w:oddVBand="0" w:evenVBand="0" w:oddHBand="1" w:evenHBand="0" w:firstRowFirstColumn="0" w:firstRowLastColumn="0" w:lastRowFirstColumn="0" w:lastRowLastColumn="0"/>
+            </w:pPr>
+          </w:p>
+        </w:tc>
+      </w:tr>
+      <w:tr>
+        <w:trPr>
+          <w:trHeight w:val="488"/>
+        </w:trPr>
+        <w:tc>
+          <w:tcPr>
+            <w:cnfStyle w:val="001000000000" w:firstRow="0" w:lastRow="0" w:firstColumn="1" w:lastColumn="0" w:oddVBand="0" w:evenVBand="0" w:oddHBand="0" w:evenHBand="0" w:firstRowFirstColumn="0" w:firstRowLastColumn="0" w:lastRowFirstColumn="0" w:lastRowLastColumn="0"/>
+            <w:tcW w:w="6307" w:type="dxa"/>
+          </w:tcPr>
+          <w:p>
+            <w:pPr>
+              <w:rPr>
+                <w:b w:val="0"/>
+              </w:rPr>
+            </w:pPr>
+            <w:r>
+              <w:rPr>
+                <w:b w:val="0"/>
+              </w:rPr>
+              <w:lastRenderedPageBreak/>
+              <w:t>Voir l’intérieur du dossier créé</w:t>
+            </w:r>
+          </w:p>
+        </w:tc>
+        <w:tc>
+          <w:tcPr>
+            <w:tcW w:w="1578" w:type="dxa"/>
+          </w:tcPr>
+          <w:p>
+            <w:pPr>
+              <w:cnfStyle w:val="000000000000" w:firstRow="0" w:lastRow="0" w:firstColumn="0" w:lastColumn="0" w:oddVBand="0" w:evenVBand="0" w:oddHBand="0" w:evenHBand="0" w:firstRowFirstColumn="0" w:firstRowLastColumn="0" w:lastRowFirstColumn="0" w:lastRowLastColumn="0"/>
+            </w:pPr>
+            <w:r>
+              <w:t>En cours</w:t>
+            </w:r>
+          </w:p>
+        </w:tc>
+        <w:tc>
+          <w:tcPr>
+            <w:tcW w:w="1285" w:type="dxa"/>
+          </w:tcPr>
+          <w:p>
+            <w:pPr>
+              <w:cnfStyle w:val="000000000000" w:firstRow="0" w:lastRow="0" w:firstColumn="0" w:lastColumn="0" w:oddVBand="0" w:evenVBand="0" w:oddHBand="0" w:evenHBand="0" w:firstRowFirstColumn="0" w:firstRowLastColumn="0" w:lastRowFirstColumn="0" w:lastRowLastColumn="0"/>
+            </w:pPr>
+          </w:p>
+        </w:tc>
+      </w:tr>
+      <w:tr>
+        <w:trPr>
+          <w:cnfStyle w:val="000000100000" w:firstRow="0" w:lastRow="0" w:firstColumn="0" w:lastColumn="0" w:oddVBand="0" w:evenVBand="0" w:oddHBand="1" w:evenHBand="0" w:firstRowFirstColumn="0" w:firstRowLastColumn="0" w:lastRowFirstColumn="0" w:lastRowLastColumn="0"/>
+          <w:trHeight w:val="505"/>
+        </w:trPr>
+        <w:tc>
+          <w:tcPr>
+            <w:cnfStyle w:val="001000000000" w:firstRow="0" w:lastRow="0" w:firstColumn="1" w:lastColumn="0" w:oddVBand="0" w:evenVBand="0" w:oddHBand="0" w:evenHBand="0" w:firstRowFirstColumn="0" w:firstRowLastColumn="0" w:lastRowFirstColumn="0" w:lastRowLastColumn="0"/>
+            <w:tcW w:w="6307" w:type="dxa"/>
+          </w:tcPr>
+          <w:p>
+            <w:pPr>
+              <w:rPr>
+                <w:b w:val="0"/>
+              </w:rPr>
+            </w:pPr>
+            <w:r>
+              <w:rPr>
+                <w:b w:val="0"/>
+              </w:rPr>
+              <w:t xml:space="preserve">Suppression </w:t>
+            </w:r>
+            <w:r>
+              <w:rPr>
+                <w:b w:val="0"/>
+              </w:rPr>
+              <w:t>du dossier créé</w:t>
+            </w:r>
+          </w:p>
+        </w:tc>
+        <w:tc>
+          <w:tcPr>
+            <w:tcW w:w="1578" w:type="dxa"/>
+          </w:tcPr>
+          <w:p>
+            <w:pPr>
+              <w:cnfStyle w:val="000000100000" w:firstRow="0" w:lastRow="0" w:firstColumn="0" w:lastColumn="0" w:oddVBand="0" w:evenVBand="0" w:oddHBand="1" w:evenHBand="0" w:firstRowFirstColumn="0" w:firstRowLastColumn="0" w:lastRowFirstColumn="0" w:lastRowLastColumn="0"/>
+            </w:pPr>
+            <w:r>
+              <w:t>En cours</w:t>
+            </w:r>
+          </w:p>
+        </w:tc>
+        <w:tc>
+          <w:tcPr>
+            <w:tcW w:w="1285" w:type="dxa"/>
+          </w:tcPr>
+          <w:p>
+            <w:pPr>
+              <w:cnfStyle w:val="000000100000" w:firstRow="0" w:lastRow="0" w:firstColumn="0" w:lastColumn="0" w:oddVBand="0" w:evenVBand="0" w:oddHBand="1" w:evenHBand="0" w:firstRowFirstColumn="0" w:firstRowLastColumn="0" w:lastRowFirstColumn="0" w:lastRowLastColumn="0"/>
+            </w:pPr>
+          </w:p>
+        </w:tc>
+      </w:tr>
+    </w:tbl>
+    <w:p/>
+    <w:p>
+      <w:pPr>
+        <w:pStyle w:val="Titre3"/>
+        <w:numPr>
+          <w:ilvl w:val="0"/>
+          <w:numId w:val="9"/>
+        </w:numPr>
+      </w:pPr>
+      <w:r>
+        <w:t>Stockage en ligne</w:t>
+      </w:r>
+    </w:p>
+    <w:p/>
+    <w:tbl>
+      <w:tblPr>
+        <w:tblStyle w:val="TableauListe2-Accentuation3"/>
+        <w:tblW w:w="9170" w:type="dxa"/>
+        <w:tblLook w:val="04A0" w:firstRow="1" w:lastRow="0" w:firstColumn="1" w:lastColumn="0" w:noHBand="0" w:noVBand="1"/>
+      </w:tblPr>
+      <w:tblGrid>
+        <w:gridCol w:w="6307"/>
+        <w:gridCol w:w="1578"/>
+        <w:gridCol w:w="1285"/>
+      </w:tblGrid>
+      <w:tr>
+        <w:trPr>
+          <w:cnfStyle w:val="100000000000" w:firstRow="1" w:lastRow="0" w:firstColumn="0" w:lastColumn="0" w:oddVBand="0" w:evenVBand="0" w:oddHBand="0" w:evenHBand="0" w:firstRowFirstColumn="0" w:firstRowLastColumn="0" w:lastRowFirstColumn="0" w:lastRowLastColumn="0"/>
+          <w:trHeight w:val="505"/>
+        </w:trPr>
+        <w:tc>
+          <w:tcPr>
+            <w:cnfStyle w:val="001000000000" w:firstRow="0" w:lastRow="0" w:firstColumn="1" w:lastColumn="0" w:oddVBand="0" w:evenVBand="0" w:oddHBand="0" w:evenHBand="0" w:firstRowFirstColumn="0" w:firstRowLastColumn="0" w:lastRowFirstColumn="0" w:lastRowLastColumn="0"/>
+            <w:tcW w:w="6307" w:type="dxa"/>
+          </w:tcPr>
+          <w:p>
+            <w:r>
+              <w:t>Fonctionnalité</w:t>
+            </w:r>
+          </w:p>
+        </w:tc>
+        <w:tc>
+          <w:tcPr>
+            <w:tcW w:w="1578" w:type="dxa"/>
+          </w:tcPr>
+          <w:p>
+            <w:pPr>
+              <w:cnfStyle w:val="100000000000" w:firstRow="1" w:lastRow="0" w:firstColumn="0" w:lastColumn="0" w:oddVBand="0" w:evenVBand="0" w:oddHBand="0" w:evenHBand="0" w:firstRowFirstColumn="0" w:firstRowLastColumn="0" w:lastRowFirstColumn="0" w:lastRowLastColumn="0"/>
+            </w:pPr>
+            <w:r>
+              <w:t>Statuts</w:t>
+            </w:r>
+          </w:p>
+        </w:tc>
+        <w:tc>
+          <w:tcPr>
+            <w:tcW w:w="1285" w:type="dxa"/>
+          </w:tcPr>
+          <w:p>
+            <w:pPr>
+              <w:cnfStyle w:val="100000000000" w:firstRow="1" w:lastRow="0" w:firstColumn="0" w:lastColumn="0" w:oddVBand="0" w:evenVBand="0" w:oddHBand="0" w:evenHBand="0" w:firstRowFirstColumn="0" w:firstRowLastColumn="0" w:lastRowFirstColumn="0" w:lastRowLastColumn="0"/>
+            </w:pPr>
+            <w:r>
+              <w:t>Notes</w:t>
+            </w:r>
+          </w:p>
+        </w:tc>
+      </w:tr>
+      <w:tr>
+        <w:trPr>
+          <w:cnfStyle w:val="000000100000" w:firstRow="0" w:lastRow="0" w:firstColumn="0" w:lastColumn="0" w:oddVBand="0" w:evenVBand="0" w:oddHBand="1" w:evenHBand="0" w:firstRowFirstColumn="0" w:firstRowLastColumn="0" w:lastRowFirstColumn="0" w:lastRowLastColumn="0"/>
+          <w:trHeight w:val="505"/>
+        </w:trPr>
+        <w:tc>
+          <w:tcPr>
+            <w:cnfStyle w:val="001000000000" w:firstRow="0" w:lastRow="0" w:firstColumn="1" w:lastColumn="0" w:oddVBand="0" w:evenVBand="0" w:oddHBand="0" w:evenHBand="0" w:firstRowFirstColumn="0" w:firstRowLastColumn="0" w:lastRowFirstColumn="0" w:lastRowLastColumn="0"/>
+            <w:tcW w:w="6307" w:type="dxa"/>
+          </w:tcPr>
+          <w:p>
+            <w:pPr>
+              <w:rPr>
+                <w:b w:val="0"/>
+              </w:rPr>
+            </w:pPr>
+            <w:r>
+              <w:rPr>
+                <w:b w:val="0"/>
+              </w:rPr>
+              <w:t xml:space="preserve">Création </w:t>
+            </w:r>
+            <w:r>
+              <w:rPr>
+                <w:b w:val="0"/>
+              </w:rPr>
+              <w:t>du dossier dans le cloud</w:t>
+            </w:r>
+          </w:p>
+        </w:tc>
+        <w:tc>
+          <w:tcPr>
+            <w:tcW w:w="1578" w:type="dxa"/>
+          </w:tcPr>
+          <w:p>
+            <w:pPr>
+              <w:cnfStyle w:val="000000100000" w:firstRow="0" w:lastRow="0" w:firstColumn="0" w:lastColumn="0" w:oddVBand="0" w:evenVBand="0" w:oddHBand="1" w:evenHBand="0" w:firstRowFirstColumn="0" w:firstRowLastColumn="0" w:lastRowFirstColumn="0" w:lastRowLastColumn="0"/>
+            </w:pPr>
+            <w:r>
+              <w:t>En cours</w:t>
+            </w:r>
+          </w:p>
+        </w:tc>
+        <w:tc>
+          <w:tcPr>
+            <w:tcW w:w="1285" w:type="dxa"/>
+          </w:tcPr>
+          <w:p>
+            <w:pPr>
+              <w:cnfStyle w:val="000000100000" w:firstRow="0" w:lastRow="0" w:firstColumn="0" w:lastColumn="0" w:oddVBand="0" w:evenVBand="0" w:oddHBand="1" w:evenHBand="0" w:firstRowFirstColumn="0" w:firstRowLastColumn="0" w:lastRowFirstColumn="0" w:lastRowLastColumn="0"/>
+            </w:pPr>
+          </w:p>
+        </w:tc>
+      </w:tr>
+      <w:tr>
+        <w:trPr>
+          <w:trHeight w:val="505"/>
+        </w:trPr>
+        <w:tc>
+          <w:tcPr>
+            <w:cnfStyle w:val="001000000000" w:firstRow="0" w:lastRow="0" w:firstColumn="1" w:lastColumn="0" w:oddVBand="0" w:evenVBand="0" w:oddHBand="0" w:evenHBand="0" w:firstRowFirstColumn="0" w:firstRowLastColumn="0" w:lastRowFirstColumn="0" w:lastRowLastColumn="0"/>
+            <w:tcW w:w="6307" w:type="dxa"/>
+          </w:tcPr>
+          <w:p>
+            <w:pPr>
+              <w:rPr>
+                <w:b w:val="0"/>
+              </w:rPr>
+            </w:pPr>
+            <w:r>
+              <w:rPr>
+                <w:b w:val="0"/>
+              </w:rPr>
+              <w:t>Voir tous les détails du dossiers créé</w:t>
+            </w:r>
+            <w:r>
+              <w:rPr>
+                <w:b w:val="0"/>
+              </w:rPr>
+              <w:t xml:space="preserve"> dans le cloud</w:t>
+            </w:r>
+          </w:p>
+        </w:tc>
+        <w:tc>
+          <w:tcPr>
+            <w:tcW w:w="1578" w:type="dxa"/>
+          </w:tcPr>
+          <w:p>
+            <w:pPr>
+              <w:cnfStyle w:val="000000000000" w:firstRow="0" w:lastRow="0" w:firstColumn="0" w:lastColumn="0" w:oddVBand="0" w:evenVBand="0" w:oddHBand="0" w:evenHBand="0" w:firstRowFirstColumn="0" w:firstRowLastColumn="0" w:lastRowFirstColumn="0" w:lastRowLastColumn="0"/>
+            </w:pPr>
+            <w:r>
+              <w:t>En cours</w:t>
+            </w:r>
+          </w:p>
+        </w:tc>
+        <w:tc>
+          <w:tcPr>
+            <w:tcW w:w="1285" w:type="dxa"/>
+          </w:tcPr>
+          <w:p>
+            <w:pPr>
+              <w:cnfStyle w:val="000000000000" w:firstRow="0" w:lastRow="0" w:firstColumn="0" w:lastColumn="0" w:oddVBand="0" w:evenVBand="0" w:oddHBand="0" w:evenHBand="0" w:firstRowFirstColumn="0" w:firstRowLastColumn="0" w:lastRowFirstColumn="0" w:lastRowLastColumn="0"/>
+            </w:pPr>
+          </w:p>
+        </w:tc>
+      </w:tr>
+      <w:tr>
+        <w:trPr>
+          <w:cnfStyle w:val="000000100000" w:firstRow="0" w:lastRow="0" w:firstColumn="0" w:lastColumn="0" w:oddVBand="0" w:evenVBand="0" w:oddHBand="1" w:evenHBand="0" w:firstRowFirstColumn="0" w:firstRowLastColumn="0" w:lastRowFirstColumn="0" w:lastRowLastColumn="0"/>
+          <w:trHeight w:val="505"/>
+        </w:trPr>
+        <w:tc>
+          <w:tcPr>
+            <w:cnfStyle w:val="001000000000" w:firstRow="0" w:lastRow="0" w:firstColumn="1" w:lastColumn="0" w:oddVBand="0" w:evenVBand="0" w:oddHBand="0" w:evenHBand="0" w:firstRowFirstColumn="0" w:firstRowLastColumn="0" w:lastRowFirstColumn="0" w:lastRowLastColumn="0"/>
+            <w:tcW w:w="6307" w:type="dxa"/>
+          </w:tcPr>
+          <w:p>
+            <w:pPr>
+              <w:rPr>
+                <w:b w:val="0"/>
+              </w:rPr>
+            </w:pPr>
+            <w:r>
+              <w:rPr>
+                <w:b w:val="0"/>
+              </w:rPr>
+              <w:t>Modifier le nom du dossier</w:t>
+            </w:r>
+            <w:r>
+              <w:rPr>
+                <w:b w:val="0"/>
+              </w:rPr>
+              <w:t xml:space="preserve"> dans le cloud</w:t>
+            </w:r>
+          </w:p>
+        </w:tc>
+        <w:tc>
+          <w:tcPr>
+            <w:tcW w:w="1578" w:type="dxa"/>
+          </w:tcPr>
+          <w:p>
+            <w:pPr>
+              <w:cnfStyle w:val="000000100000" w:firstRow="0" w:lastRow="0" w:firstColumn="0" w:lastColumn="0" w:oddVBand="0" w:evenVBand="0" w:oddHBand="1" w:evenHBand="0" w:firstRowFirstColumn="0" w:firstRowLastColumn="0" w:lastRowFirstColumn="0" w:lastRowLastColumn="0"/>
+            </w:pPr>
+            <w:r>
+              <w:t>En cours</w:t>
+            </w:r>
+          </w:p>
+        </w:tc>
+        <w:tc>
+          <w:tcPr>
+            <w:tcW w:w="1285" w:type="dxa"/>
+          </w:tcPr>
+          <w:p>
+            <w:pPr>
+              <w:cnfStyle w:val="000000100000" w:firstRow="0" w:lastRow="0" w:firstColumn="0" w:lastColumn="0" w:oddVBand="0" w:evenVBand="0" w:oddHBand="1" w:evenHBand="0" w:firstRowFirstColumn="0" w:firstRowLastColumn="0" w:lastRowFirstColumn="0" w:lastRowLastColumn="0"/>
+            </w:pPr>
+          </w:p>
+        </w:tc>
+      </w:tr>
+      <w:tr>
+        <w:trPr>
+          <w:trHeight w:val="488"/>
+        </w:trPr>
+        <w:tc>
+          <w:tcPr>
+            <w:cnfStyle w:val="001000000000" w:firstRow="0" w:lastRow="0" w:firstColumn="1" w:lastColumn="0" w:oddVBand="0" w:evenVBand="0" w:oddHBand="0" w:evenHBand="0" w:firstRowFirstColumn="0" w:firstRowLastColumn="0" w:lastRowFirstColumn="0" w:lastRowLastColumn="0"/>
+            <w:tcW w:w="6307" w:type="dxa"/>
+          </w:tcPr>
+          <w:p>
+            <w:pPr>
+              <w:rPr>
+                <w:b w:val="0"/>
+              </w:rPr>
+            </w:pPr>
+            <w:r>
+              <w:rPr>
+                <w:b w:val="0"/>
+              </w:rPr>
+              <w:t>Voir l’intérieur du dossier créé</w:t>
+            </w:r>
+            <w:r>
+              <w:rPr>
+                <w:b w:val="0"/>
+              </w:rPr>
+              <w:t xml:space="preserve"> dans le cloud</w:t>
+            </w:r>
+          </w:p>
+        </w:tc>
+        <w:tc>
+          <w:tcPr>
+            <w:tcW w:w="1578" w:type="dxa"/>
+          </w:tcPr>
+          <w:p>
+            <w:pPr>
+              <w:cnfStyle w:val="000000000000" w:firstRow="0" w:lastRow="0" w:firstColumn="0" w:lastColumn="0" w:oddVBand="0" w:evenVBand="0" w:oddHBand="0" w:evenHBand="0" w:firstRowFirstColumn="0" w:firstRowLastColumn="0" w:lastRowFirstColumn="0" w:lastRowLastColumn="0"/>
+            </w:pPr>
+            <w:r>
+              <w:t>En cours</w:t>
+            </w:r>
+          </w:p>
+        </w:tc>
+        <w:tc>
+          <w:tcPr>
+            <w:tcW w:w="1285" w:type="dxa"/>
+          </w:tcPr>
+          <w:p>
+            <w:pPr>
+              <w:cnfStyle w:val="000000000000" w:firstRow="0" w:lastRow="0" w:firstColumn="0" w:lastColumn="0" w:oddVBand="0" w:evenVBand="0" w:oddHBand="0" w:evenHBand="0" w:firstRowFirstColumn="0" w:firstRowLastColumn="0" w:lastRowFirstColumn="0" w:lastRowLastColumn="0"/>
+            </w:pPr>
+          </w:p>
+        </w:tc>
+      </w:tr>
+      <w:tr>
+        <w:trPr>
+          <w:cnfStyle w:val="000000100000" w:firstRow="0" w:lastRow="0" w:firstColumn="0" w:lastColumn="0" w:oddVBand="0" w:evenVBand="0" w:oddHBand="1" w:evenHBand="0" w:firstRowFirstColumn="0" w:firstRowLastColumn="0" w:lastRowFirstColumn="0" w:lastRowLastColumn="0"/>
+          <w:trHeight w:val="505"/>
+        </w:trPr>
+        <w:tc>
+          <w:tcPr>
+            <w:cnfStyle w:val="001000000000" w:firstRow="0" w:lastRow="0" w:firstColumn="1" w:lastColumn="0" w:oddVBand="0" w:evenVBand="0" w:oddHBand="0" w:evenHBand="0" w:firstRowFirstColumn="0" w:firstRowLastColumn="0" w:lastRowFirstColumn="0" w:lastRowLastColumn="0"/>
+            <w:tcW w:w="6307" w:type="dxa"/>
+          </w:tcPr>
+          <w:p>
+            <w:pPr>
+              <w:rPr>
+                <w:b w:val="0"/>
+              </w:rPr>
+            </w:pPr>
+            <w:r>
+              <w:rPr>
+                <w:b w:val="0"/>
+              </w:rPr>
+              <w:t xml:space="preserve">Suppression </w:t>
+            </w:r>
+            <w:r>
+              <w:rPr>
+                <w:b w:val="0"/>
+              </w:rPr>
+              <w:t>du dossier créé</w:t>
+            </w:r>
+            <w:r>
+              <w:rPr>
+                <w:b w:val="0"/>
+              </w:rPr>
+              <w:t xml:space="preserve"> dans le cloud</w:t>
+            </w:r>
+          </w:p>
+        </w:tc>
+        <w:tc>
+          <w:tcPr>
+            <w:tcW w:w="1578" w:type="dxa"/>
+          </w:tcPr>
+          <w:p>
+            <w:pPr>
+              <w:cnfStyle w:val="000000100000" w:firstRow="0" w:lastRow="0" w:firstColumn="0" w:lastColumn="0" w:oddVBand="0" w:evenVBand="0" w:oddHBand="1" w:evenHBand="0" w:firstRowFirstColumn="0" w:firstRowLastColumn="0" w:lastRowFirstColumn="0" w:lastRowLastColumn="0"/>
+            </w:pPr>
+            <w:r>
+              <w:t>En cours</w:t>
+            </w:r>
+          </w:p>
+        </w:tc>
+        <w:tc>
+          <w:tcPr>
+            <w:tcW w:w="1285" w:type="dxa"/>
+          </w:tcPr>
+          <w:p>
+            <w:pPr>
+              <w:cnfStyle w:val="000000100000" w:firstRow="0" w:lastRow="0" w:firstColumn="0" w:lastColumn="0" w:oddVBand="0" w:evenVBand="0" w:oddHBand="1" w:evenHBand="0" w:firstRowFirstColumn="0" w:firstRowLastColumn="0" w:lastRowFirstColumn="0" w:lastRowLastColumn="0"/>
+            </w:pPr>
+          </w:p>
+        </w:tc>
+      </w:tr>
+    </w:tbl>
+    <w:p/>
+    <w:p>
+      <w:pPr>
+        <w:pStyle w:val="Titre3"/>
+        <w:numPr>
+          <w:ilvl w:val="0"/>
+          <w:numId w:val="9"/>
+        </w:numPr>
+      </w:pPr>
+      <w:r>
+        <w:t>Relation entre local et Backend</w:t>
+      </w:r>
+    </w:p>
+    <w:p/>
+    <w:tbl>
+      <w:tblPr>
+        <w:tblStyle w:val="TableauListe2-Accentuation3"/>
+        <w:tblW w:w="9170" w:type="dxa"/>
+        <w:tblLook w:val="04A0" w:firstRow="1" w:lastRow="0" w:firstColumn="1" w:lastColumn="0" w:noHBand="0" w:noVBand="1"/>
+      </w:tblPr>
+      <w:tblGrid>
+        <w:gridCol w:w="6307"/>
+        <w:gridCol w:w="1578"/>
+        <w:gridCol w:w="1285"/>
+      </w:tblGrid>
+      <w:tr>
+        <w:trPr>
+          <w:cnfStyle w:val="100000000000" w:firstRow="1" w:lastRow="0" w:firstColumn="0" w:lastColumn="0" w:oddVBand="0" w:evenVBand="0" w:oddHBand="0" w:evenHBand="0" w:firstRowFirstColumn="0" w:firstRowLastColumn="0" w:lastRowFirstColumn="0" w:lastRowLastColumn="0"/>
+          <w:trHeight w:val="505"/>
+        </w:trPr>
+        <w:tc>
+          <w:tcPr>
+            <w:cnfStyle w:val="001000000000" w:firstRow="0" w:lastRow="0" w:firstColumn="1" w:lastColumn="0" w:oddVBand="0" w:evenVBand="0" w:oddHBand="0" w:evenHBand="0" w:firstRowFirstColumn="0" w:firstRowLastColumn="0" w:lastRowFirstColumn="0" w:lastRowLastColumn="0"/>
+            <w:tcW w:w="6307" w:type="dxa"/>
+          </w:tcPr>
+          <w:p>
+            <w:r>
+              <w:t>Fonctionnalité</w:t>
+            </w:r>
+          </w:p>
+        </w:tc>
+        <w:tc>
+          <w:tcPr>
+            <w:tcW w:w="1578" w:type="dxa"/>
+          </w:tcPr>
+          <w:p>
+            <w:pPr>
+              <w:cnfStyle w:val="100000000000" w:firstRow="1" w:lastRow="0" w:firstColumn="0" w:lastColumn="0" w:oddVBand="0" w:evenVBand="0" w:oddHBand="0" w:evenHBand="0" w:firstRowFirstColumn="0" w:firstRowLastColumn="0" w:lastRowFirstColumn="0" w:lastRowLastColumn="0"/>
+            </w:pPr>
+            <w:r>
+              <w:t>Statuts</w:t>
+            </w:r>
+          </w:p>
+        </w:tc>
+        <w:tc>
+          <w:tcPr>
+            <w:tcW w:w="1285" w:type="dxa"/>
+          </w:tcPr>
+          <w:p>
+            <w:pPr>
+              <w:cnfStyle w:val="100000000000" w:firstRow="1" w:lastRow="0" w:firstColumn="0" w:lastColumn="0" w:oddVBand="0" w:evenVBand="0" w:oddHBand="0" w:evenHBand="0" w:firstRowFirstColumn="0" w:firstRowLastColumn="0" w:lastRowFirstColumn="0" w:lastRowLastColumn="0"/>
+            </w:pPr>
+            <w:r>
+              <w:t>Notes</w:t>
+            </w:r>
+          </w:p>
+        </w:tc>
+      </w:tr>
+      <w:tr>
+        <w:trPr>
+          <w:cnfStyle w:val="000000100000" w:firstRow="0" w:lastRow="0" w:firstColumn="0" w:lastColumn="0" w:oddVBand="0" w:evenVBand="0" w:oddHBand="1" w:evenHBand="0" w:firstRowFirstColumn="0" w:firstRowLastColumn="0" w:lastRowFirstColumn="0" w:lastRowLastColumn="0"/>
+          <w:trHeight w:val="505"/>
+        </w:trPr>
+        <w:tc>
+          <w:tcPr>
+            <w:cnfStyle w:val="001000000000" w:firstRow="0" w:lastRow="0" w:firstColumn="1" w:lastColumn="0" w:oddVBand="0" w:evenVBand="0" w:oddHBand="0" w:evenHBand="0" w:firstRowFirstColumn="0" w:firstRowLastColumn="0" w:lastRowFirstColumn="0" w:lastRowLastColumn="0"/>
+            <w:tcW w:w="6307" w:type="dxa"/>
+          </w:tcPr>
+          <w:p>
+            <w:pPr>
+              <w:rPr>
+                <w:b w:val="0"/>
+              </w:rPr>
+            </w:pPr>
+          </w:p>
+        </w:tc>
+        <w:tc>
+          <w:tcPr>
+            <w:tcW w:w="1578" w:type="dxa"/>
+          </w:tcPr>
+          <w:p>
+            <w:pPr>
+              <w:cnfStyle w:val="000000100000" w:firstRow="0" w:lastRow="0" w:firstColumn="0" w:lastColumn="0" w:oddVBand="0" w:evenVBand="0" w:oddHBand="1" w:evenHBand="0" w:firstRowFirstColumn="0" w:firstRowLastColumn="0" w:lastRowFirstColumn="0" w:lastRowLastColumn="0"/>
+            </w:pPr>
+            <w:r>
+              <w:t>En cours</w:t>
+            </w:r>
+          </w:p>
+        </w:tc>
+        <w:tc>
+          <w:tcPr>
+            <w:tcW w:w="1285" w:type="dxa"/>
+          </w:tcPr>
+          <w:p>
+            <w:pPr>
+              <w:cnfStyle w:val="000000100000" w:firstRow="0" w:lastRow="0" w:firstColumn="0" w:lastColumn="0" w:oddVBand="0" w:evenVBand="0" w:oddHBand="1" w:evenHBand="0" w:firstRowFirstColumn="0" w:firstRowLastColumn="0" w:lastRowFirstColumn="0" w:lastRowLastColumn="0"/>
+            </w:pPr>
+          </w:p>
+        </w:tc>
+      </w:tr>
+      <w:tr>
+        <w:trPr>
+          <w:trHeight w:val="505"/>
+        </w:trPr>
+        <w:tc>
+          <w:tcPr>
+            <w:cnfStyle w:val="001000000000" w:firstRow="0" w:lastRow="0" w:firstColumn="1" w:lastColumn="0" w:oddVBand="0" w:evenVBand="0" w:oddHBand="0" w:evenHBand="0" w:firstRowFirstColumn="0" w:firstRowLastColumn="0" w:lastRowFirstColumn="0" w:lastRowLastColumn="0"/>
+            <w:tcW w:w="6307" w:type="dxa"/>
+          </w:tcPr>
+          <w:p>
+            <w:pPr>
+              <w:rPr>
+                <w:b w:val="0"/>
+              </w:rPr>
+            </w:pPr>
+            <w:r>
+              <w:rPr>
+                <w:b w:val="0"/>
+              </w:rPr>
+              <w:t>Voir tous les détails du dossiers créé dans le cloud</w:t>
+            </w:r>
+          </w:p>
+        </w:tc>
+        <w:tc>
+          <w:tcPr>
+            <w:tcW w:w="1578" w:type="dxa"/>
+          </w:tcPr>
+          <w:p>
+            <w:pPr>
+              <w:cnfStyle w:val="000000000000" w:firstRow="0" w:lastRow="0" w:firstColumn="0" w:lastColumn="0" w:oddVBand="0" w:evenVBand="0" w:oddHBand="0" w:evenHBand="0" w:firstRowFirstColumn="0" w:firstRowLastColumn="0" w:lastRowFirstColumn="0" w:lastRowLastColumn="0"/>
+            </w:pPr>
+            <w:r>
+              <w:t>Terminé</w:t>
+            </w:r>
+          </w:p>
+        </w:tc>
+        <w:tc>
+          <w:tcPr>
+            <w:tcW w:w="1285" w:type="dxa"/>
+          </w:tcPr>
+          <w:p>
+            <w:pPr>
+              <w:cnfStyle w:val="000000000000" w:firstRow="0" w:lastRow="0" w:firstColumn="0" w:lastColumn="0" w:oddVBand="0" w:evenVBand="0" w:oddHBand="0" w:evenHBand="0" w:firstRowFirstColumn="0" w:firstRowLastColumn="0" w:lastRowFirstColumn="0" w:lastRowLastColumn="0"/>
+            </w:pPr>
+          </w:p>
+        </w:tc>
+      </w:tr>
+      <w:tr>
+        <w:trPr>
+          <w:cnfStyle w:val="000000100000" w:firstRow="0" w:lastRow="0" w:firstColumn="0" w:lastColumn="0" w:oddVBand="0" w:evenVBand="0" w:oddHBand="1" w:evenHBand="0" w:firstRowFirstColumn="0" w:firstRowLastColumn="0" w:lastRowFirstColumn="0" w:lastRowLastColumn="0"/>
+          <w:trHeight w:val="505"/>
+        </w:trPr>
+        <w:tc>
+          <w:tcPr>
+            <w:cnfStyle w:val="001000000000" w:firstRow="0" w:lastRow="0" w:firstColumn="1" w:lastColumn="0" w:oddVBand="0" w:evenVBand="0" w:oddHBand="0" w:evenHBand="0" w:firstRowFirstColumn="0" w:firstRowLastColumn="0" w:lastRowFirstColumn="0" w:lastRowLastColumn="0"/>
+            <w:tcW w:w="6307" w:type="dxa"/>
+          </w:tcPr>
+          <w:p>
+            <w:pPr>
+              <w:rPr>
+                <w:b w:val="0"/>
+              </w:rPr>
+            </w:pPr>
+            <w:r>
+              <w:rPr>
+                <w:b w:val="0"/>
+              </w:rPr>
+              <w:t>Modifier le nom du dossier dans le cloud</w:t>
+            </w:r>
+          </w:p>
+        </w:tc>
+        <w:tc>
+          <w:tcPr>
+            <w:tcW w:w="1578" w:type="dxa"/>
+          </w:tcPr>
+          <w:p>
+            <w:pPr>
+              <w:cnfStyle w:val="000000100000" w:firstRow="0" w:lastRow="0" w:firstColumn="0" w:lastColumn="0" w:oddVBand="0" w:evenVBand="0" w:oddHBand="1" w:evenHBand="0" w:firstRowFirstColumn="0" w:firstRowLastColumn="0" w:lastRowFirstColumn="0" w:lastRowLastColumn="0"/>
+            </w:pPr>
+            <w:r>
+              <w:t>Terminé</w:t>
+            </w:r>
+          </w:p>
+        </w:tc>
+        <w:tc>
+          <w:tcPr>
+            <w:tcW w:w="1285" w:type="dxa"/>
+          </w:tcPr>
+          <w:p>
+            <w:pPr>
+              <w:cnfStyle w:val="000000100000" w:firstRow="0" w:lastRow="0" w:firstColumn="0" w:lastColumn="0" w:oddVBand="0" w:evenVBand="0" w:oddHBand="1" w:evenHBand="0" w:firstRowFirstColumn="0" w:firstRowLastColumn="0" w:lastRowFirstColumn="0" w:lastRowLastColumn="0"/>
+            </w:pPr>
+          </w:p>
+        </w:tc>
+      </w:tr>
+      <w:tr>
+        <w:trPr>
+          <w:trHeight w:val="488"/>
+        </w:trPr>
+        <w:tc>
+          <w:tcPr>
+            <w:cnfStyle w:val="001000000000" w:firstRow="0" w:lastRow="0" w:firstColumn="1" w:lastColumn="0" w:oddVBand="0" w:evenVBand="0" w:oddHBand="0" w:evenHBand="0" w:firstRowFirstColumn="0" w:firstRowLastColumn="0" w:lastRowFirstColumn="0" w:lastRowLastColumn="0"/>
+            <w:tcW w:w="6307" w:type="dxa"/>
+          </w:tcPr>
+          <w:p>
+            <w:pPr>
+              <w:rPr>
+                <w:b w:val="0"/>
+              </w:rPr>
+            </w:pPr>
+            <w:r>
+              <w:rPr>
+                <w:b w:val="0"/>
+              </w:rPr>
+              <w:t>Voir l’intérieur du dossier créé dans le cloud</w:t>
+            </w:r>
+          </w:p>
+        </w:tc>
+        <w:tc>
+          <w:tcPr>
+            <w:tcW w:w="1578" w:type="dxa"/>
+          </w:tcPr>
+          <w:p>
+            <w:pPr>
+              <w:cnfStyle w:val="000000000000" w:firstRow="0" w:lastRow="0" w:firstColumn="0" w:lastColumn="0" w:oddVBand="0" w:evenVBand="0" w:oddHBand="0" w:evenHBand="0" w:firstRowFirstColumn="0" w:firstRowLastColumn="0" w:lastRowFirstColumn="0" w:lastRowLastColumn="0"/>
+            </w:pPr>
+            <w:r>
+              <w:t>Terminé</w:t>
+            </w:r>
+          </w:p>
+        </w:tc>
+        <w:tc>
+          <w:tcPr>
+            <w:tcW w:w="1285" w:type="dxa"/>
+          </w:tcPr>
+          <w:p>
+            <w:pPr>
+              <w:cnfStyle w:val="000000000000" w:firstRow="0" w:lastRow="0" w:firstColumn="0" w:lastColumn="0" w:oddVBand="0" w:evenVBand="0" w:oddHBand="0" w:evenHBand="0" w:firstRowFirstColumn="0" w:firstRowLastColumn="0" w:lastRowFirstColumn="0" w:lastRowLastColumn="0"/>
+            </w:pPr>
+          </w:p>
+        </w:tc>
+      </w:tr>
+      <w:tr>
+        <w:trPr>
+          <w:cnfStyle w:val="000000100000" w:firstRow="0" w:lastRow="0" w:firstColumn="0" w:lastColumn="0" w:oddVBand="0" w:evenVBand="0" w:oddHBand="1" w:evenHBand="0" w:firstRowFirstColumn="0" w:firstRowLastColumn="0" w:lastRowFirstColumn="0" w:lastRowLastColumn="0"/>
+          <w:trHeight w:val="505"/>
+        </w:trPr>
+        <w:tc>
+          <w:tcPr>
+            <w:cnfStyle w:val="001000000000" w:firstRow="0" w:lastRow="0" w:firstColumn="1" w:lastColumn="0" w:oddVBand="0" w:evenVBand="0" w:oddHBand="0" w:evenHBand="0" w:firstRowFirstColumn="0" w:firstRowLastColumn="0" w:lastRowFirstColumn="0" w:lastRowLastColumn="0"/>
+            <w:tcW w:w="6307" w:type="dxa"/>
+          </w:tcPr>
+          <w:p>
+            <w:pPr>
+              <w:rPr>
+                <w:b w:val="0"/>
+              </w:rPr>
+            </w:pPr>
+            <w:r>
+              <w:rPr>
+                <w:b w:val="0"/>
+              </w:rPr>
+              <w:t xml:space="preserve">Suppression </w:t>
+            </w:r>
+            <w:r>
+              <w:rPr>
+                <w:b w:val="0"/>
+              </w:rPr>
+              <w:t>du dossier créé dans le cloud</w:t>
+            </w:r>
+          </w:p>
+        </w:tc>
+        <w:tc>
+          <w:tcPr>
+            <w:tcW w:w="1578" w:type="dxa"/>
+          </w:tcPr>
+          <w:p>
+            <w:pPr>
+              <w:cnfStyle w:val="000000100000" w:firstRow="0" w:lastRow="0" w:firstColumn="0" w:lastColumn="0" w:oddVBand="0" w:evenVBand="0" w:oddHBand="1" w:evenHBand="0" w:firstRowFirstColumn="0" w:firstRowLastColumn="0" w:lastRowFirstColumn="0" w:lastRowLastColumn="0"/>
+            </w:pPr>
+            <w:r>
+              <w:t>Terminé</w:t>
+            </w:r>
+          </w:p>
+        </w:tc>
+        <w:tc>
+          <w:tcPr>
+            <w:tcW w:w="1285" w:type="dxa"/>
+          </w:tcPr>
+          <w:p>
+            <w:pPr>
+              <w:cnfStyle w:val="000000100000" w:firstRow="0" w:lastRow="0" w:firstColumn="0" w:lastColumn="0" w:oddVBand="0" w:evenVBand="0" w:oddHBand="1" w:evenHBand="0" w:firstRowFirstColumn="0" w:firstRowLastColumn="0" w:lastRowFirstColumn="0" w:lastRowLastColumn="0"/>
+            </w:pPr>
+          </w:p>
+        </w:tc>
+      </w:tr>
+    </w:tbl>
+    <w:p/>
     <w:sectPr>
       <w:pgSz w:w="11906" w:h="16838"/>
       <w:pgMar w:top="1417" w:right="1417" w:bottom="1417" w:left="1417" w:header="708" w:footer="708" w:gutter="0"/>
@@ -1579,7 +2626,7 @@
 
 <file path=word/comments.xml><?xml version="1.0" encoding="utf-8"?>
 <w:comments xmlns:wpc="http://schemas.microsoft.com/office/word/2010/wordprocessingCanvas" xmlns:cx="http://schemas.microsoft.com/office/drawing/2014/chartex" xmlns:cx1="http://schemas.microsoft.com/office/drawing/2015/9/8/chartex" xmlns:mc="http://schemas.openxmlformats.org/markup-compatibility/2006" xmlns:o="urn:schemas-microsoft-com:office:office" xmlns:r="http://schemas.openxmlformats.org/officeDocument/2006/relationships" xmlns:m="http://schemas.openxmlformats.org/officeDocument/2006/math" xmlns:v="urn:schemas-microsoft-com:vml" xmlns:wp14="http://schemas.microsoft.com/office/word/2010/wordprocessingDrawing" xmlns:wp="http://schemas.openxmlformats.org/drawingml/2006/wordprocessingDrawing" xmlns:w10="urn:schemas-microsoft-com:office:word" xmlns:w="http://schemas.openxmlformats.org/wordprocessingml/2006/main" xmlns:w14="http://schemas.microsoft.com/office/word/2010/wordml" xmlns:w15="http://schemas.microsoft.com/office/word/2012/wordml" xmlns:w16se="http://schemas.microsoft.com/office/word/2015/wordml/symex" xmlns:wpg="http://schemas.microsoft.com/office/word/2010/wordprocessingGroup" xmlns:wpi="http://schemas.microsoft.com/office/word/2010/wordprocessingInk" xmlns:wne="http://schemas.microsoft.com/office/word/2006/wordml" xmlns:wps="http://schemas.microsoft.com/office/word/2010/wordprocessingShape" mc:Ignorable="w14 w15 w16se wp14">
-  <w:comment w:id="1" w:author="ADN COM" w:date="2026-09-10T10:08:00Z" w:initials="AC">
+  <w:comment w:id="0" w:author="ADN COM" w:date="2026-09-10T10:08:00Z" w:initials="AC">
     <w:p>
       <w:pPr>
         <w:pStyle w:val="Commentaire"/>
@@ -1592,6 +2639,33 @@
       </w:r>
       <w:r>
         <w:t>On va devoir réfléchir à comment établir le chiffrement.</w:t>
+      </w:r>
+    </w:p>
+  </w:comment>
+  <w:comment w:id="1" w:author="ADN COM" w:date="2026-09-22T11:32:00Z" w:initials="AC">
+    <w:p>
+      <w:pPr>
+        <w:pStyle w:val="Commentaire"/>
+      </w:pPr>
+      <w:r>
+        <w:rPr>
+          <w:rStyle w:val="Marquedecommentaire"/>
+        </w:rPr>
+        <w:annotationRef/>
+      </w:r>
+      <w:r>
+        <w:t>A faire avec ui</w:t>
+      </w:r>
+      <w:r>
+        <w:t xml:space="preserve"> et </w:t>
+      </w:r>
+      <w:r>
+        <w:t>ux</w:t>
+      </w:r>
+      <w:bookmarkStart w:id="2" w:name="_GoBack"/>
+      <w:bookmarkEnd w:id="2"/>
+      <w:r>
+        <w:t xml:space="preserve"> </w:t>
       </w:r>
     </w:p>
   </w:comment>
@@ -1601,6 +2675,7 @@
 <file path=word/commentsExtended.xml><?xml version="1.0" encoding="utf-8"?>
 <w15:commentsEx xmlns:wpc="http://schemas.microsoft.com/office/word/2010/wordprocessingCanvas" xmlns:cx="http://schemas.microsoft.com/office/drawing/2014/chartex" xmlns:cx1="http://schemas.microsoft.com/office/drawing/2015/9/8/chartex" xmlns:mc="http://schemas.openxmlformats.org/markup-compatibility/2006" xmlns:o="urn:schemas-microsoft-com:office:office" xmlns:r="http://schemas.openxmlformats.org/officeDocument/2006/relationships" xmlns:m="http://schemas.openxmlformats.org/officeDocument/2006/math" xmlns:v="urn:schemas-microsoft-com:vml" xmlns:wp14="http://schemas.microsoft.com/office/word/2010/wordprocessingDrawing" xmlns:wp="http://schemas.openxmlformats.org/drawingml/2006/wordprocessingDrawing" xmlns:w10="urn:schemas-microsoft-com:office:word" xmlns:w="http://schemas.openxmlformats.org/wordprocessingml/2006/main" xmlns:w14="http://schemas.microsoft.com/office/word/2010/wordml" xmlns:w15="http://schemas.microsoft.com/office/word/2012/wordml" xmlns:w16se="http://schemas.microsoft.com/office/word/2015/wordml/symex" xmlns:wpg="http://schemas.microsoft.com/office/word/2010/wordprocessingGroup" xmlns:wpi="http://schemas.microsoft.com/office/word/2010/wordprocessingInk" xmlns:wne="http://schemas.microsoft.com/office/word/2006/wordml" xmlns:wps="http://schemas.microsoft.com/office/word/2010/wordprocessingShape" mc:Ignorable="w14 w15 w16se wp14">
   <w15:commentEx w15:paraId="6A4F420B" w15:done="0"/>
+  <w15:commentEx w15:paraId="2ECF9451" w15:done="0"/>
 </w15:commentsEx>
 </file>
 
@@ -1613,6 +2688,92 @@
 <file path=word/numbering.xml><?xml version="1.0" encoding="utf-8"?>
 <w:numbering xmlns:wpc="http://schemas.microsoft.com/office/word/2010/wordprocessingCanvas" xmlns:cx="http://schemas.microsoft.com/office/drawing/2014/chartex" xmlns:cx1="http://schemas.microsoft.com/office/drawing/2015/9/8/chartex" xmlns:mc="http://schemas.openxmlformats.org/markup-compatibility/2006" xmlns:o="urn:schemas-microsoft-com:office:office" xmlns:r="http://schemas.openxmlformats.org/officeDocument/2006/relationships" xmlns:m="http://schemas.openxmlformats.org/officeDocument/2006/math" xmlns:v="urn:schemas-microsoft-com:vml" xmlns:wp14="http://schemas.microsoft.com/office/word/2010/wordprocessingDrawing" xmlns:wp="http://schemas.openxmlformats.org/drawingml/2006/wordprocessingDrawing" xmlns:w10="urn:schemas-microsoft-com:office:word" xmlns:w="http://schemas.openxmlformats.org/wordprocessingml/2006/main" xmlns:w14="http://schemas.microsoft.com/office/word/2010/wordml" xmlns:w15="http://schemas.microsoft.com/office/word/2012/wordml" xmlns:w16se="http://schemas.microsoft.com/office/word/2015/wordml/symex" xmlns:wpg="http://schemas.microsoft.com/office/word/2010/wordprocessingGroup" xmlns:wpi="http://schemas.microsoft.com/office/word/2010/wordprocessingInk" xmlns:wne="http://schemas.microsoft.com/office/word/2006/wordml" xmlns:wps="http://schemas.microsoft.com/office/word/2010/wordprocessingShape" mc:Ignorable="w14 w15 w16se wp14">
   <w:abstractNum w:abstractNumId="0" w15:restartNumberingAfterBreak="0">
+    <w:nsid w:val="14774E06"/>
+    <w:multiLevelType w:val="hybridMultilevel"/>
+    <w:tmpl w:val="DB2CE418"/>
+    <w:lvl w:ilvl="0" w:tplc="040C000F">
+      <w:start w:val="1"/>
+      <w:numFmt w:val="decimal"/>
+      <w:lvlText w:val="%1."/>
+      <w:lvlJc w:val="left"/>
+      <w:pPr>
+        <w:ind w:left="720" w:hanging="360"/>
+      </w:pPr>
+    </w:lvl>
+    <w:lvl w:ilvl="1" w:tplc="040C0019">
+      <w:start w:val="1"/>
+      <w:numFmt w:val="lowerLetter"/>
+      <w:lvlText w:val="%2."/>
+      <w:lvlJc w:val="left"/>
+      <w:pPr>
+        <w:ind w:left="1440" w:hanging="360"/>
+      </w:pPr>
+    </w:lvl>
+    <w:lvl w:ilvl="2" w:tplc="040C001B" w:tentative="1">
+      <w:start w:val="1"/>
+      <w:numFmt w:val="lowerRoman"/>
+      <w:lvlText w:val="%3."/>
+      <w:lvlJc w:val="right"/>
+      <w:pPr>
+        <w:ind w:left="2160" w:hanging="180"/>
+      </w:pPr>
+    </w:lvl>
+    <w:lvl w:ilvl="3" w:tplc="040C000F" w:tentative="1">
+      <w:start w:val="1"/>
+      <w:numFmt w:val="decimal"/>
+      <w:lvlText w:val="%4."/>
+      <w:lvlJc w:val="left"/>
+      <w:pPr>
+        <w:ind w:left="2880" w:hanging="360"/>
+      </w:pPr>
+    </w:lvl>
+    <w:lvl w:ilvl="4" w:tplc="040C0019" w:tentative="1">
+      <w:start w:val="1"/>
+      <w:numFmt w:val="lowerLetter"/>
+      <w:lvlText w:val="%5."/>
+      <w:lvlJc w:val="left"/>
+      <w:pPr>
+        <w:ind w:left="3600" w:hanging="360"/>
+      </w:pPr>
+    </w:lvl>
+    <w:lvl w:ilvl="5" w:tplc="040C001B" w:tentative="1">
+      <w:start w:val="1"/>
+      <w:numFmt w:val="lowerRoman"/>
+      <w:lvlText w:val="%6."/>
+      <w:lvlJc w:val="right"/>
+      <w:pPr>
+        <w:ind w:left="4320" w:hanging="180"/>
+      </w:pPr>
+    </w:lvl>
+    <w:lvl w:ilvl="6" w:tplc="040C000F" w:tentative="1">
+      <w:start w:val="1"/>
+      <w:numFmt w:val="decimal"/>
+      <w:lvlText w:val="%7."/>
+      <w:lvlJc w:val="left"/>
+      <w:pPr>
+        <w:ind w:left="5040" w:hanging="360"/>
+      </w:pPr>
+    </w:lvl>
+    <w:lvl w:ilvl="7" w:tplc="040C0019" w:tentative="1">
+      <w:start w:val="1"/>
+      <w:numFmt w:val="lowerLetter"/>
+      <w:lvlText w:val="%8."/>
+      <w:lvlJc w:val="left"/>
+      <w:pPr>
+        <w:ind w:left="5760" w:hanging="360"/>
+      </w:pPr>
+    </w:lvl>
+    <w:lvl w:ilvl="8" w:tplc="040C001B" w:tentative="1">
+      <w:start w:val="1"/>
+      <w:numFmt w:val="lowerRoman"/>
+      <w:lvlText w:val="%9."/>
+      <w:lvlJc w:val="right"/>
+      <w:pPr>
+        <w:ind w:left="6480" w:hanging="180"/>
+      </w:pPr>
+    </w:lvl>
+  </w:abstractNum>
+  <w:abstractNum w:abstractNumId="1" w15:restartNumberingAfterBreak="0">
     <w:nsid w:val="19E805D9"/>
     <w:multiLevelType w:val="hybridMultilevel"/>
     <w:tmpl w:val="1FC2BA02"/>
@@ -1725,7 +2886,7 @@
       </w:rPr>
     </w:lvl>
   </w:abstractNum>
-  <w:abstractNum w:abstractNumId="1" w15:restartNumberingAfterBreak="0">
+  <w:abstractNum w:abstractNumId="2" w15:restartNumberingAfterBreak="0">
     <w:nsid w:val="203B3A87"/>
     <w:multiLevelType w:val="hybridMultilevel"/>
     <w:tmpl w:val="6BF03216"/>
@@ -1838,7 +2999,7 @@
       </w:rPr>
     </w:lvl>
   </w:abstractNum>
-  <w:abstractNum w:abstractNumId="2" w15:restartNumberingAfterBreak="0">
+  <w:abstractNum w:abstractNumId="3" w15:restartNumberingAfterBreak="0">
     <w:nsid w:val="3C3D21EC"/>
     <w:multiLevelType w:val="hybridMultilevel"/>
     <w:tmpl w:val="C25CD22C"/>
@@ -1924,7 +3085,7 @@
       </w:pPr>
     </w:lvl>
   </w:abstractNum>
-  <w:abstractNum w:abstractNumId="3" w15:restartNumberingAfterBreak="0">
+  <w:abstractNum w:abstractNumId="4" w15:restartNumberingAfterBreak="0">
     <w:nsid w:val="3DF801BE"/>
     <w:multiLevelType w:val="hybridMultilevel"/>
     <w:tmpl w:val="24902566"/>
@@ -2037,10 +3198,10 @@
       </w:rPr>
     </w:lvl>
   </w:abstractNum>
-  <w:abstractNum w:abstractNumId="4" w15:restartNumberingAfterBreak="0">
+  <w:abstractNum w:abstractNumId="5" w15:restartNumberingAfterBreak="0">
     <w:nsid w:val="53B51238"/>
     <w:multiLevelType w:val="hybridMultilevel"/>
-    <w:tmpl w:val="C08EB444"/>
+    <w:tmpl w:val="DB2CE418"/>
     <w:lvl w:ilvl="0" w:tplc="040C000F">
       <w:start w:val="1"/>
       <w:numFmt w:val="decimal"/>
@@ -2123,20 +3284,317 @@
       </w:pPr>
     </w:lvl>
   </w:abstractNum>
+  <w:abstractNum w:abstractNumId="6" w15:restartNumberingAfterBreak="0">
+    <w:nsid w:val="631027EE"/>
+    <w:multiLevelType w:val="hybridMultilevel"/>
+    <w:tmpl w:val="30CC7F0C"/>
+    <w:lvl w:ilvl="0" w:tplc="040C0017">
+      <w:start w:val="1"/>
+      <w:numFmt w:val="lowerLetter"/>
+      <w:lvlText w:val="%1)"/>
+      <w:lvlJc w:val="left"/>
+      <w:pPr>
+        <w:ind w:left="720" w:hanging="360"/>
+      </w:pPr>
+    </w:lvl>
+    <w:lvl w:ilvl="1" w:tplc="040C0019" w:tentative="1">
+      <w:start w:val="1"/>
+      <w:numFmt w:val="lowerLetter"/>
+      <w:lvlText w:val="%2."/>
+      <w:lvlJc w:val="left"/>
+      <w:pPr>
+        <w:ind w:left="1440" w:hanging="360"/>
+      </w:pPr>
+    </w:lvl>
+    <w:lvl w:ilvl="2" w:tplc="040C001B" w:tentative="1">
+      <w:start w:val="1"/>
+      <w:numFmt w:val="lowerRoman"/>
+      <w:lvlText w:val="%3."/>
+      <w:lvlJc w:val="right"/>
+      <w:pPr>
+        <w:ind w:left="2160" w:hanging="180"/>
+      </w:pPr>
+    </w:lvl>
+    <w:lvl w:ilvl="3" w:tplc="040C000F" w:tentative="1">
+      <w:start w:val="1"/>
+      <w:numFmt w:val="decimal"/>
+      <w:lvlText w:val="%4."/>
+      <w:lvlJc w:val="left"/>
+      <w:pPr>
+        <w:ind w:left="2880" w:hanging="360"/>
+      </w:pPr>
+    </w:lvl>
+    <w:lvl w:ilvl="4" w:tplc="040C0019" w:tentative="1">
+      <w:start w:val="1"/>
+      <w:numFmt w:val="lowerLetter"/>
+      <w:lvlText w:val="%5."/>
+      <w:lvlJc w:val="left"/>
+      <w:pPr>
+        <w:ind w:left="3600" w:hanging="360"/>
+      </w:pPr>
+    </w:lvl>
+    <w:lvl w:ilvl="5" w:tplc="040C001B" w:tentative="1">
+      <w:start w:val="1"/>
+      <w:numFmt w:val="lowerRoman"/>
+      <w:lvlText w:val="%6."/>
+      <w:lvlJc w:val="right"/>
+      <w:pPr>
+        <w:ind w:left="4320" w:hanging="180"/>
+      </w:pPr>
+    </w:lvl>
+    <w:lvl w:ilvl="6" w:tplc="040C000F" w:tentative="1">
+      <w:start w:val="1"/>
+      <w:numFmt w:val="decimal"/>
+      <w:lvlText w:val="%7."/>
+      <w:lvlJc w:val="left"/>
+      <w:pPr>
+        <w:ind w:left="5040" w:hanging="360"/>
+      </w:pPr>
+    </w:lvl>
+    <w:lvl w:ilvl="7" w:tplc="040C0019" w:tentative="1">
+      <w:start w:val="1"/>
+      <w:numFmt w:val="lowerLetter"/>
+      <w:lvlText w:val="%8."/>
+      <w:lvlJc w:val="left"/>
+      <w:pPr>
+        <w:ind w:left="5760" w:hanging="360"/>
+      </w:pPr>
+    </w:lvl>
+    <w:lvl w:ilvl="8" w:tplc="040C001B" w:tentative="1">
+      <w:start w:val="1"/>
+      <w:numFmt w:val="lowerRoman"/>
+      <w:lvlText w:val="%9."/>
+      <w:lvlJc w:val="right"/>
+      <w:pPr>
+        <w:ind w:left="6480" w:hanging="180"/>
+      </w:pPr>
+    </w:lvl>
+  </w:abstractNum>
+  <w:abstractNum w:abstractNumId="7" w15:restartNumberingAfterBreak="0">
+    <w:nsid w:val="69BE6C6A"/>
+    <w:multiLevelType w:val="hybridMultilevel"/>
+    <w:tmpl w:val="C932F640"/>
+    <w:lvl w:ilvl="0" w:tplc="040C0017">
+      <w:start w:val="1"/>
+      <w:numFmt w:val="lowerLetter"/>
+      <w:lvlText w:val="%1)"/>
+      <w:lvlJc w:val="left"/>
+      <w:pPr>
+        <w:ind w:left="720" w:hanging="360"/>
+      </w:pPr>
+    </w:lvl>
+    <w:lvl w:ilvl="1" w:tplc="040C0019" w:tentative="1">
+      <w:start w:val="1"/>
+      <w:numFmt w:val="lowerLetter"/>
+      <w:lvlText w:val="%2."/>
+      <w:lvlJc w:val="left"/>
+      <w:pPr>
+        <w:ind w:left="1440" w:hanging="360"/>
+      </w:pPr>
+    </w:lvl>
+    <w:lvl w:ilvl="2" w:tplc="040C001B" w:tentative="1">
+      <w:start w:val="1"/>
+      <w:numFmt w:val="lowerRoman"/>
+      <w:lvlText w:val="%3."/>
+      <w:lvlJc w:val="right"/>
+      <w:pPr>
+        <w:ind w:left="2160" w:hanging="180"/>
+      </w:pPr>
+    </w:lvl>
+    <w:lvl w:ilvl="3" w:tplc="040C000F" w:tentative="1">
+      <w:start w:val="1"/>
+      <w:numFmt w:val="decimal"/>
+      <w:lvlText w:val="%4."/>
+      <w:lvlJc w:val="left"/>
+      <w:pPr>
+        <w:ind w:left="2880" w:hanging="360"/>
+      </w:pPr>
+    </w:lvl>
+    <w:lvl w:ilvl="4" w:tplc="040C0019" w:tentative="1">
+      <w:start w:val="1"/>
+      <w:numFmt w:val="lowerLetter"/>
+      <w:lvlText w:val="%5."/>
+      <w:lvlJc w:val="left"/>
+      <w:pPr>
+        <w:ind w:left="3600" w:hanging="360"/>
+      </w:pPr>
+    </w:lvl>
+    <w:lvl w:ilvl="5" w:tplc="040C001B" w:tentative="1">
+      <w:start w:val="1"/>
+      <w:numFmt w:val="lowerRoman"/>
+      <w:lvlText w:val="%6."/>
+      <w:lvlJc w:val="right"/>
+      <w:pPr>
+        <w:ind w:left="4320" w:hanging="180"/>
+      </w:pPr>
+    </w:lvl>
+    <w:lvl w:ilvl="6" w:tplc="040C000F" w:tentative="1">
+      <w:start w:val="1"/>
+      <w:numFmt w:val="decimal"/>
+      <w:lvlText w:val="%7."/>
+      <w:lvlJc w:val="left"/>
+      <w:pPr>
+        <w:ind w:left="5040" w:hanging="360"/>
+      </w:pPr>
+    </w:lvl>
+    <w:lvl w:ilvl="7" w:tplc="040C0019" w:tentative="1">
+      <w:start w:val="1"/>
+      <w:numFmt w:val="lowerLetter"/>
+      <w:lvlText w:val="%8."/>
+      <w:lvlJc w:val="left"/>
+      <w:pPr>
+        <w:ind w:left="5760" w:hanging="360"/>
+      </w:pPr>
+    </w:lvl>
+    <w:lvl w:ilvl="8" w:tplc="040C001B" w:tentative="1">
+      <w:start w:val="1"/>
+      <w:numFmt w:val="lowerRoman"/>
+      <w:lvlText w:val="%9."/>
+      <w:lvlJc w:val="right"/>
+      <w:pPr>
+        <w:ind w:left="6480" w:hanging="180"/>
+      </w:pPr>
+    </w:lvl>
+  </w:abstractNum>
+  <w:abstractNum w:abstractNumId="8" w15:restartNumberingAfterBreak="0">
+    <w:nsid w:val="785774C9"/>
+    <w:multiLevelType w:val="hybridMultilevel"/>
+    <w:tmpl w:val="4ED49CCE"/>
+    <w:lvl w:ilvl="0" w:tplc="5C3CF308">
+      <w:start w:val="1"/>
+      <w:numFmt w:val="bullet"/>
+      <w:lvlText w:val=""/>
+      <w:lvlJc w:val="left"/>
+      <w:pPr>
+        <w:ind w:left="720" w:hanging="360"/>
+      </w:pPr>
+      <w:rPr>
+        <w:rFonts w:ascii="Symbol" w:hAnsi="Symbol" w:hint="default"/>
+      </w:rPr>
+    </w:lvl>
+    <w:lvl w:ilvl="1" w:tplc="040C0003" w:tentative="1">
+      <w:start w:val="1"/>
+      <w:numFmt w:val="bullet"/>
+      <w:lvlText w:val="o"/>
+      <w:lvlJc w:val="left"/>
+      <w:pPr>
+        <w:ind w:left="1440" w:hanging="360"/>
+      </w:pPr>
+      <w:rPr>
+        <w:rFonts w:ascii="Courier New" w:hAnsi="Courier New" w:cs="Courier New" w:hint="default"/>
+      </w:rPr>
+    </w:lvl>
+    <w:lvl w:ilvl="2" w:tplc="040C0005" w:tentative="1">
+      <w:start w:val="1"/>
+      <w:numFmt w:val="bullet"/>
+      <w:lvlText w:val=""/>
+      <w:lvlJc w:val="left"/>
+      <w:pPr>
+        <w:ind w:left="2160" w:hanging="360"/>
+      </w:pPr>
+      <w:rPr>
+        <w:rFonts w:ascii="Wingdings" w:hAnsi="Wingdings" w:hint="default"/>
+      </w:rPr>
+    </w:lvl>
+    <w:lvl w:ilvl="3" w:tplc="040C0001" w:tentative="1">
+      <w:start w:val="1"/>
+      <w:numFmt w:val="bullet"/>
+      <w:lvlText w:val=""/>
+      <w:lvlJc w:val="left"/>
+      <w:pPr>
+        <w:ind w:left="2880" w:hanging="360"/>
+      </w:pPr>
+      <w:rPr>
+        <w:rFonts w:ascii="Symbol" w:hAnsi="Symbol" w:hint="default"/>
+      </w:rPr>
+    </w:lvl>
+    <w:lvl w:ilvl="4" w:tplc="040C0003" w:tentative="1">
+      <w:start w:val="1"/>
+      <w:numFmt w:val="bullet"/>
+      <w:lvlText w:val="o"/>
+      <w:lvlJc w:val="left"/>
+      <w:pPr>
+        <w:ind w:left="3600" w:hanging="360"/>
+      </w:pPr>
+      <w:rPr>
+        <w:rFonts w:ascii="Courier New" w:hAnsi="Courier New" w:cs="Courier New" w:hint="default"/>
+      </w:rPr>
+    </w:lvl>
+    <w:lvl w:ilvl="5" w:tplc="040C0005" w:tentative="1">
+      <w:start w:val="1"/>
+      <w:numFmt w:val="bullet"/>
+      <w:lvlText w:val=""/>
+      <w:lvlJc w:val="left"/>
+      <w:pPr>
+        <w:ind w:left="4320" w:hanging="360"/>
+      </w:pPr>
+      <w:rPr>
+        <w:rFonts w:ascii="Wingdings" w:hAnsi="Wingdings" w:hint="default"/>
+      </w:rPr>
+    </w:lvl>
+    <w:lvl w:ilvl="6" w:tplc="040C0001" w:tentative="1">
+      <w:start w:val="1"/>
+      <w:numFmt w:val="bullet"/>
+      <w:lvlText w:val=""/>
+      <w:lvlJc w:val="left"/>
+      <w:pPr>
+        <w:ind w:left="5040" w:hanging="360"/>
+      </w:pPr>
+      <w:rPr>
+        <w:rFonts w:ascii="Symbol" w:hAnsi="Symbol" w:hint="default"/>
+      </w:rPr>
+    </w:lvl>
+    <w:lvl w:ilvl="7" w:tplc="040C0003" w:tentative="1">
+      <w:start w:val="1"/>
+      <w:numFmt w:val="bullet"/>
+      <w:lvlText w:val="o"/>
+      <w:lvlJc w:val="left"/>
+      <w:pPr>
+        <w:ind w:left="5760" w:hanging="360"/>
+      </w:pPr>
+      <w:rPr>
+        <w:rFonts w:ascii="Courier New" w:hAnsi="Courier New" w:cs="Courier New" w:hint="default"/>
+      </w:rPr>
+    </w:lvl>
+    <w:lvl w:ilvl="8" w:tplc="040C0005" w:tentative="1">
+      <w:start w:val="1"/>
+      <w:numFmt w:val="bullet"/>
+      <w:lvlText w:val=""/>
+      <w:lvlJc w:val="left"/>
+      <w:pPr>
+        <w:ind w:left="6480" w:hanging="360"/>
+      </w:pPr>
+      <w:rPr>
+        <w:rFonts w:ascii="Wingdings" w:hAnsi="Wingdings" w:hint="default"/>
+      </w:rPr>
+    </w:lvl>
+  </w:abstractNum>
   <w:num w:numId="1">
+    <w:abstractNumId w:val="1"/>
+  </w:num>
+  <w:num w:numId="2">
+    <w:abstractNumId w:val="3"/>
+  </w:num>
+  <w:num w:numId="3">
+    <w:abstractNumId w:val="5"/>
+  </w:num>
+  <w:num w:numId="4">
+    <w:abstractNumId w:val="4"/>
+  </w:num>
+  <w:num w:numId="5">
+    <w:abstractNumId w:val="2"/>
+  </w:num>
+  <w:num w:numId="6">
     <w:abstractNumId w:val="0"/>
   </w:num>
-  <w:num w:numId="2">
-    <w:abstractNumId w:val="2"/>
+  <w:num w:numId="7">
+    <w:abstractNumId w:val="8"/>
   </w:num>
-  <w:num w:numId="3">
-    <w:abstractNumId w:val="4"/>
+  <w:num w:numId="8">
+    <w:abstractNumId w:val="7"/>
   </w:num>
-  <w:num w:numId="4">
-    <w:abstractNumId w:val="3"/>
-  </w:num>
-  <w:num w:numId="5">
-    <w:abstractNumId w:val="1"/>
+  <w:num w:numId="9">
+    <w:abstractNumId w:val="6"/>
   </w:num>
 </w:numbering>
 </file>
@@ -2542,7 +4000,7 @@
   <w:style w:type="paragraph" w:default="1" w:styleId="Normal">
     <w:name w:val="Normal"/>
     <w:qFormat/>
-    <w:rsid w:val="006816E9"/>
+    <w:rsid w:val="00C2699E"/>
     <w:pPr>
       <w:spacing w:line="360" w:lineRule="auto"/>
       <w:jc w:val="both"/>
@@ -4162,7 +5620,7 @@
 </file>
 
 <file path=customXml/itemProps1.xml><?xml version="1.0" encoding="utf-8"?>
-<ds:datastoreItem xmlns:ds="http://schemas.openxmlformats.org/officeDocument/2006/customXml" ds:itemID="{A307907A-C81C-457E-B184-39C2A29F44B8}">
+<ds:datastoreItem xmlns:ds="http://schemas.openxmlformats.org/officeDocument/2006/customXml" ds:itemID="{0A8DAEAF-7DDD-41E8-9E5C-D45F113E2D17}">
   <ds:schemaRefs>
     <ds:schemaRef ds:uri="http://schemas.openxmlformats.org/officeDocument/2006/bibliography"/>
   </ds:schemaRefs>

</xml_diff>

<commit_message>
work on directory creation
</commit_message>
<xml_diff>
--- a/CAHIER DE CHARGE DE DOCSIRA.docx
+++ b/CAHIER DE CHARGE DE DOCSIRA.docx
@@ -1784,7 +1784,7 @@
               <w:rPr>
                 <w:b w:val="0"/>
               </w:rPr>
-              <w:t>Voir tous les détails du dossiers créé</w:t>
+              <w:t xml:space="preserve">Ouvrir le fichier </w:t>
             </w:r>
           </w:p>
         </w:tc>
@@ -1832,7 +1832,7 @@
               <w:rPr>
                 <w:b w:val="0"/>
               </w:rPr>
-              <w:t>Modifier le nom du dossier</w:t>
+              <w:t>Voir tous les détails du dossiers créé</w:t>
             </w:r>
           </w:p>
         </w:tc>
@@ -1862,7 +1862,7 @@
       </w:tr>
       <w:tr>
         <w:trPr>
-          <w:trHeight w:val="488"/>
+          <w:trHeight w:val="505"/>
         </w:trPr>
         <w:tc>
           <w:tcPr>
@@ -1880,7 +1880,7 @@
                 <w:b w:val="0"/>
               </w:rPr>
               <w:lastRenderedPageBreak/>
-              <w:t>Voir l’intérieur du dossier créé</w:t>
+              <w:t>Modifier le nom du dossier</w:t>
             </w:r>
           </w:p>
         </w:tc>
@@ -1911,6 +1911,53 @@
       <w:tr>
         <w:trPr>
           <w:cnfStyle w:val="000000100000" w:firstRow="0" w:lastRow="0" w:firstColumn="0" w:lastColumn="0" w:oddVBand="0" w:evenVBand="0" w:oddHBand="1" w:evenHBand="0" w:firstRowFirstColumn="0" w:firstRowLastColumn="0" w:lastRowFirstColumn="0" w:lastRowLastColumn="0"/>
+          <w:trHeight w:val="488"/>
+        </w:trPr>
+        <w:tc>
+          <w:tcPr>
+            <w:cnfStyle w:val="001000000000" w:firstRow="0" w:lastRow="0" w:firstColumn="1" w:lastColumn="0" w:oddVBand="0" w:evenVBand="0" w:oddHBand="0" w:evenHBand="0" w:firstRowFirstColumn="0" w:firstRowLastColumn="0" w:lastRowFirstColumn="0" w:lastRowLastColumn="0"/>
+            <w:tcW w:w="6307" w:type="dxa"/>
+          </w:tcPr>
+          <w:p>
+            <w:pPr>
+              <w:rPr>
+                <w:b w:val="0"/>
+              </w:rPr>
+            </w:pPr>
+            <w:r>
+              <w:rPr>
+                <w:b w:val="0"/>
+              </w:rPr>
+              <w:t>Voir l’intérieur du dossier créé</w:t>
+            </w:r>
+          </w:p>
+        </w:tc>
+        <w:tc>
+          <w:tcPr>
+            <w:tcW w:w="1578" w:type="dxa"/>
+          </w:tcPr>
+          <w:p>
+            <w:pPr>
+              <w:cnfStyle w:val="000000100000" w:firstRow="0" w:lastRow="0" w:firstColumn="0" w:lastColumn="0" w:oddVBand="0" w:evenVBand="0" w:oddHBand="1" w:evenHBand="0" w:firstRowFirstColumn="0" w:firstRowLastColumn="0" w:lastRowFirstColumn="0" w:lastRowLastColumn="0"/>
+            </w:pPr>
+            <w:r>
+              <w:t>En cours</w:t>
+            </w:r>
+          </w:p>
+        </w:tc>
+        <w:tc>
+          <w:tcPr>
+            <w:tcW w:w="1285" w:type="dxa"/>
+          </w:tcPr>
+          <w:p>
+            <w:pPr>
+              <w:cnfStyle w:val="000000100000" w:firstRow="0" w:lastRow="0" w:firstColumn="0" w:lastColumn="0" w:oddVBand="0" w:evenVBand="0" w:oddHBand="1" w:evenHBand="0" w:firstRowFirstColumn="0" w:firstRowLastColumn="0" w:lastRowFirstColumn="0" w:lastRowLastColumn="0"/>
+            </w:pPr>
+          </w:p>
+        </w:tc>
+      </w:tr>
+      <w:tr>
+        <w:trPr>
           <w:trHeight w:val="505"/>
         </w:trPr>
         <w:tc>
@@ -1944,7 +1991,7 @@
           </w:tcPr>
           <w:p>
             <w:pPr>
-              <w:cnfStyle w:val="000000100000" w:firstRow="0" w:lastRow="0" w:firstColumn="0" w:lastColumn="0" w:oddVBand="0" w:evenVBand="0" w:oddHBand="1" w:evenHBand="0" w:firstRowFirstColumn="0" w:firstRowLastColumn="0" w:lastRowFirstColumn="0" w:lastRowLastColumn="0"/>
+              <w:cnfStyle w:val="000000000000" w:firstRow="0" w:lastRow="0" w:firstColumn="0" w:lastColumn="0" w:oddVBand="0" w:evenVBand="0" w:oddHBand="0" w:evenHBand="0" w:firstRowFirstColumn="0" w:firstRowLastColumn="0" w:lastRowFirstColumn="0" w:lastRowLastColumn="0"/>
             </w:pPr>
             <w:r>
               <w:t>En cours</w:t>
@@ -1957,7 +2004,7 @@
           </w:tcPr>
           <w:p>
             <w:pPr>
-              <w:cnfStyle w:val="000000100000" w:firstRow="0" w:lastRow="0" w:firstColumn="0" w:lastColumn="0" w:oddVBand="0" w:evenVBand="0" w:oddHBand="1" w:evenHBand="0" w:firstRowFirstColumn="0" w:firstRowLastColumn="0" w:lastRowFirstColumn="0" w:lastRowLastColumn="0"/>
+              <w:cnfStyle w:val="000000000000" w:firstRow="0" w:lastRow="0" w:firstColumn="0" w:lastColumn="0" w:oddVBand="0" w:evenVBand="0" w:oddHBand="0" w:evenHBand="0" w:firstRowFirstColumn="0" w:firstRowLastColumn="0" w:lastRowFirstColumn="0" w:lastRowLastColumn="0"/>
             </w:pPr>
           </w:p>
         </w:tc>
@@ -2002,6 +2049,8 @@
             <w:r>
               <w:t>Fonctionnalité</w:t>
             </w:r>
+            <w:bookmarkStart w:id="2" w:name="_GoBack"/>
+            <w:bookmarkEnd w:id="2"/>
           </w:p>
         </w:tc>
         <w:tc>
@@ -2051,13 +2100,7 @@
               <w:rPr>
                 <w:b w:val="0"/>
               </w:rPr>
-              <w:t xml:space="preserve">Création </w:t>
-            </w:r>
-            <w:r>
-              <w:rPr>
-                <w:b w:val="0"/>
-              </w:rPr>
-              <w:t>du dossier dans le cloud</w:t>
+              <w:t>Création du dossier dans le cloud</w:t>
             </w:r>
           </w:p>
         </w:tc>
@@ -2271,13 +2314,7 @@
               <w:rPr>
                 <w:b w:val="0"/>
               </w:rPr>
-              <w:t>du dossier créé</w:t>
-            </w:r>
-            <w:r>
-              <w:rPr>
-                <w:b w:val="0"/>
-              </w:rPr>
-              <w:t xml:space="preserve"> dans le cloud</w:t>
+              <w:t>du dossier créé dans le cloud</w:t>
             </w:r>
           </w:p>
         </w:tc>
@@ -2662,8 +2699,6 @@
       <w:r>
         <w:t>ux</w:t>
       </w:r>
-      <w:bookmarkStart w:id="2" w:name="_GoBack"/>
-      <w:bookmarkEnd w:id="2"/>
       <w:r>
         <w:t xml:space="preserve"> </w:t>
       </w:r>
@@ -5620,7 +5655,7 @@
 </file>
 
 <file path=customXml/itemProps1.xml><?xml version="1.0" encoding="utf-8"?>
-<ds:datastoreItem xmlns:ds="http://schemas.openxmlformats.org/officeDocument/2006/customXml" ds:itemID="{0A8DAEAF-7DDD-41E8-9E5C-D45F113E2D17}">
+<ds:datastoreItem xmlns:ds="http://schemas.openxmlformats.org/officeDocument/2006/customXml" ds:itemID="{523AFF42-957A-4B96-8FBD-BE6DABAF9F1D}">
   <ds:schemaRefs>
     <ds:schemaRef ds:uri="http://schemas.openxmlformats.org/officeDocument/2006/bibliography"/>
   </ds:schemaRefs>

</xml_diff>

<commit_message>
work on dustbin moving before deleting
</commit_message>
<xml_diff>
--- a/CAHIER DE CHARGE DE DOCSIRA.docx
+++ b/CAHIER DE CHARGE DE DOCSIRA.docx
@@ -1789,8 +1789,6 @@
             </w:pPr>
           </w:p>
         </w:tc>
-        <w:bookmarkStart w:id="2" w:name="_GoBack"/>
-        <w:bookmarkEnd w:id="2"/>
       </w:tr>
       <w:tr>
         <w:trPr>
@@ -1937,7 +1935,13 @@
       </w:tr>
     </w:tbl>
     <w:p/>
-    <w:p/>
+    <w:p>
+      <w:r>
+        <w:t>La suppression n’est pas exécutée immédiatement. On place dans un premier temps le client dans une corbeille. Après le compte principal, vient effectuer la suppression définitive.</w:t>
+      </w:r>
+      <w:bookmarkStart w:id="2" w:name="_GoBack"/>
+      <w:bookmarkEnd w:id="2"/>
+    </w:p>
     <w:p>
       <w:pPr>
         <w:pStyle w:val="Titre2"/>
@@ -1971,6 +1975,7 @@
         </w:numPr>
       </w:pPr>
       <w:r>
+        <w:lastRenderedPageBreak/>
         <w:t xml:space="preserve">Stocker des données en ligne un peu comme drive ou </w:t>
       </w:r>
       <w:r>
@@ -1989,7 +1994,6 @@
         </w:numPr>
       </w:pPr>
       <w:r>
-        <w:lastRenderedPageBreak/>
         <w:t>Concevoir un système de gestion de projets pour un suivi effectif des travaux au sein du cabinet.</w:t>
       </w:r>
     </w:p>
@@ -2457,7 +2461,6 @@
         </w:numPr>
       </w:pPr>
       <w:r>
-        <w:lastRenderedPageBreak/>
         <w:t>Stockage en ligne</w:t>
       </w:r>
     </w:p>
@@ -6180,7 +6183,7 @@
 </file>
 
 <file path=customXml/itemProps1.xml><?xml version="1.0" encoding="utf-8"?>
-<ds:datastoreItem xmlns:ds="http://schemas.openxmlformats.org/officeDocument/2006/customXml" ds:itemID="{AD31CAD6-81A3-4E87-897D-A542FA46B173}">
+<ds:datastoreItem xmlns:ds="http://schemas.openxmlformats.org/officeDocument/2006/customXml" ds:itemID="{D07F2F25-0E5A-4FE8-9C7E-6E86398167F3}">
   <ds:schemaRefs>
     <ds:schemaRef ds:uri="http://schemas.openxmlformats.org/officeDocument/2006/bibliography"/>
   </ds:schemaRefs>

</xml_diff>

<commit_message>
work on client perms
</commit_message>
<xml_diff>
--- a/CAHIER DE CHARGE DE DOCSIRA.docx
+++ b/CAHIER DE CHARGE DE DOCSIRA.docx
@@ -1936,8 +1936,6 @@
             <w:r>
               <w:t>En cours</w:t>
             </w:r>
-            <w:bookmarkStart w:id="2" w:name="_GoBack"/>
-            <w:bookmarkEnd w:id="2"/>
           </w:p>
         </w:tc>
         <w:tc>
@@ -1982,6 +1980,8 @@
             <w:pPr>
               <w:cnfStyle w:val="000000000000" w:firstRow="0" w:lastRow="0" w:firstColumn="0" w:lastColumn="0" w:oddVBand="0" w:evenVBand="0" w:oddHBand="0" w:evenHBand="0" w:firstRowFirstColumn="0" w:firstRowLastColumn="0" w:lastRowFirstColumn="0" w:lastRowLastColumn="0"/>
             </w:pPr>
+            <w:bookmarkStart w:id="2" w:name="_GoBack"/>
+            <w:bookmarkEnd w:id="2"/>
             <w:r>
               <w:t>Terminé</w:t>
             </w:r>
@@ -2003,6 +2003,11 @@
     <w:p>
       <w:r>
         <w:t>La suppression n’est pas exécutée immédiatement. On place dans un premier temps le client dans une corbeille. Après le compte principal, vient effectuer la suppression définitive.</w:t>
+      </w:r>
+    </w:p>
+    <w:p>
+      <w:r>
+        <w:t>La corbeille s’auto supprime dans 30 jours.</w:t>
       </w:r>
     </w:p>
     <w:p>
@@ -6247,7 +6252,7 @@
 </file>
 
 <file path=customXml/itemProps1.xml><?xml version="1.0" encoding="utf-8"?>
-<ds:datastoreItem xmlns:ds="http://schemas.openxmlformats.org/officeDocument/2006/customXml" ds:itemID="{DE46C388-BAE0-4FE2-AD07-2C1DADC1DDC7}">
+<ds:datastoreItem xmlns:ds="http://schemas.openxmlformats.org/officeDocument/2006/customXml" ds:itemID="{9220343A-A5E0-4C77-A610-CC412437C6A3}">
   <ds:schemaRefs>
     <ds:schemaRef ds:uri="http://schemas.openxmlformats.org/officeDocument/2006/bibliography"/>
   </ds:schemaRefs>

</xml_diff>

<commit_message>
work on charge book for affairs settings
</commit_message>
<xml_diff>
--- a/CAHIER DE CHARGE DE DOCSIRA.docx
+++ b/CAHIER DE CHARGE DE DOCSIRA.docx
@@ -929,15 +929,7 @@
         <w:t xml:space="preserve">Dans l’implémentation des features, je dois avoir </w:t>
       </w:r>
       <w:r>
-        <w:t xml:space="preserve">l’ux et </w:t>
-      </w:r>
-      <w:proofErr w:type="spellStart"/>
-      <w:r>
-        <w:t>l’ui</w:t>
-      </w:r>
-      <w:proofErr w:type="spellEnd"/>
-      <w:r>
-        <w:t xml:space="preserve"> implémentés correctement.</w:t>
+        <w:t>l’ux et l’ui implémentés correctement.</w:t>
       </w:r>
     </w:p>
     <w:p>
@@ -1934,7 +1926,10 @@
               <w:cnfStyle w:val="000000100000" w:firstRow="0" w:lastRow="0" w:firstColumn="0" w:lastColumn="0" w:oddVBand="0" w:evenVBand="0" w:oddHBand="1" w:evenHBand="0" w:firstRowFirstColumn="0" w:firstRowLastColumn="0" w:lastRowFirstColumn="0" w:lastRowLastColumn="0"/>
             </w:pPr>
             <w:r>
-              <w:t>En cours</w:t>
+              <w:t>Terminé</w:t>
+            </w:r>
+            <w:r>
+              <w:t xml:space="preserve"> </w:t>
             </w:r>
           </w:p>
         </w:tc>
@@ -1980,10 +1975,8 @@
             <w:pPr>
               <w:cnfStyle w:val="000000000000" w:firstRow="0" w:lastRow="0" w:firstColumn="0" w:lastColumn="0" w:oddVBand="0" w:evenVBand="0" w:oddHBand="0" w:evenHBand="0" w:firstRowFirstColumn="0" w:firstRowLastColumn="0" w:lastRowFirstColumn="0" w:lastRowLastColumn="0"/>
             </w:pPr>
-            <w:bookmarkStart w:id="2" w:name="_GoBack"/>
-            <w:bookmarkEnd w:id="2"/>
-            <w:r>
-              <w:t>Terminé</w:t>
+            <w:r>
+              <w:t>En cours</w:t>
             </w:r>
           </w:p>
         </w:tc>
@@ -2002,6 +1995,11 @@
     <w:p/>
     <w:p>
       <w:r>
+        <w:t>Application Backend Django : Client</w:t>
+      </w:r>
+    </w:p>
+    <w:p>
+      <w:r>
         <w:t>La suppression n’est pas exécutée immédiatement. On place dans un premier temps le client dans une corbeille. Après le compte principal, vient effectuer la suppression définitive.</w:t>
       </w:r>
     </w:p>
@@ -2009,6 +2007,378 @@
       <w:r>
         <w:t>La corbeille s’auto supprime dans 30 jours.</w:t>
       </w:r>
+    </w:p>
+    <w:p>
+      <w:pPr>
+        <w:pStyle w:val="Titre3"/>
+        <w:numPr>
+          <w:ilvl w:val="0"/>
+          <w:numId w:val="10"/>
+        </w:numPr>
+      </w:pPr>
+      <w:r>
+        <w:lastRenderedPageBreak/>
+        <w:t>Associer un ou plusieurs dossiers au client.</w:t>
+      </w:r>
+    </w:p>
+    <w:p>
+      <w:r>
+        <w:t>Dans cette feature on va maintenant s’intéresser au suivi des affaires de clients dans la base de données.</w:t>
+      </w:r>
+    </w:p>
+    <w:tbl>
+      <w:tblPr>
+        <w:tblStyle w:val="TableauListe2-Accentuation3"/>
+        <w:tblW w:w="9170" w:type="dxa"/>
+        <w:tblLook w:val="04A0" w:firstRow="1" w:lastRow="0" w:firstColumn="1" w:lastColumn="0" w:noHBand="0" w:noVBand="1"/>
+      </w:tblPr>
+      <w:tblGrid>
+        <w:gridCol w:w="6307"/>
+        <w:gridCol w:w="1578"/>
+        <w:gridCol w:w="1285"/>
+      </w:tblGrid>
+      <w:tr>
+        <w:trPr>
+          <w:cnfStyle w:val="100000000000" w:firstRow="1" w:lastRow="0" w:firstColumn="0" w:lastColumn="0" w:oddVBand="0" w:evenVBand="0" w:oddHBand="0" w:evenHBand="0" w:firstRowFirstColumn="0" w:firstRowLastColumn="0" w:lastRowFirstColumn="0" w:lastRowLastColumn="0"/>
+          <w:trHeight w:val="505"/>
+        </w:trPr>
+        <w:tc>
+          <w:tcPr>
+            <w:cnfStyle w:val="001000000000" w:firstRow="0" w:lastRow="0" w:firstColumn="1" w:lastColumn="0" w:oddVBand="0" w:evenVBand="0" w:oddHBand="0" w:evenHBand="0" w:firstRowFirstColumn="0" w:firstRowLastColumn="0" w:lastRowFirstColumn="0" w:lastRowLastColumn="0"/>
+            <w:tcW w:w="6307" w:type="dxa"/>
+          </w:tcPr>
+          <w:p>
+            <w:r>
+              <w:t>Fonctionnalité</w:t>
+            </w:r>
+          </w:p>
+        </w:tc>
+        <w:tc>
+          <w:tcPr>
+            <w:tcW w:w="1578" w:type="dxa"/>
+          </w:tcPr>
+          <w:p>
+            <w:pPr>
+              <w:cnfStyle w:val="100000000000" w:firstRow="1" w:lastRow="0" w:firstColumn="0" w:lastColumn="0" w:oddVBand="0" w:evenVBand="0" w:oddHBand="0" w:evenHBand="0" w:firstRowFirstColumn="0" w:firstRowLastColumn="0" w:lastRowFirstColumn="0" w:lastRowLastColumn="0"/>
+            </w:pPr>
+            <w:r>
+              <w:t>Statuts</w:t>
+            </w:r>
+          </w:p>
+        </w:tc>
+        <w:tc>
+          <w:tcPr>
+            <w:tcW w:w="1285" w:type="dxa"/>
+          </w:tcPr>
+          <w:p>
+            <w:pPr>
+              <w:cnfStyle w:val="100000000000" w:firstRow="1" w:lastRow="0" w:firstColumn="0" w:lastColumn="0" w:oddVBand="0" w:evenVBand="0" w:oddHBand="0" w:evenHBand="0" w:firstRowFirstColumn="0" w:firstRowLastColumn="0" w:lastRowFirstColumn="0" w:lastRowLastColumn="0"/>
+            </w:pPr>
+            <w:r>
+              <w:t>Notes</w:t>
+            </w:r>
+          </w:p>
+        </w:tc>
+      </w:tr>
+      <w:tr>
+        <w:trPr>
+          <w:cnfStyle w:val="000000100000" w:firstRow="0" w:lastRow="0" w:firstColumn="0" w:lastColumn="0" w:oddVBand="0" w:evenVBand="0" w:oddHBand="1" w:evenHBand="0" w:firstRowFirstColumn="0" w:firstRowLastColumn="0" w:lastRowFirstColumn="0" w:lastRowLastColumn="0"/>
+          <w:trHeight w:val="505"/>
+        </w:trPr>
+        <w:tc>
+          <w:tcPr>
+            <w:cnfStyle w:val="001000000000" w:firstRow="0" w:lastRow="0" w:firstColumn="1" w:lastColumn="0" w:oddVBand="0" w:evenVBand="0" w:oddHBand="0" w:evenHBand="0" w:firstRowFirstColumn="0" w:firstRowLastColumn="0" w:lastRowFirstColumn="0" w:lastRowLastColumn="0"/>
+            <w:tcW w:w="6307" w:type="dxa"/>
+          </w:tcPr>
+          <w:p>
+            <w:pPr>
+              <w:rPr>
+                <w:b w:val="0"/>
+              </w:rPr>
+            </w:pPr>
+            <w:r>
+              <w:rPr>
+                <w:b w:val="0"/>
+              </w:rPr>
+              <w:t>Créer un nouveau dossier lié au client</w:t>
+            </w:r>
+          </w:p>
+        </w:tc>
+        <w:tc>
+          <w:tcPr>
+            <w:tcW w:w="1578" w:type="dxa"/>
+          </w:tcPr>
+          <w:p>
+            <w:pPr>
+              <w:cnfStyle w:val="000000100000" w:firstRow="0" w:lastRow="0" w:firstColumn="0" w:lastColumn="0" w:oddVBand="0" w:evenVBand="0" w:oddHBand="1" w:evenHBand="0" w:firstRowFirstColumn="0" w:firstRowLastColumn="0" w:lastRowFirstColumn="0" w:lastRowLastColumn="0"/>
+            </w:pPr>
+            <w:r>
+              <w:t>En cours</w:t>
+            </w:r>
+          </w:p>
+        </w:tc>
+        <w:tc>
+          <w:tcPr>
+            <w:tcW w:w="1285" w:type="dxa"/>
+          </w:tcPr>
+          <w:p>
+            <w:pPr>
+              <w:cnfStyle w:val="000000100000" w:firstRow="0" w:lastRow="0" w:firstColumn="0" w:lastColumn="0" w:oddVBand="0" w:evenVBand="0" w:oddHBand="1" w:evenHBand="0" w:firstRowFirstColumn="0" w:firstRowLastColumn="0" w:lastRowFirstColumn="0" w:lastRowLastColumn="0"/>
+            </w:pPr>
+          </w:p>
+        </w:tc>
+      </w:tr>
+      <w:tr>
+        <w:trPr>
+          <w:trHeight w:val="505"/>
+        </w:trPr>
+        <w:tc>
+          <w:tcPr>
+            <w:cnfStyle w:val="001000000000" w:firstRow="0" w:lastRow="0" w:firstColumn="1" w:lastColumn="0" w:oddVBand="0" w:evenVBand="0" w:oddHBand="0" w:evenHBand="0" w:firstRowFirstColumn="0" w:firstRowLastColumn="0" w:lastRowFirstColumn="0" w:lastRowLastColumn="0"/>
+            <w:tcW w:w="6307" w:type="dxa"/>
+          </w:tcPr>
+          <w:p>
+            <w:pPr>
+              <w:rPr>
+                <w:b w:val="0"/>
+              </w:rPr>
+            </w:pPr>
+            <w:r>
+              <w:rPr>
+                <w:b w:val="0"/>
+              </w:rPr>
+              <w:t xml:space="preserve">Voir les informations du </w:t>
+            </w:r>
+            <w:r>
+              <w:rPr>
+                <w:b w:val="0"/>
+              </w:rPr>
+              <w:t>dossier lié au client</w:t>
+            </w:r>
+          </w:p>
+        </w:tc>
+        <w:tc>
+          <w:tcPr>
+            <w:tcW w:w="1578" w:type="dxa"/>
+          </w:tcPr>
+          <w:p>
+            <w:pPr>
+              <w:cnfStyle w:val="000000000000" w:firstRow="0" w:lastRow="0" w:firstColumn="0" w:lastColumn="0" w:oddVBand="0" w:evenVBand="0" w:oddHBand="0" w:evenHBand="0" w:firstRowFirstColumn="0" w:firstRowLastColumn="0" w:lastRowFirstColumn="0" w:lastRowLastColumn="0"/>
+            </w:pPr>
+            <w:r>
+              <w:t>En cours</w:t>
+            </w:r>
+          </w:p>
+        </w:tc>
+        <w:tc>
+          <w:tcPr>
+            <w:tcW w:w="1285" w:type="dxa"/>
+          </w:tcPr>
+          <w:p>
+            <w:pPr>
+              <w:cnfStyle w:val="000000000000" w:firstRow="0" w:lastRow="0" w:firstColumn="0" w:lastColumn="0" w:oddVBand="0" w:evenVBand="0" w:oddHBand="0" w:evenHBand="0" w:firstRowFirstColumn="0" w:firstRowLastColumn="0" w:lastRowFirstColumn="0" w:lastRowLastColumn="0"/>
+            </w:pPr>
+          </w:p>
+        </w:tc>
+      </w:tr>
+      <w:tr>
+        <w:trPr>
+          <w:cnfStyle w:val="000000100000" w:firstRow="0" w:lastRow="0" w:firstColumn="0" w:lastColumn="0" w:oddVBand="0" w:evenVBand="0" w:oddHBand="1" w:evenHBand="0" w:firstRowFirstColumn="0" w:firstRowLastColumn="0" w:lastRowFirstColumn="0" w:lastRowLastColumn="0"/>
+          <w:trHeight w:val="505"/>
+        </w:trPr>
+        <w:tc>
+          <w:tcPr>
+            <w:cnfStyle w:val="001000000000" w:firstRow="0" w:lastRow="0" w:firstColumn="1" w:lastColumn="0" w:oddVBand="0" w:evenVBand="0" w:oddHBand="0" w:evenHBand="0" w:firstRowFirstColumn="0" w:firstRowLastColumn="0" w:lastRowFirstColumn="0" w:lastRowLastColumn="0"/>
+            <w:tcW w:w="6307" w:type="dxa"/>
+          </w:tcPr>
+          <w:p>
+            <w:pPr>
+              <w:rPr>
+                <w:b w:val="0"/>
+              </w:rPr>
+            </w:pPr>
+            <w:r>
+              <w:rPr>
+                <w:b w:val="0"/>
+              </w:rPr>
+              <w:t>Modifier les informations du dossier lié au client</w:t>
+            </w:r>
+          </w:p>
+        </w:tc>
+        <w:tc>
+          <w:tcPr>
+            <w:tcW w:w="1578" w:type="dxa"/>
+          </w:tcPr>
+          <w:p>
+            <w:pPr>
+              <w:cnfStyle w:val="000000100000" w:firstRow="0" w:lastRow="0" w:firstColumn="0" w:lastColumn="0" w:oddVBand="0" w:evenVBand="0" w:oddHBand="1" w:evenHBand="0" w:firstRowFirstColumn="0" w:firstRowLastColumn="0" w:lastRowFirstColumn="0" w:lastRowLastColumn="0"/>
+            </w:pPr>
+            <w:r>
+              <w:t>En cours</w:t>
+            </w:r>
+          </w:p>
+        </w:tc>
+        <w:tc>
+          <w:tcPr>
+            <w:tcW w:w="1285" w:type="dxa"/>
+          </w:tcPr>
+          <w:p>
+            <w:pPr>
+              <w:cnfStyle w:val="000000100000" w:firstRow="0" w:lastRow="0" w:firstColumn="0" w:lastColumn="0" w:oddVBand="0" w:evenVBand="0" w:oddHBand="1" w:evenHBand="0" w:firstRowFirstColumn="0" w:firstRowLastColumn="0" w:lastRowFirstColumn="0" w:lastRowLastColumn="0"/>
+            </w:pPr>
+          </w:p>
+        </w:tc>
+      </w:tr>
+      <w:tr>
+        <w:trPr>
+          <w:trHeight w:val="488"/>
+        </w:trPr>
+        <w:tc>
+          <w:tcPr>
+            <w:cnfStyle w:val="001000000000" w:firstRow="0" w:lastRow="0" w:firstColumn="1" w:lastColumn="0" w:oddVBand="0" w:evenVBand="0" w:oddHBand="0" w:evenHBand="0" w:firstRowFirstColumn="0" w:firstRowLastColumn="0" w:lastRowFirstColumn="0" w:lastRowLastColumn="0"/>
+            <w:tcW w:w="6307" w:type="dxa"/>
+          </w:tcPr>
+          <w:p>
+            <w:pPr>
+              <w:rPr>
+                <w:b w:val="0"/>
+              </w:rPr>
+            </w:pPr>
+            <w:r>
+              <w:rPr>
+                <w:b w:val="0"/>
+              </w:rPr>
+              <w:t>Supprimer le du dossier lié au client</w:t>
+            </w:r>
+          </w:p>
+        </w:tc>
+        <w:tc>
+          <w:tcPr>
+            <w:tcW w:w="1578" w:type="dxa"/>
+          </w:tcPr>
+          <w:p>
+            <w:pPr>
+              <w:cnfStyle w:val="000000000000" w:firstRow="0" w:lastRow="0" w:firstColumn="0" w:lastColumn="0" w:oddVBand="0" w:evenVBand="0" w:oddHBand="0" w:evenHBand="0" w:firstRowFirstColumn="0" w:firstRowLastColumn="0" w:lastRowFirstColumn="0" w:lastRowLastColumn="0"/>
+            </w:pPr>
+            <w:r>
+              <w:t>En cours</w:t>
+            </w:r>
+          </w:p>
+        </w:tc>
+        <w:tc>
+          <w:tcPr>
+            <w:tcW w:w="1285" w:type="dxa"/>
+          </w:tcPr>
+          <w:p>
+            <w:pPr>
+              <w:cnfStyle w:val="000000000000" w:firstRow="0" w:lastRow="0" w:firstColumn="0" w:lastColumn="0" w:oddVBand="0" w:evenVBand="0" w:oddHBand="0" w:evenHBand="0" w:firstRowFirstColumn="0" w:firstRowLastColumn="0" w:lastRowFirstColumn="0" w:lastRowLastColumn="0"/>
+            </w:pPr>
+          </w:p>
+        </w:tc>
+      </w:tr>
+      <w:tr>
+        <w:trPr>
+          <w:cnfStyle w:val="000000100000" w:firstRow="0" w:lastRow="0" w:firstColumn="0" w:lastColumn="0" w:oddVBand="0" w:evenVBand="0" w:oddHBand="1" w:evenHBand="0" w:firstRowFirstColumn="0" w:firstRowLastColumn="0" w:lastRowFirstColumn="0" w:lastRowLastColumn="0"/>
+          <w:trHeight w:val="488"/>
+        </w:trPr>
+        <w:tc>
+          <w:tcPr>
+            <w:cnfStyle w:val="001000000000" w:firstRow="0" w:lastRow="0" w:firstColumn="1" w:lastColumn="0" w:oddVBand="0" w:evenVBand="0" w:oddHBand="0" w:evenHBand="0" w:firstRowFirstColumn="0" w:firstRowLastColumn="0" w:lastRowFirstColumn="0" w:lastRowLastColumn="0"/>
+            <w:tcW w:w="6307" w:type="dxa"/>
+          </w:tcPr>
+          <w:p>
+            <w:pPr>
+              <w:rPr>
+                <w:b w:val="0"/>
+              </w:rPr>
+            </w:pPr>
+            <w:r>
+              <w:rPr>
+                <w:b w:val="0"/>
+              </w:rPr>
+              <w:t>Mettre du dossier lié au client dans la corbeille</w:t>
+            </w:r>
+          </w:p>
+        </w:tc>
+        <w:tc>
+          <w:tcPr>
+            <w:tcW w:w="1578" w:type="dxa"/>
+          </w:tcPr>
+          <w:p>
+            <w:pPr>
+              <w:cnfStyle w:val="000000100000" w:firstRow="0" w:lastRow="0" w:firstColumn="0" w:lastColumn="0" w:oddVBand="0" w:evenVBand="0" w:oddHBand="1" w:evenHBand="0" w:firstRowFirstColumn="0" w:firstRowLastColumn="0" w:lastRowFirstColumn="0" w:lastRowLastColumn="0"/>
+            </w:pPr>
+            <w:r>
+              <w:t xml:space="preserve">En cours </w:t>
+            </w:r>
+          </w:p>
+        </w:tc>
+        <w:tc>
+          <w:tcPr>
+            <w:tcW w:w="1285" w:type="dxa"/>
+          </w:tcPr>
+          <w:p>
+            <w:pPr>
+              <w:cnfStyle w:val="000000100000" w:firstRow="0" w:lastRow="0" w:firstColumn="0" w:lastColumn="0" w:oddVBand="0" w:evenVBand="0" w:oddHBand="1" w:evenHBand="0" w:firstRowFirstColumn="0" w:firstRowLastColumn="0" w:lastRowFirstColumn="0" w:lastRowLastColumn="0"/>
+            </w:pPr>
+          </w:p>
+        </w:tc>
+      </w:tr>
+      <w:tr>
+        <w:trPr>
+          <w:trHeight w:val="505"/>
+        </w:trPr>
+        <w:tc>
+          <w:tcPr>
+            <w:cnfStyle w:val="001000000000" w:firstRow="0" w:lastRow="0" w:firstColumn="1" w:lastColumn="0" w:oddVBand="0" w:evenVBand="0" w:oddHBand="0" w:evenHBand="0" w:firstRowFirstColumn="0" w:firstRowLastColumn="0" w:lastRowFirstColumn="0" w:lastRowLastColumn="0"/>
+            <w:tcW w:w="6307" w:type="dxa"/>
+          </w:tcPr>
+          <w:p>
+            <w:pPr>
+              <w:rPr>
+                <w:b w:val="0"/>
+              </w:rPr>
+            </w:pPr>
+            <w:r>
+              <w:rPr>
+                <w:b w:val="0"/>
+              </w:rPr>
+              <w:t>Autres actions</w:t>
+            </w:r>
+          </w:p>
+        </w:tc>
+        <w:tc>
+          <w:tcPr>
+            <w:tcW w:w="1578" w:type="dxa"/>
+          </w:tcPr>
+          <w:p>
+            <w:pPr>
+              <w:cnfStyle w:val="000000000000" w:firstRow="0" w:lastRow="0" w:firstColumn="0" w:lastColumn="0" w:oddVBand="0" w:evenVBand="0" w:oddHBand="0" w:evenHBand="0" w:firstRowFirstColumn="0" w:firstRowLastColumn="0" w:lastRowFirstColumn="0" w:lastRowLastColumn="0"/>
+            </w:pPr>
+            <w:r>
+              <w:t>En cours</w:t>
+            </w:r>
+          </w:p>
+        </w:tc>
+        <w:tc>
+          <w:tcPr>
+            <w:tcW w:w="1285" w:type="dxa"/>
+          </w:tcPr>
+          <w:p>
+            <w:pPr>
+              <w:cnfStyle w:val="000000000000" w:firstRow="0" w:lastRow="0" w:firstColumn="0" w:lastColumn="0" w:oddVBand="0" w:evenVBand="0" w:oddHBand="0" w:evenHBand="0" w:firstRowFirstColumn="0" w:firstRowLastColumn="0" w:lastRowFirstColumn="0" w:lastRowLastColumn="0"/>
+            </w:pPr>
+          </w:p>
+        </w:tc>
+      </w:tr>
+    </w:tbl>
+    <w:p/>
+    <w:p>
+      <w:r>
+        <w:t>Application Backend Django : Affairs</w:t>
+      </w:r>
+      <w:bookmarkStart w:id="2" w:name="_GoBack"/>
+      <w:bookmarkEnd w:id="2"/>
     </w:p>
     <w:p>
       <w:pPr>
@@ -2028,7 +2398,6 @@
     <w:p/>
     <w:p>
       <w:r>
-        <w:lastRenderedPageBreak/>
         <w:t>Dans cette partie, nous allons nous focaliser sur les fonctionnalités de base en commençant par une visite guidée de notre application de bureau.</w:t>
       </w:r>
       <w:r>
@@ -2114,7 +2483,11 @@
         <w:t>ojet dans notre logiciel. Dans l</w:t>
       </w:r>
       <w:r>
-        <w:t>e projet il doit pouvoir ajouter les pièces</w:t>
+        <w:t xml:space="preserve">e projet il doit pouvoir ajouter </w:t>
+      </w:r>
+      <w:r>
+        <w:lastRenderedPageBreak/>
+        <w:t>les pièces</w:t>
       </w:r>
       <w:r>
         <w:t xml:space="preserve"> qui sont des documents. Ici on ne mettra pas d’indicateurs spécifiques pour évaluer la progression des tâches c’est juste du stockage de type Dropbox</w:t>
@@ -2389,7 +2762,6 @@
               <w:rPr>
                 <w:b w:val="0"/>
               </w:rPr>
-              <w:lastRenderedPageBreak/>
               <w:t>Modifier le nom du dossier</w:t>
             </w:r>
           </w:p>
@@ -2861,6 +3233,7 @@
         </w:numPr>
       </w:pPr>
       <w:r>
+        <w:lastRenderedPageBreak/>
         <w:t>Relation entre local et Backend</w:t>
       </w:r>
     </w:p>
@@ -3319,7 +3692,7 @@
   <w:abstractNum w:abstractNumId="1" w15:restartNumberingAfterBreak="0">
     <w:nsid w:val="187B55A2"/>
     <w:multiLevelType w:val="hybridMultilevel"/>
-    <w:tmpl w:val="6AB05BDA"/>
+    <w:tmpl w:val="BB0C3B0C"/>
     <w:lvl w:ilvl="0" w:tplc="040C000F">
       <w:start w:val="1"/>
       <w:numFmt w:val="decimal"/>
@@ -4632,7 +5005,7 @@
   <w:style w:type="paragraph" w:default="1" w:styleId="Normal">
     <w:name w:val="Normal"/>
     <w:qFormat/>
-    <w:rsid w:val="003204B4"/>
+    <w:rsid w:val="000653A0"/>
     <w:pPr>
       <w:spacing w:line="360" w:lineRule="auto"/>
       <w:jc w:val="both"/>
@@ -6252,7 +6625,7 @@
 </file>
 
 <file path=customXml/itemProps1.xml><?xml version="1.0" encoding="utf-8"?>
-<ds:datastoreItem xmlns:ds="http://schemas.openxmlformats.org/officeDocument/2006/customXml" ds:itemID="{9220343A-A5E0-4C77-A610-CC412437C6A3}">
+<ds:datastoreItem xmlns:ds="http://schemas.openxmlformats.org/officeDocument/2006/customXml" ds:itemID="{E3B29318-55E0-4E95-9C0E-7E9514BBDA30}">
   <ds:schemaRefs>
     <ds:schemaRef ds:uri="http://schemas.openxmlformats.org/officeDocument/2006/bibliography"/>
   </ds:schemaRefs>

</xml_diff>

<commit_message>
work on score computation
</commit_message>
<xml_diff>
--- a/CAHIER DE CHARGE DE DOCSIRA.docx
+++ b/CAHIER DE CHARGE DE DOCSIRA.docx
@@ -441,18 +441,10 @@
         <w:t xml:space="preserve">Le mot de passe </w:t>
       </w:r>
       <w:r>
-        <w:t xml:space="preserve">bien </w:t>
-      </w:r>
-      <w:proofErr w:type="gramStart"/>
-      <w:r>
-        <w:t>ha</w:t>
-      </w:r>
-      <w:r>
-        <w:t>ché</w:t>
-      </w:r>
-      <w:proofErr w:type="gramEnd"/>
-      <w:r>
-        <w:t>.</w:t>
+        <w:t>bien ha</w:t>
+      </w:r>
+      <w:r>
+        <w:t>ché.</w:t>
       </w:r>
     </w:p>
     <w:p>
@@ -2113,7 +2105,7 @@
               <w:cnfStyle w:val="000000100000" w:firstRow="0" w:lastRow="0" w:firstColumn="0" w:lastColumn="0" w:oddVBand="0" w:evenVBand="0" w:oddHBand="1" w:evenHBand="0" w:firstRowFirstColumn="0" w:firstRowLastColumn="0" w:lastRowFirstColumn="0" w:lastRowLastColumn="0"/>
             </w:pPr>
             <w:r>
-              <w:t>En cours</w:t>
+              <w:t>Terminé</w:t>
             </w:r>
           </w:p>
         </w:tc>
@@ -2125,6 +2117,9 @@
             <w:pPr>
               <w:cnfStyle w:val="000000100000" w:firstRow="0" w:lastRow="0" w:firstColumn="0" w:lastColumn="0" w:oddVBand="0" w:evenVBand="0" w:oddHBand="1" w:evenHBand="0" w:firstRowFirstColumn="0" w:firstRowLastColumn="0" w:lastRowFirstColumn="0" w:lastRowLastColumn="0"/>
             </w:pPr>
+            <w:r>
+              <w:t>06</w:t>
+            </w:r>
           </w:p>
         </w:tc>
       </w:tr>
@@ -2147,13 +2142,7 @@
               <w:rPr>
                 <w:b w:val="0"/>
               </w:rPr>
-              <w:t xml:space="preserve">Voir les informations du </w:t>
-            </w:r>
-            <w:r>
-              <w:rPr>
-                <w:b w:val="0"/>
-              </w:rPr>
-              <w:t>dossier lié au client</w:t>
+              <w:t>Voir les informations du dossier lié au client</w:t>
             </w:r>
           </w:p>
         </w:tc>
@@ -2166,7 +2155,7 @@
               <w:cnfStyle w:val="000000000000" w:firstRow="0" w:lastRow="0" w:firstColumn="0" w:lastColumn="0" w:oddVBand="0" w:evenVBand="0" w:oddHBand="0" w:evenHBand="0" w:firstRowFirstColumn="0" w:firstRowLastColumn="0" w:lastRowFirstColumn="0" w:lastRowLastColumn="0"/>
             </w:pPr>
             <w:r>
-              <w:t>En cours</w:t>
+              <w:t>Terminé</w:t>
             </w:r>
           </w:p>
         </w:tc>
@@ -2214,7 +2203,7 @@
               <w:cnfStyle w:val="000000100000" w:firstRow="0" w:lastRow="0" w:firstColumn="0" w:lastColumn="0" w:oddVBand="0" w:evenVBand="0" w:oddHBand="1" w:evenHBand="0" w:firstRowFirstColumn="0" w:firstRowLastColumn="0" w:lastRowFirstColumn="0" w:lastRowLastColumn="0"/>
             </w:pPr>
             <w:r>
-              <w:t>En cours</w:t>
+              <w:t>Terminé</w:t>
             </w:r>
           </w:p>
         </w:tc>
@@ -2326,6 +2315,54 @@
       </w:tr>
       <w:tr>
         <w:trPr>
+          <w:trHeight w:val="488"/>
+        </w:trPr>
+        <w:tc>
+          <w:tcPr>
+            <w:cnfStyle w:val="001000000000" w:firstRow="0" w:lastRow="0" w:firstColumn="1" w:lastColumn="0" w:oddVBand="0" w:evenVBand="0" w:oddHBand="0" w:evenHBand="0" w:firstRowFirstColumn="0" w:firstRowLastColumn="0" w:lastRowFirstColumn="0" w:lastRowLastColumn="0"/>
+            <w:tcW w:w="6307" w:type="dxa"/>
+          </w:tcPr>
+          <w:p>
+            <w:pPr>
+              <w:rPr>
+                <w:b w:val="0"/>
+              </w:rPr>
+            </w:pPr>
+            <w:r>
+              <w:rPr>
+                <w:b w:val="0"/>
+              </w:rPr>
+              <w:t>Archiver les dossiers</w:t>
+            </w:r>
+          </w:p>
+        </w:tc>
+        <w:tc>
+          <w:tcPr>
+            <w:tcW w:w="1578" w:type="dxa"/>
+          </w:tcPr>
+          <w:p>
+            <w:pPr>
+              <w:cnfStyle w:val="000000000000" w:firstRow="0" w:lastRow="0" w:firstColumn="0" w:lastColumn="0" w:oddVBand="0" w:evenVBand="0" w:oddHBand="0" w:evenHBand="0" w:firstRowFirstColumn="0" w:firstRowLastColumn="0" w:lastRowFirstColumn="0" w:lastRowLastColumn="0"/>
+            </w:pPr>
+            <w:r>
+              <w:t>En cours</w:t>
+            </w:r>
+          </w:p>
+        </w:tc>
+        <w:tc>
+          <w:tcPr>
+            <w:tcW w:w="1285" w:type="dxa"/>
+          </w:tcPr>
+          <w:p>
+            <w:pPr>
+              <w:cnfStyle w:val="000000000000" w:firstRow="0" w:lastRow="0" w:firstColumn="0" w:lastColumn="0" w:oddVBand="0" w:evenVBand="0" w:oddHBand="0" w:evenHBand="0" w:firstRowFirstColumn="0" w:firstRowLastColumn="0" w:lastRowFirstColumn="0" w:lastRowLastColumn="0"/>
+            </w:pPr>
+          </w:p>
+        </w:tc>
+      </w:tr>
+      <w:tr>
+        <w:trPr>
+          <w:cnfStyle w:val="000000100000" w:firstRow="0" w:lastRow="0" w:firstColumn="0" w:lastColumn="0" w:oddVBand="0" w:evenVBand="0" w:oddHBand="1" w:evenHBand="0" w:firstRowFirstColumn="0" w:firstRowLastColumn="0" w:lastRowFirstColumn="0" w:lastRowLastColumn="0"/>
           <w:trHeight w:val="505"/>
         </w:trPr>
         <w:tc>
@@ -2353,7 +2390,7 @@
           </w:tcPr>
           <w:p>
             <w:pPr>
-              <w:cnfStyle w:val="000000000000" w:firstRow="0" w:lastRow="0" w:firstColumn="0" w:lastColumn="0" w:oddVBand="0" w:evenVBand="0" w:oddHBand="0" w:evenHBand="0" w:firstRowFirstColumn="0" w:firstRowLastColumn="0" w:lastRowFirstColumn="0" w:lastRowLastColumn="0"/>
+              <w:cnfStyle w:val="000000100000" w:firstRow="0" w:lastRow="0" w:firstColumn="0" w:lastColumn="0" w:oddVBand="0" w:evenVBand="0" w:oddHBand="1" w:evenHBand="0" w:firstRowFirstColumn="0" w:firstRowLastColumn="0" w:lastRowFirstColumn="0" w:lastRowLastColumn="0"/>
             </w:pPr>
             <w:r>
               <w:t>En cours</w:t>
@@ -2366,7 +2403,7 @@
           </w:tcPr>
           <w:p>
             <w:pPr>
-              <w:cnfStyle w:val="000000000000" w:firstRow="0" w:lastRow="0" w:firstColumn="0" w:lastColumn="0" w:oddVBand="0" w:evenVBand="0" w:oddHBand="0" w:evenHBand="0" w:firstRowFirstColumn="0" w:firstRowLastColumn="0" w:lastRowFirstColumn="0" w:lastRowLastColumn="0"/>
+              <w:cnfStyle w:val="000000100000" w:firstRow="0" w:lastRow="0" w:firstColumn="0" w:lastColumn="0" w:oddVBand="0" w:evenVBand="0" w:oddHBand="1" w:evenHBand="0" w:firstRowFirstColumn="0" w:firstRowLastColumn="0" w:lastRowFirstColumn="0" w:lastRowLastColumn="0"/>
             </w:pPr>
           </w:p>
         </w:tc>
@@ -2374,12 +2411,347 @@
     </w:tbl>
     <w:p/>
     <w:p>
-      <w:r>
-        <w:t>Application Backend Django : Affairs</w:t>
-      </w:r>
-      <w:bookmarkStart w:id="2" w:name="_GoBack"/>
-      <w:bookmarkEnd w:id="2"/>
+      <w:pPr>
+        <w:rPr>
+          <w:lang w:val="en-GB"/>
+        </w:rPr>
+      </w:pPr>
+      <w:r>
+        <w:t>Appl</w:t>
+      </w:r>
+      <w:r>
+        <w:t xml:space="preserve">ication Backend Django : </w:t>
+      </w:r>
+      <w:r>
+        <w:rPr>
+          <w:lang w:val="en-GB"/>
+        </w:rPr>
+        <w:t>Affairs</w:t>
+      </w:r>
     </w:p>
+    <w:p>
+      <w:pPr>
+        <w:rPr>
+          <w:lang w:val="en-GB"/>
+        </w:rPr>
+      </w:pPr>
+    </w:p>
+    <w:p>
+      <w:pPr>
+        <w:pStyle w:val="Titre3"/>
+        <w:numPr>
+          <w:ilvl w:val="0"/>
+          <w:numId w:val="10"/>
+        </w:numPr>
+      </w:pPr>
+      <w:r>
+        <w:t>Communication du cabinet avec l’extérieur</w:t>
+      </w:r>
+    </w:p>
+    <w:p>
+      <w:r>
+        <w:t>Dans un cabinet, après les travaux il faut souvent envoyer les travaux au client, via un lien qui va expirer au bout d’un certain moment. Il s’agit des livrables délivrés au client :</w:t>
+      </w:r>
+    </w:p>
+    <w:tbl>
+      <w:tblPr>
+        <w:tblStyle w:val="TableauListe2-Accentuation3"/>
+        <w:tblW w:w="9170" w:type="dxa"/>
+        <w:tblLook w:val="04A0" w:firstRow="1" w:lastRow="0" w:firstColumn="1" w:lastColumn="0" w:noHBand="0" w:noVBand="1"/>
+      </w:tblPr>
+      <w:tblGrid>
+        <w:gridCol w:w="6307"/>
+        <w:gridCol w:w="1578"/>
+        <w:gridCol w:w="1285"/>
+      </w:tblGrid>
+      <w:tr>
+        <w:trPr>
+          <w:cnfStyle w:val="100000000000" w:firstRow="1" w:lastRow="0" w:firstColumn="0" w:lastColumn="0" w:oddVBand="0" w:evenVBand="0" w:oddHBand="0" w:evenHBand="0" w:firstRowFirstColumn="0" w:firstRowLastColumn="0" w:lastRowFirstColumn="0" w:lastRowLastColumn="0"/>
+          <w:trHeight w:val="505"/>
+        </w:trPr>
+        <w:tc>
+          <w:tcPr>
+            <w:cnfStyle w:val="001000000000" w:firstRow="0" w:lastRow="0" w:firstColumn="1" w:lastColumn="0" w:oddVBand="0" w:evenVBand="0" w:oddHBand="0" w:evenHBand="0" w:firstRowFirstColumn="0" w:firstRowLastColumn="0" w:lastRowFirstColumn="0" w:lastRowLastColumn="0"/>
+            <w:tcW w:w="6307" w:type="dxa"/>
+          </w:tcPr>
+          <w:p>
+            <w:r>
+              <w:t>Fonctionnalité</w:t>
+            </w:r>
+          </w:p>
+        </w:tc>
+        <w:tc>
+          <w:tcPr>
+            <w:tcW w:w="1578" w:type="dxa"/>
+          </w:tcPr>
+          <w:p>
+            <w:pPr>
+              <w:cnfStyle w:val="100000000000" w:firstRow="1" w:lastRow="0" w:firstColumn="0" w:lastColumn="0" w:oddVBand="0" w:evenVBand="0" w:oddHBand="0" w:evenHBand="0" w:firstRowFirstColumn="0" w:firstRowLastColumn="0" w:lastRowFirstColumn="0" w:lastRowLastColumn="0"/>
+            </w:pPr>
+            <w:r>
+              <w:t>Statuts</w:t>
+            </w:r>
+          </w:p>
+        </w:tc>
+        <w:tc>
+          <w:tcPr>
+            <w:tcW w:w="1285" w:type="dxa"/>
+          </w:tcPr>
+          <w:p>
+            <w:pPr>
+              <w:cnfStyle w:val="100000000000" w:firstRow="1" w:lastRow="0" w:firstColumn="0" w:lastColumn="0" w:oddVBand="0" w:evenVBand="0" w:oddHBand="0" w:evenHBand="0" w:firstRowFirstColumn="0" w:firstRowLastColumn="0" w:lastRowFirstColumn="0" w:lastRowLastColumn="0"/>
+            </w:pPr>
+            <w:r>
+              <w:t>Notes</w:t>
+            </w:r>
+          </w:p>
+        </w:tc>
+      </w:tr>
+      <w:tr>
+        <w:trPr>
+          <w:cnfStyle w:val="000000100000" w:firstRow="0" w:lastRow="0" w:firstColumn="0" w:lastColumn="0" w:oddVBand="0" w:evenVBand="0" w:oddHBand="1" w:evenHBand="0" w:firstRowFirstColumn="0" w:firstRowLastColumn="0" w:lastRowFirstColumn="0" w:lastRowLastColumn="0"/>
+          <w:trHeight w:val="505"/>
+        </w:trPr>
+        <w:tc>
+          <w:tcPr>
+            <w:cnfStyle w:val="001000000000" w:firstRow="0" w:lastRow="0" w:firstColumn="1" w:lastColumn="0" w:oddVBand="0" w:evenVBand="0" w:oddHBand="0" w:evenHBand="0" w:firstRowFirstColumn="0" w:firstRowLastColumn="0" w:lastRowFirstColumn="0" w:lastRowLastColumn="0"/>
+            <w:tcW w:w="6307" w:type="dxa"/>
+          </w:tcPr>
+          <w:p>
+            <w:pPr>
+              <w:rPr>
+                <w:b w:val="0"/>
+              </w:rPr>
+            </w:pPr>
+            <w:r>
+              <w:rPr>
+                <w:b w:val="0"/>
+              </w:rPr>
+              <w:t>Création d’un lien de téléchargement</w:t>
+            </w:r>
+          </w:p>
+        </w:tc>
+        <w:tc>
+          <w:tcPr>
+            <w:tcW w:w="1578" w:type="dxa"/>
+          </w:tcPr>
+          <w:p>
+            <w:pPr>
+              <w:cnfStyle w:val="000000100000" w:firstRow="0" w:lastRow="0" w:firstColumn="0" w:lastColumn="0" w:oddVBand="0" w:evenVBand="0" w:oddHBand="1" w:evenHBand="0" w:firstRowFirstColumn="0" w:firstRowLastColumn="0" w:lastRowFirstColumn="0" w:lastRowLastColumn="0"/>
+            </w:pPr>
+            <w:r>
+              <w:t>En cours</w:t>
+            </w:r>
+          </w:p>
+        </w:tc>
+        <w:tc>
+          <w:tcPr>
+            <w:tcW w:w="1285" w:type="dxa"/>
+          </w:tcPr>
+          <w:p>
+            <w:pPr>
+              <w:cnfStyle w:val="000000100000" w:firstRow="0" w:lastRow="0" w:firstColumn="0" w:lastColumn="0" w:oddVBand="0" w:evenVBand="0" w:oddHBand="1" w:evenHBand="0" w:firstRowFirstColumn="0" w:firstRowLastColumn="0" w:lastRowFirstColumn="0" w:lastRowLastColumn="0"/>
+            </w:pPr>
+            <w:r>
+              <w:t>06</w:t>
+            </w:r>
+          </w:p>
+        </w:tc>
+      </w:tr>
+      <w:tr>
+        <w:trPr>
+          <w:trHeight w:val="505"/>
+        </w:trPr>
+        <w:tc>
+          <w:tcPr>
+            <w:cnfStyle w:val="001000000000" w:firstRow="0" w:lastRow="0" w:firstColumn="1" w:lastColumn="0" w:oddVBand="0" w:evenVBand="0" w:oddHBand="0" w:evenHBand="0" w:firstRowFirstColumn="0" w:firstRowLastColumn="0" w:lastRowFirstColumn="0" w:lastRowLastColumn="0"/>
+            <w:tcW w:w="6307" w:type="dxa"/>
+          </w:tcPr>
+          <w:p>
+            <w:pPr>
+              <w:rPr>
+                <w:b w:val="0"/>
+              </w:rPr>
+            </w:pPr>
+            <w:r>
+              <w:rPr>
+                <w:b w:val="0"/>
+              </w:rPr>
+              <w:t>Modification du lien de téléchargement</w:t>
+            </w:r>
+          </w:p>
+        </w:tc>
+        <w:tc>
+          <w:tcPr>
+            <w:tcW w:w="1578" w:type="dxa"/>
+          </w:tcPr>
+          <w:p>
+            <w:pPr>
+              <w:cnfStyle w:val="000000000000" w:firstRow="0" w:lastRow="0" w:firstColumn="0" w:lastColumn="0" w:oddVBand="0" w:evenVBand="0" w:oddHBand="0" w:evenHBand="0" w:firstRowFirstColumn="0" w:firstRowLastColumn="0" w:lastRowFirstColumn="0" w:lastRowLastColumn="0"/>
+            </w:pPr>
+            <w:r>
+              <w:t>En cours</w:t>
+            </w:r>
+          </w:p>
+        </w:tc>
+        <w:tc>
+          <w:tcPr>
+            <w:tcW w:w="1285" w:type="dxa"/>
+          </w:tcPr>
+          <w:p>
+            <w:pPr>
+              <w:cnfStyle w:val="000000000000" w:firstRow="0" w:lastRow="0" w:firstColumn="0" w:lastColumn="0" w:oddVBand="0" w:evenVBand="0" w:oddHBand="0" w:evenHBand="0" w:firstRowFirstColumn="0" w:firstRowLastColumn="0" w:lastRowFirstColumn="0" w:lastRowLastColumn="0"/>
+            </w:pPr>
+          </w:p>
+        </w:tc>
+      </w:tr>
+      <w:tr>
+        <w:trPr>
+          <w:cnfStyle w:val="000000100000" w:firstRow="0" w:lastRow="0" w:firstColumn="0" w:lastColumn="0" w:oddVBand="0" w:evenVBand="0" w:oddHBand="1" w:evenHBand="0" w:firstRowFirstColumn="0" w:firstRowLastColumn="0" w:lastRowFirstColumn="0" w:lastRowLastColumn="0"/>
+          <w:trHeight w:val="505"/>
+        </w:trPr>
+        <w:tc>
+          <w:tcPr>
+            <w:cnfStyle w:val="001000000000" w:firstRow="0" w:lastRow="0" w:firstColumn="1" w:lastColumn="0" w:oddVBand="0" w:evenVBand="0" w:oddHBand="0" w:evenHBand="0" w:firstRowFirstColumn="0" w:firstRowLastColumn="0" w:lastRowFirstColumn="0" w:lastRowLastColumn="0"/>
+            <w:tcW w:w="6307" w:type="dxa"/>
+          </w:tcPr>
+          <w:p>
+            <w:pPr>
+              <w:rPr>
+                <w:b w:val="0"/>
+              </w:rPr>
+            </w:pPr>
+            <w:r>
+              <w:rPr>
+                <w:b w:val="0"/>
+              </w:rPr>
+              <w:t>Lecture des liens de téléchargement</w:t>
+            </w:r>
+          </w:p>
+        </w:tc>
+        <w:tc>
+          <w:tcPr>
+            <w:tcW w:w="1578" w:type="dxa"/>
+          </w:tcPr>
+          <w:p>
+            <w:pPr>
+              <w:cnfStyle w:val="000000100000" w:firstRow="0" w:lastRow="0" w:firstColumn="0" w:lastColumn="0" w:oddVBand="0" w:evenVBand="0" w:oddHBand="1" w:evenHBand="0" w:firstRowFirstColumn="0" w:firstRowLastColumn="0" w:lastRowFirstColumn="0" w:lastRowLastColumn="0"/>
+            </w:pPr>
+            <w:r>
+              <w:t>En cours</w:t>
+            </w:r>
+            <w:bookmarkStart w:id="2" w:name="_GoBack"/>
+            <w:bookmarkEnd w:id="2"/>
+          </w:p>
+        </w:tc>
+        <w:tc>
+          <w:tcPr>
+            <w:tcW w:w="1285" w:type="dxa"/>
+          </w:tcPr>
+          <w:p>
+            <w:pPr>
+              <w:cnfStyle w:val="000000100000" w:firstRow="0" w:lastRow="0" w:firstColumn="0" w:lastColumn="0" w:oddVBand="0" w:evenVBand="0" w:oddHBand="1" w:evenHBand="0" w:firstRowFirstColumn="0" w:firstRowLastColumn="0" w:lastRowFirstColumn="0" w:lastRowLastColumn="0"/>
+            </w:pPr>
+          </w:p>
+        </w:tc>
+      </w:tr>
+      <w:tr>
+        <w:trPr>
+          <w:trHeight w:val="488"/>
+        </w:trPr>
+        <w:tc>
+          <w:tcPr>
+            <w:cnfStyle w:val="001000000000" w:firstRow="0" w:lastRow="0" w:firstColumn="1" w:lastColumn="0" w:oddVBand="0" w:evenVBand="0" w:oddHBand="0" w:evenHBand="0" w:firstRowFirstColumn="0" w:firstRowLastColumn="0" w:lastRowFirstColumn="0" w:lastRowLastColumn="0"/>
+            <w:tcW w:w="6307" w:type="dxa"/>
+          </w:tcPr>
+          <w:p>
+            <w:pPr>
+              <w:rPr>
+                <w:b w:val="0"/>
+              </w:rPr>
+            </w:pPr>
+            <w:r>
+              <w:rPr>
+                <w:b w:val="0"/>
+              </w:rPr>
+              <w:t>Suppression des liens de téléchargement</w:t>
+            </w:r>
+          </w:p>
+        </w:tc>
+        <w:tc>
+          <w:tcPr>
+            <w:tcW w:w="1578" w:type="dxa"/>
+          </w:tcPr>
+          <w:p>
+            <w:pPr>
+              <w:cnfStyle w:val="000000000000" w:firstRow="0" w:lastRow="0" w:firstColumn="0" w:lastColumn="0" w:oddVBand="0" w:evenVBand="0" w:oddHBand="0" w:evenHBand="0" w:firstRowFirstColumn="0" w:firstRowLastColumn="0" w:lastRowFirstColumn="0" w:lastRowLastColumn="0"/>
+            </w:pPr>
+            <w:r>
+              <w:t>En cours</w:t>
+            </w:r>
+          </w:p>
+        </w:tc>
+        <w:tc>
+          <w:tcPr>
+            <w:tcW w:w="1285" w:type="dxa"/>
+          </w:tcPr>
+          <w:p>
+            <w:pPr>
+              <w:cnfStyle w:val="000000000000" w:firstRow="0" w:lastRow="0" w:firstColumn="0" w:lastColumn="0" w:oddVBand="0" w:evenVBand="0" w:oddHBand="0" w:evenHBand="0" w:firstRowFirstColumn="0" w:firstRowLastColumn="0" w:lastRowFirstColumn="0" w:lastRowLastColumn="0"/>
+            </w:pPr>
+          </w:p>
+        </w:tc>
+      </w:tr>
+      <w:tr>
+        <w:trPr>
+          <w:cnfStyle w:val="000000100000" w:firstRow="0" w:lastRow="0" w:firstColumn="0" w:lastColumn="0" w:oddVBand="0" w:evenVBand="0" w:oddHBand="1" w:evenHBand="0" w:firstRowFirstColumn="0" w:firstRowLastColumn="0" w:lastRowFirstColumn="0" w:lastRowLastColumn="0"/>
+          <w:trHeight w:val="505"/>
+        </w:trPr>
+        <w:tc>
+          <w:tcPr>
+            <w:cnfStyle w:val="001000000000" w:firstRow="0" w:lastRow="0" w:firstColumn="1" w:lastColumn="0" w:oddVBand="0" w:evenVBand="0" w:oddHBand="0" w:evenHBand="0" w:firstRowFirstColumn="0" w:firstRowLastColumn="0" w:lastRowFirstColumn="0" w:lastRowLastColumn="0"/>
+            <w:tcW w:w="6307" w:type="dxa"/>
+          </w:tcPr>
+          <w:p>
+            <w:pPr>
+              <w:rPr>
+                <w:b w:val="0"/>
+              </w:rPr>
+            </w:pPr>
+            <w:r>
+              <w:rPr>
+                <w:b w:val="0"/>
+              </w:rPr>
+              <w:t>Autres actions</w:t>
+            </w:r>
+          </w:p>
+        </w:tc>
+        <w:tc>
+          <w:tcPr>
+            <w:tcW w:w="1578" w:type="dxa"/>
+          </w:tcPr>
+          <w:p>
+            <w:pPr>
+              <w:cnfStyle w:val="000000100000" w:firstRow="0" w:lastRow="0" w:firstColumn="0" w:lastColumn="0" w:oddVBand="0" w:evenVBand="0" w:oddHBand="1" w:evenHBand="0" w:firstRowFirstColumn="0" w:firstRowLastColumn="0" w:lastRowFirstColumn="0" w:lastRowLastColumn="0"/>
+            </w:pPr>
+            <w:r>
+              <w:t>En cours</w:t>
+            </w:r>
+          </w:p>
+        </w:tc>
+        <w:tc>
+          <w:tcPr>
+            <w:tcW w:w="1285" w:type="dxa"/>
+          </w:tcPr>
+          <w:p>
+            <w:pPr>
+              <w:cnfStyle w:val="000000100000" w:firstRow="0" w:lastRow="0" w:firstColumn="0" w:lastColumn="0" w:oddVBand="0" w:evenVBand="0" w:oddHBand="1" w:evenHBand="0" w:firstRowFirstColumn="0" w:firstRowLastColumn="0" w:lastRowFirstColumn="0" w:lastRowLastColumn="0"/>
+            </w:pPr>
+          </w:p>
+        </w:tc>
+      </w:tr>
+    </w:tbl>
+    <w:p/>
     <w:p>
       <w:pPr>
         <w:pStyle w:val="Titre2"/>
@@ -2398,6 +2770,7 @@
     <w:p/>
     <w:p>
       <w:r>
+        <w:lastRenderedPageBreak/>
         <w:t>Dans cette partie, nous allons nous focaliser sur les fonctionnalités de base en commençant par une visite guidée de notre application de bureau.</w:t>
       </w:r>
       <w:r>
@@ -2483,11 +2856,7 @@
         <w:t>ojet dans notre logiciel. Dans l</w:t>
       </w:r>
       <w:r>
-        <w:t xml:space="preserve">e projet il doit pouvoir ajouter </w:t>
-      </w:r>
-      <w:r>
-        <w:lastRenderedPageBreak/>
-        <w:t>les pièces</w:t>
+        <w:t>e projet il doit pouvoir ajouter les pièces</w:t>
       </w:r>
       <w:r>
         <w:t xml:space="preserve"> qui sont des documents. Ici on ne mettra pas d’indicateurs spécifiques pour évaluer la progression des tâches c’est juste du stockage de type Dropbox</w:t>
@@ -2762,6 +3131,7 @@
               <w:rPr>
                 <w:b w:val="0"/>
               </w:rPr>
+              <w:lastRenderedPageBreak/>
               <w:t>Modifier le nom du dossier</w:t>
             </w:r>
           </w:p>
@@ -3233,7 +3603,6 @@
         </w:numPr>
       </w:pPr>
       <w:r>
-        <w:lastRenderedPageBreak/>
         <w:t>Relation entre local et Backend</w:t>
       </w:r>
     </w:p>
@@ -3692,7 +4061,7 @@
   <w:abstractNum w:abstractNumId="1" w15:restartNumberingAfterBreak="0">
     <w:nsid w:val="187B55A2"/>
     <w:multiLevelType w:val="hybridMultilevel"/>
-    <w:tmpl w:val="BB0C3B0C"/>
+    <w:tmpl w:val="FE12A16E"/>
     <w:lvl w:ilvl="0" w:tplc="040C000F">
       <w:start w:val="1"/>
       <w:numFmt w:val="decimal"/>
@@ -5005,7 +5374,7 @@
   <w:style w:type="paragraph" w:default="1" w:styleId="Normal">
     <w:name w:val="Normal"/>
     <w:qFormat/>
-    <w:rsid w:val="000653A0"/>
+    <w:rsid w:val="00F82196"/>
     <w:pPr>
       <w:spacing w:line="360" w:lineRule="auto"/>
       <w:jc w:val="both"/>
@@ -6625,7 +6994,7 @@
 </file>
 
 <file path=customXml/itemProps1.xml><?xml version="1.0" encoding="utf-8"?>
-<ds:datastoreItem xmlns:ds="http://schemas.openxmlformats.org/officeDocument/2006/customXml" ds:itemID="{E3B29318-55E0-4E95-9C0E-7E9514BBDA30}">
+<ds:datastoreItem xmlns:ds="http://schemas.openxmlformats.org/officeDocument/2006/customXml" ds:itemID="{28E1C90F-A9E9-44BF-A1AD-57D5E63C9AEB}">
   <ds:schemaRefs>
     <ds:schemaRef ds:uri="http://schemas.openxmlformats.org/officeDocument/2006/bibliography"/>
   </ds:schemaRefs>

</xml_diff>